<commit_message>
Architecture v2.1: Linux-native automation (Node.js + Portable Pandoc) and legacy cleanup
</commit_message>
<xml_diff>
--- a/X_ENTREGABLES_CONSOLIDADOS/8_DOCUMENTOS_SERVIDOS/WORD/ESPECIALIDAD_01_Ingenieria_Civil_EJECUTIVO.docx
+++ b/X_ENTREGABLES_CONSOLIDADOS/8_DOCUMENTOS_SERVIDOS/WORD/ESPECIALIDAD_01_Ingenieria_Civil_EJECUTIVO.docx
@@ -28,7 +28,7 @@
         </w:p>
       </w:sdtContent>
     </w:sdt>
-    <w:bookmarkStart w:id="57" w:name="especialidad-01-ingeniería-civil"/>
+    <w:bookmarkStart w:id="68" w:name="especialidad-01-ingeniería-civil"/>
     <w:p>
       <w:pPr>
         <w:pStyle w:val="Heading1"/>
@@ -37,7 +37,7 @@
         <w:t xml:space="preserve">ESPECIALIDAD 01: INGENIERÍA CIVIL</w:t>
       </w:r>
     </w:p>
-    <w:bookmarkStart w:id="9" w:name="documento-ejecutivo-de-ingeniería"/>
+    <w:bookmarkStart w:id="20" w:name="documento-ejecutivo-de-ingeniería"/>
     <w:p>
       <w:pPr>
         <w:pStyle w:val="Heading2"/>
@@ -53,8 +53,8 @@
         </w:pict>
       </w:r>
     </w:p>
-    <w:bookmarkEnd w:id="9"/>
-    <w:bookmarkStart w:id="13" w:name="resumen-ejecutivo"/>
+    <w:bookmarkEnd w:id="20"/>
+    <w:bookmarkStart w:id="24" w:name="resumen-ejecutivo"/>
     <w:p>
       <w:pPr>
         <w:pStyle w:val="Heading2"/>
@@ -63,7 +63,7 @@
         <w:t xml:space="preserve">📊 RESUMEN EJECUTIVO</w:t>
       </w:r>
     </w:p>
-    <w:bookmarkStart w:id="10" w:name="X7c07705fb5e25c553c679eab7107af56022a4cb"/>
+    <w:bookmarkStart w:id="21" w:name="X7c07705fb5e25c553c679eab7107af56022a4cb"/>
     <w:p>
       <w:pPr>
         <w:pStyle w:val="Heading3"/>
@@ -96,8 +96,8 @@
         <w:t xml:space="preserve">del ferrocarril que proporciona toda la infraestructura necesaria para la operación ferroviaria. Es como los cimientos y la estructura de un edificio, pero para un ferrocarril completo de 526 km que debe soportar el tráfico ferroviario durante 50 años.</w:t>
       </w:r>
     </w:p>
-    <w:bookmarkEnd w:id="10"/>
-    <w:bookmarkStart w:id="11" w:name="X7c83a38cc8f42be1526a62fa09e05463bbe3395"/>
+    <w:bookmarkEnd w:id="21"/>
+    <w:bookmarkStart w:id="22" w:name="X7c83a38cc8f42be1526a62fa09e05463bbe3395"/>
     <w:p>
       <w:pPr>
         <w:pStyle w:val="Heading3"/>
@@ -282,8 +282,8 @@
         <w:t xml:space="preserve">Compactación de terraplenes</w:t>
       </w:r>
     </w:p>
-    <w:bookmarkEnd w:id="11"/>
-    <w:bookmarkStart w:id="12" w:name="hitos-críticos"/>
+    <w:bookmarkEnd w:id="22"/>
+    <w:bookmarkStart w:id="23" w:name="hitos-críticos"/>
     <w:p>
       <w:pPr>
         <w:pStyle w:val="Heading3"/>
@@ -542,9 +542,9 @@
         </w:pict>
       </w:r>
     </w:p>
-    <w:bookmarkEnd w:id="12"/>
-    <w:bookmarkEnd w:id="13"/>
-    <w:bookmarkStart w:id="19" w:name="X16ad1bf8fd3c72f4f9f37ec0fde01a31e7fb65a"/>
+    <w:bookmarkEnd w:id="23"/>
+    <w:bookmarkEnd w:id="24"/>
+    <w:bookmarkStart w:id="30" w:name="X16ad1bf8fd3c72f4f9f37ec0fde01a31e7fb65a"/>
     <w:p>
       <w:pPr>
         <w:pStyle w:val="Heading2"/>
@@ -553,7 +553,7 @@
         <w:t xml:space="preserve">🔍 CRITERIOS DE DISEÑO Y JUSTIFICACIONES TÉCNICAS</w:t>
       </w:r>
     </w:p>
-    <w:bookmarkStart w:id="14" w:name="por-qué-526.133-km-de-corredor"/>
+    <w:bookmarkStart w:id="25" w:name="por-qué-526.133-km-de-corredor"/>
     <w:p>
       <w:pPr>
         <w:pStyle w:val="Heading3"/>
@@ -684,8 +684,8 @@
         <w:t xml:space="preserve">Longitud total del corredor ferroviario</w:t>
       </w:r>
     </w:p>
-    <w:bookmarkEnd w:id="14"/>
-    <w:bookmarkStart w:id="15" w:name="por-qué-25-puentes-5-viaductos"/>
+    <w:bookmarkEnd w:id="25"/>
+    <w:bookmarkStart w:id="26" w:name="por-qué-25-puentes-5-viaductos"/>
     <w:p>
       <w:pPr>
         <w:pStyle w:val="Heading3"/>
@@ -906,8 +906,8 @@
         <w:t xml:space="preserve">Alcantarillas cada 3.5 km para drenaje transversal</w:t>
       </w:r>
     </w:p>
-    <w:bookmarkEnd w:id="15"/>
-    <w:bookmarkStart w:id="16" w:name="por-qué-3450000-m³-de-excavación"/>
+    <w:bookmarkEnd w:id="26"/>
+    <w:bookmarkStart w:id="27" w:name="por-qué-3450000-m³-de-excavación"/>
     <w:p>
       <w:pPr>
         <w:pStyle w:val="Heading3"/>
@@ -1038,8 +1038,8 @@
         <w:t xml:space="preserve">Volumen calculado por perfiles longitudinales</w:t>
       </w:r>
     </w:p>
-    <w:bookmarkEnd w:id="16"/>
-    <w:bookmarkStart w:id="17" w:name="por-qué-edificaciones-específicas"/>
+    <w:bookmarkEnd w:id="27"/>
+    <w:bookmarkStart w:id="28" w:name="por-qué-edificaciones-específicas"/>
     <w:p>
       <w:pPr>
         <w:pStyle w:val="Heading3"/>
@@ -1160,8 +1160,8 @@
         <w:t xml:space="preserve">| 800 m² | Personal técnico y administrativo |</w:t>
       </w:r>
     </w:p>
-    <w:bookmarkEnd w:id="17"/>
-    <w:bookmarkStart w:id="18" w:name="por-qué-estándares-nsr-10"/>
+    <w:bookmarkEnd w:id="28"/>
+    <w:bookmarkStart w:id="29" w:name="por-qué-estándares-nsr-10"/>
     <w:p>
       <w:pPr>
         <w:pStyle w:val="Heading3"/>
@@ -1299,9 +1299,9 @@
         </w:pict>
       </w:r>
     </w:p>
-    <w:bookmarkEnd w:id="18"/>
-    <w:bookmarkEnd w:id="19"/>
-    <w:bookmarkStart w:id="23" w:name="función-y-propósito-de-la-especialidad"/>
+    <w:bookmarkEnd w:id="29"/>
+    <w:bookmarkEnd w:id="30"/>
+    <w:bookmarkStart w:id="34" w:name="función-y-propósito-de-la-especialidad"/>
     <w:p>
       <w:pPr>
         <w:pStyle w:val="Heading2"/>
@@ -1310,7 +1310,7 @@
         <w:t xml:space="preserve">🎯 FUNCIÓN Y PROPÓSITO DE LA ESPECIALIDAD</w:t>
       </w:r>
     </w:p>
-    <w:bookmarkStart w:id="20" w:name="qué-hace-esta-especialidad"/>
+    <w:bookmarkStart w:id="31" w:name="qué-hace-esta-especialidad"/>
     <w:p>
       <w:pPr>
         <w:pStyle w:val="Heading3"/>
@@ -1431,8 +1431,8 @@
         <w:t xml:space="preserve">Drenaje, iluminación, señalización</w:t>
       </w:r>
     </w:p>
-    <w:bookmarkEnd w:id="20"/>
-    <w:bookmarkStart w:id="21" w:name="por-qué-la-necesitamos"/>
+    <w:bookmarkEnd w:id="31"/>
+    <w:bookmarkStart w:id="32" w:name="por-qué-la-necesitamos"/>
     <w:p>
       <w:pPr>
         <w:pStyle w:val="Heading3"/>
@@ -1551,8 +1551,8 @@
         <w:t xml:space="preserve">Criterios ambientales y eficiencia energética</w:t>
       </w:r>
     </w:p>
-    <w:bookmarkEnd w:id="21"/>
-    <w:bookmarkStart w:id="22" w:name="cómo-se-integra-con-otras-especialidades"/>
+    <w:bookmarkEnd w:id="32"/>
+    <w:bookmarkStart w:id="33" w:name="cómo-se-integra-con-otras-especialidades"/>
     <w:p>
       <w:pPr>
         <w:pStyle w:val="Heading3"/>
@@ -1615,9 +1615,9 @@
         </w:pict>
       </w:r>
     </w:p>
-    <w:bookmarkEnd w:id="22"/>
-    <w:bookmarkEnd w:id="23"/>
-    <w:bookmarkStart w:id="27" w:name="componentes-principales"/>
+    <w:bookmarkEnd w:id="33"/>
+    <w:bookmarkEnd w:id="34"/>
+    <w:bookmarkStart w:id="38" w:name="componentes-principales"/>
     <w:p>
       <w:pPr>
         <w:pStyle w:val="Heading2"/>
@@ -1626,7 +1626,7 @@
         <w:t xml:space="preserve">🏗️ COMPONENTES PRINCIPALES</w:t>
       </w:r>
     </w:p>
-    <w:bookmarkStart w:id="24" w:name="corredor-ferroviario-principal"/>
+    <w:bookmarkStart w:id="35" w:name="corredor-ferroviario-principal"/>
     <w:p>
       <w:pPr>
         <w:pStyle w:val="Heading3"/>
@@ -1787,8 +1787,8 @@
         <w:t xml:space="preserve">| 2% | Según especificaciones ferroviarias |</w:t>
       </w:r>
     </w:p>
-    <w:bookmarkEnd w:id="24"/>
-    <w:bookmarkStart w:id="25" w:name="obras-de-arte"/>
+    <w:bookmarkEnd w:id="35"/>
+    <w:bookmarkStart w:id="36" w:name="obras-de-arte"/>
     <w:p>
       <w:pPr>
         <w:pStyle w:val="Heading3"/>
@@ -1927,8 +1927,8 @@
         <w:t xml:space="preserve">| 30 unidades | Taludes críticos | ⏳ En diseño |</w:t>
       </w:r>
     </w:p>
-    <w:bookmarkEnd w:id="25"/>
-    <w:bookmarkStart w:id="26" w:name="edificaciones"/>
+    <w:bookmarkEnd w:id="36"/>
+    <w:bookmarkStart w:id="37" w:name="edificaciones"/>
     <w:p>
       <w:pPr>
         <w:pStyle w:val="Heading3"/>
@@ -2074,9 +2074,9 @@
         </w:pict>
       </w:r>
     </w:p>
-    <w:bookmarkEnd w:id="26"/>
-    <w:bookmarkEnd w:id="27"/>
-    <w:bookmarkStart w:id="30" w:name="especificaciones-técnicas-clave"/>
+    <w:bookmarkEnd w:id="37"/>
+    <w:bookmarkEnd w:id="38"/>
+    <w:bookmarkStart w:id="41" w:name="especificaciones-técnicas-clave"/>
     <w:p>
       <w:pPr>
         <w:pStyle w:val="Heading2"/>
@@ -2085,7 +2085,7 @@
         <w:t xml:space="preserve">📐 ESPECIFICACIONES TÉCNICAS CLAVE</w:t>
       </w:r>
     </w:p>
-    <w:bookmarkStart w:id="28" w:name="tabla-consolidada-de-especificaciones"/>
+    <w:bookmarkStart w:id="39" w:name="tabla-consolidada-de-especificaciones"/>
     <w:p>
       <w:pPr>
         <w:pStyle w:val="Heading3"/>
@@ -2375,8 +2375,8 @@
         </w:tc>
       </w:tr>
     </w:tbl>
-    <w:bookmarkEnd w:id="28"/>
-    <w:bookmarkStart w:id="29" w:name="criterios-de-aceptación"/>
+    <w:bookmarkEnd w:id="39"/>
+    <w:bookmarkStart w:id="40" w:name="criterios-de-aceptación"/>
     <w:p>
       <w:pPr>
         <w:pStyle w:val="Heading3"/>
@@ -2452,9 +2452,9 @@
         </w:pict>
       </w:r>
     </w:p>
-    <w:bookmarkEnd w:id="29"/>
-    <w:bookmarkEnd w:id="30"/>
-    <w:bookmarkStart w:id="33" w:name="ubicación-y-despliegue"/>
+    <w:bookmarkEnd w:id="40"/>
+    <w:bookmarkEnd w:id="41"/>
+    <w:bookmarkStart w:id="44" w:name="ubicación-y-despliegue"/>
     <w:p>
       <w:pPr>
         <w:pStyle w:val="Heading2"/>
@@ -2463,7 +2463,7 @@
         <w:t xml:space="preserve">📍 UBICACIÓN Y DESPLIEGUE</w:t>
       </w:r>
     </w:p>
-    <w:bookmarkStart w:id="31" w:name="mapa-de-despliegue"/>
+    <w:bookmarkStart w:id="42" w:name="mapa-de-despliegue"/>
     <w:p>
       <w:pPr>
         <w:pStyle w:val="Heading3"/>
@@ -2480,8 +2480,8 @@
         <w:t xml:space="preserve">El corredor ferroviario se extiende 526.133 km entre La Dorada (Caldas) y Chiriguaná (Cesar), atravesando 5 departamentos con diferentes características topográficas y geológicas.</w:t>
       </w:r>
     </w:p>
-    <w:bookmarkEnd w:id="31"/>
-    <w:bookmarkStart w:id="32" w:name="Xb6329a5623b2edb37388c6a22f7ab4090e72c58"/>
+    <w:bookmarkEnd w:id="42"/>
+    <w:bookmarkStart w:id="43" w:name="Xb6329a5623b2edb37388c6a22f7ab4090e72c58"/>
     <w:p>
       <w:pPr>
         <w:pStyle w:val="Heading3"/>
@@ -2906,9 +2906,9 @@
         </w:pict>
       </w:r>
     </w:p>
-    <w:bookmarkEnd w:id="32"/>
-    <w:bookmarkEnd w:id="33"/>
-    <w:bookmarkStart w:id="37" w:name="operación-y-mantenimiento"/>
+    <w:bookmarkEnd w:id="43"/>
+    <w:bookmarkEnd w:id="44"/>
+    <w:bookmarkStart w:id="48" w:name="operación-y-mantenimiento"/>
     <w:p>
       <w:pPr>
         <w:pStyle w:val="Heading2"/>
@@ -2917,7 +2917,7 @@
         <w:t xml:space="preserve">⚙️ OPERACIÓN Y MANTENIMIENTO</w:t>
       </w:r>
     </w:p>
-    <w:bookmarkStart w:id="34" w:name="operación-normal"/>
+    <w:bookmarkStart w:id="45" w:name="operación-normal"/>
     <w:p>
       <w:pPr>
         <w:pStyle w:val="Heading3"/>
@@ -2934,8 +2934,8 @@
         <w:t xml:space="preserve">La infraestructura civil opera 24/7 proporcionando base física para circulación de trenes, con monitoreo continuo de condiciones estructurales y geotécnicas.</w:t>
       </w:r>
     </w:p>
-    <w:bookmarkEnd w:id="34"/>
-    <w:bookmarkStart w:id="35" w:name="mantenimiento-preventivo"/>
+    <w:bookmarkEnd w:id="45"/>
+    <w:bookmarkStart w:id="46" w:name="mantenimiento-preventivo"/>
     <w:p>
       <w:pPr>
         <w:pStyle w:val="Heading3"/>
@@ -3054,8 +3054,8 @@
         <w:t xml:space="preserve">Evaluación estructural completa</w:t>
       </w:r>
     </w:p>
-    <w:bookmarkEnd w:id="35"/>
-    <w:bookmarkStart w:id="36" w:name="respuesta-a-fallas"/>
+    <w:bookmarkEnd w:id="46"/>
+    <w:bookmarkStart w:id="47" w:name="respuesta-a-fallas"/>
     <w:p>
       <w:pPr>
         <w:pStyle w:val="Heading3"/>
@@ -3181,9 +3181,9 @@
         </w:pict>
       </w:r>
     </w:p>
-    <w:bookmarkEnd w:id="36"/>
-    <w:bookmarkEnd w:id="37"/>
-    <w:bookmarkStart w:id="40" w:name="interfaces-con-otras-especialidades"/>
+    <w:bookmarkEnd w:id="47"/>
+    <w:bookmarkEnd w:id="48"/>
+    <w:bookmarkStart w:id="51" w:name="interfaces-con-otras-especialidades"/>
     <w:p>
       <w:pPr>
         <w:pStyle w:val="Heading2"/>
@@ -3192,7 +3192,7 @@
         <w:t xml:space="preserve">🔗 INTERFACES CON OTRAS ESPECIALIDADES</w:t>
       </w:r>
     </w:p>
-    <w:bookmarkStart w:id="38" w:name="diagrama-de-interfaces"/>
+    <w:bookmarkStart w:id="49" w:name="diagrama-de-interfaces"/>
     <w:p>
       <w:pPr>
         <w:pStyle w:val="Heading3"/>
@@ -3248,8 +3248,8 @@
         <w:t xml:space="preserve">[Sistemas Civiles] ←→ [Sistemas de Control] ←→ [Sistemas de Comunicación]</w:t>
       </w:r>
     </w:p>
-    <w:bookmarkEnd w:id="38"/>
-    <w:bookmarkStart w:id="39" w:name="tabla-de-interfaces-críticas"/>
+    <w:bookmarkEnd w:id="49"/>
+    <w:bookmarkStart w:id="50" w:name="tabla-de-interfaces-críticas"/>
     <w:p>
       <w:pPr>
         <w:pStyle w:val="Heading3"/>
@@ -3548,9 +3548,9 @@
         </w:pict>
       </w:r>
     </w:p>
-    <w:bookmarkEnd w:id="39"/>
-    <w:bookmarkEnd w:id="40"/>
-    <w:bookmarkStart w:id="44" w:name="supuestos-técnicos-y-limitaciones"/>
+    <w:bookmarkEnd w:id="50"/>
+    <w:bookmarkEnd w:id="51"/>
+    <w:bookmarkStart w:id="55" w:name="supuestos-técnicos-y-limitaciones"/>
     <w:p>
       <w:pPr>
         <w:pStyle w:val="Heading2"/>
@@ -3559,7 +3559,7 @@
         <w:t xml:space="preserve">📋 SUPUESTOS TÉCNICOS Y LIMITACIONES</w:t>
       </w:r>
     </w:p>
-    <w:bookmarkStart w:id="41" w:name="supuestos-críticos-del-diseño"/>
+    <w:bookmarkStart w:id="52" w:name="supuestos-críticos-del-diseño"/>
     <w:p>
       <w:pPr>
         <w:pStyle w:val="Heading3"/>
@@ -3905,8 +3905,8 @@
         </w:tc>
       </w:tr>
     </w:tbl>
-    <w:bookmarkEnd w:id="41"/>
-    <w:bookmarkStart w:id="42" w:name="limitaciones-del-diseño"/>
+    <w:bookmarkEnd w:id="52"/>
+    <w:bookmarkStart w:id="53" w:name="limitaciones-del-diseño"/>
     <w:p>
       <w:pPr>
         <w:pStyle w:val="Heading3"/>
@@ -4025,8 +4025,8 @@
         <w:t xml:space="preserve">Restricciones por licencias ambientales</w:t>
       </w:r>
     </w:p>
-    <w:bookmarkEnd w:id="42"/>
-    <w:bookmarkStart w:id="43" w:name="dependencias-críticas"/>
+    <w:bookmarkEnd w:id="53"/>
+    <w:bookmarkStart w:id="54" w:name="dependencias-críticas"/>
     <w:p>
       <w:pPr>
         <w:pStyle w:val="Heading3"/>
@@ -4152,9 +4152,9 @@
         </w:pict>
       </w:r>
     </w:p>
-    <w:bookmarkEnd w:id="43"/>
-    <w:bookmarkEnd w:id="44"/>
-    <w:bookmarkStart w:id="45" w:name="riesgos-y-mitigaciones"/>
+    <w:bookmarkEnd w:id="54"/>
+    <w:bookmarkEnd w:id="55"/>
+    <w:bookmarkStart w:id="56" w:name="riesgos-y-mitigaciones"/>
     <w:p>
       <w:pPr>
         <w:pStyle w:val="Heading2"/>
@@ -4560,8 +4560,8 @@
         </w:pict>
       </w:r>
     </w:p>
-    <w:bookmarkEnd w:id="45"/>
-    <w:bookmarkStart w:id="48" w:name="cumplimiento-contractual"/>
+    <w:bookmarkEnd w:id="56"/>
+    <w:bookmarkStart w:id="59" w:name="cumplimiento-contractual"/>
     <w:p>
       <w:pPr>
         <w:pStyle w:val="Heading2"/>
@@ -4570,7 +4570,7 @@
         <w:t xml:space="preserve">📋 CUMPLIMIENTO CONTRACTUAL</w:t>
       </w:r>
     </w:p>
-    <w:bookmarkStart w:id="46" w:name="obligaciones-clave-del-contrato"/>
+    <w:bookmarkStart w:id="57" w:name="obligaciones-clave-del-contrato"/>
     <w:p>
       <w:pPr>
         <w:pStyle w:val="Heading3"/>
@@ -4719,8 +4719,8 @@
         <w:t xml:space="preserve">Gestión predial para infraestructura - En progreso</w:t>
       </w:r>
     </w:p>
-    <w:bookmarkEnd w:id="46"/>
-    <w:bookmarkStart w:id="47" w:name="referencias-contractuales"/>
+    <w:bookmarkEnd w:id="57"/>
+    <w:bookmarkStart w:id="58" w:name="referencias-contractuales"/>
     <w:p>
       <w:pPr>
         <w:pStyle w:val="Heading3"/>
@@ -4846,9 +4846,9 @@
         </w:pict>
       </w:r>
     </w:p>
-    <w:bookmarkEnd w:id="47"/>
-    <w:bookmarkEnd w:id="48"/>
-    <w:bookmarkStart w:id="51" w:name="documentación-de-soporte"/>
+    <w:bookmarkEnd w:id="58"/>
+    <w:bookmarkEnd w:id="59"/>
+    <w:bookmarkStart w:id="62" w:name="documentación-de-soporte"/>
     <w:p>
       <w:pPr>
         <w:pStyle w:val="Heading2"/>
@@ -4857,7 +4857,7 @@
         <w:t xml:space="preserve">📚 DOCUMENTACIÓN DE SOPORTE</w:t>
       </w:r>
     </w:p>
-    <w:bookmarkStart w:id="49" w:name="documentos-técnicos-disponibles"/>
+    <w:bookmarkStart w:id="60" w:name="documentos-técnicos-disponibles"/>
     <w:p>
       <w:pPr>
         <w:pStyle w:val="Heading3"/>
@@ -5133,8 +5133,8 @@
         </w:tc>
       </w:tr>
     </w:tbl>
-    <w:bookmarkEnd w:id="49"/>
-    <w:bookmarkStart w:id="50" w:name="para-más-información-técnica"/>
+    <w:bookmarkEnd w:id="60"/>
+    <w:bookmarkStart w:id="61" w:name="para-más-información-técnica"/>
     <w:p>
       <w:pPr>
         <w:pStyle w:val="Heading3"/>
@@ -5158,9 +5158,9 @@
         </w:pict>
       </w:r>
     </w:p>
-    <w:bookmarkEnd w:id="50"/>
-    <w:bookmarkEnd w:id="51"/>
-    <w:bookmarkStart w:id="52" w:name="contactos-y-responsables"/>
+    <w:bookmarkEnd w:id="61"/>
+    <w:bookmarkEnd w:id="62"/>
+    <w:bookmarkStart w:id="63" w:name="contactos-y-responsables"/>
     <w:p>
       <w:pPr>
         <w:pStyle w:val="Heading2"/>
@@ -5343,8 +5343,8 @@
         </w:pict>
       </w:r>
     </w:p>
-    <w:bookmarkEnd w:id="52"/>
-    <w:bookmarkStart w:id="53" w:name="indicadores-de-desempeño-kpis"/>
+    <w:bookmarkEnd w:id="63"/>
+    <w:bookmarkStart w:id="64" w:name="indicadores-de-desempeño-kpis"/>
     <w:p>
       <w:pPr>
         <w:pStyle w:val="Heading2"/>
@@ -5676,8 +5676,8 @@
         </w:pict>
       </w:r>
     </w:p>
-    <w:bookmarkEnd w:id="53"/>
-    <w:bookmarkStart w:id="55" w:name="decisiones-tecnicas-aplicadas"/>
+    <w:bookmarkEnd w:id="64"/>
+    <w:bookmarkStart w:id="66" w:name="decisiones-tecnicas-aplicadas"/>
     <w:p>
       <w:pPr>
         <w:pStyle w:val="Heading2"/>
@@ -5686,7 +5686,7 @@
         <w:t xml:space="preserve">📋 DECISIONES TECNICAS APLICADAS</w:t>
       </w:r>
     </w:p>
-    <w:bookmarkStart w:id="54" w:name="obras-civiles-actualizadas"/>
+    <w:bookmarkStart w:id="65" w:name="obras-civiles-actualizadas"/>
     <w:p>
       <w:pPr>
         <w:pStyle w:val="Heading3"/>
@@ -5726,9 +5726,9 @@
         </w:pict>
       </w:r>
     </w:p>
-    <w:bookmarkEnd w:id="54"/>
-    <w:bookmarkEnd w:id="55"/>
-    <w:bookmarkStart w:id="56" w:name="control-de-versiones"/>
+    <w:bookmarkEnd w:id="65"/>
+    <w:bookmarkEnd w:id="66"/>
+    <w:bookmarkStart w:id="67" w:name="control-de-versiones"/>
     <w:p>
       <w:pPr>
         <w:pStyle w:val="Heading2"/>
@@ -5927,8 +5927,8 @@
         <w:t xml:space="preserve">ESPECIALIDAD_01_Ingenieria_Civil_Master.md v1.0</w:t>
       </w:r>
     </w:p>
-    <w:bookmarkEnd w:id="56"/>
-    <w:bookmarkEnd w:id="57"/>
+    <w:bookmarkEnd w:id="67"/>
+    <w:bookmarkEnd w:id="68"/>
     <w:sectPr>
       <w:footnotePr>
         <w:numRestart w:val="eachSect"/>
@@ -6295,10 +6295,10 @@
   <w:docDefaults>
     <w:rPrDefault>
       <w:rPr>
-        <w:rFonts w:asciiTheme="minorHAnsi" w:cstheme="minorBidi" w:eastAsiaTheme="minorEastAsia" w:hAnsiTheme="minorHAnsi"/>
+        <w:rFonts w:asciiTheme="minorHAnsi" w:cstheme="minorBidi" w:eastAsiaTheme="minorHAnsi" w:hAnsiTheme="minorHAnsi"/>
         <w:sz w:val="24"/>
         <w:szCs w:val="24"/>
-        <w:lang w:bidi="ar-SA" w:eastAsia="zh-CN" w:val="en-US"/>
+        <w:lang w:bidi="ar-SA" w:eastAsia="en-US" w:val="en-US"/>
       </w:rPr>
     </w:rPrDefault>
     <w:pPrDefault>
@@ -6350,6 +6350,8 @@
     </w:pPr>
     <w:rPr>
       <w:rFonts w:asciiTheme="majorHAnsi" w:cstheme="majorBidi" w:eastAsiaTheme="majorEastAsia" w:hAnsiTheme="majorHAnsi"/>
+      <w:spacing w:val="-10"/>
+      <w:kern w:val="28"/>
       <w:sz w:val="56"/>
       <w:szCs w:val="56"/>
     </w:rPr>
@@ -6362,6 +6364,8 @@
     <w:rsid w:val="00A10FD9"/>
     <w:rPr>
       <w:rFonts w:asciiTheme="majorHAnsi" w:cstheme="majorBidi" w:eastAsiaTheme="majorEastAsia" w:hAnsiTheme="majorHAnsi"/>
+      <w:spacing w:val="-10"/>
+      <w:kern w:val="28"/>
       <w:sz w:val="56"/>
       <w:szCs w:val="56"/>
     </w:rPr>
@@ -6402,31 +6406,23 @@
   </w:style>
   <w:style w:customStyle="1" w:styleId="Author" w:type="paragraph">
     <w:name w:val="Author"/>
-    <w:basedOn w:val="Title"/>
     <w:next w:val="BodyText"/>
     <w:qFormat/>
     <w:pPr>
       <w:keepNext/>
       <w:keepLines/>
+      <w:jc w:val="center"/>
     </w:pPr>
-    <w:rPr>
-      <w:sz w:val="24"/>
-      <w:szCs w:val="24"/>
-    </w:rPr>
   </w:style>
   <w:style w:styleId="Date" w:type="paragraph">
     <w:name w:val="Date"/>
-    <w:basedOn w:val="Title"/>
     <w:next w:val="BodyText"/>
     <w:qFormat/>
     <w:pPr>
       <w:keepNext/>
       <w:keepLines/>
+      <w:jc w:val="center"/>
     </w:pPr>
-    <w:rPr>
-      <w:sz w:val="24"/>
-      <w:szCs w:val="24"/>
-    </w:rPr>
   </w:style>
   <w:style w:customStyle="1" w:styleId="AbstractTitle" w:type="paragraph">
     <w:name w:val="Abstract Title"/>
@@ -6839,6 +6835,13 @@
       </w:tblCellMar>
     </w:tblPr>
     <w:tblStylePr w:type="firstRow">
+      <w:tblPr>
+        <w:jc w:val="left"/>
+        <w:tblInd w:type="dxa" w:w="0"/>
+      </w:tblPr>
+      <w:trPr>
+        <w:jc w:val="left"/>
+      </w:trPr>
       <w:tcPr>
         <w:tcBorders>
           <w:bottom w:val="single"/>

</xml_diff>

<commit_message>
feat: Reinicio Maestro n+n+1 - Saneamiento Inverso, Material Rodante Diesel-Eléctrico y Motor Dual COP/USD
</commit_message>
<xml_diff>
--- a/X_ENTREGABLES_CONSOLIDADOS/8_DOCUMENTOS_SERVIDOS/WORD/ESPECIALIDAD_01_Ingenieria_Civil_EJECUTIVO.docx
+++ b/X_ENTREGABLES_CONSOLIDADOS/8_DOCUMENTOS_SERVIDOS/WORD/ESPECIALIDAD_01_Ingenieria_Civil_EJECUTIVO.docx
@@ -169,7 +169,7 @@
         <w:t xml:space="preserve"> </w:t>
       </w:r>
       <w:r>
-        <w:t xml:space="preserve">Trocha estándar 1,435 mm según estándares UIC</w:t>
+        <w:t xml:space="preserve">Trocha estándar 1,435 mm según estándares FRA/AREMA</w:t>
       </w:r>
     </w:p>
     <w:p>
@@ -615,7 +615,7 @@
         <w:t xml:space="preserve"> </w:t>
       </w:r>
       <w:r>
-        <w:t xml:space="preserve">1,435 mm según estándares UIC para interoperabilidad</w:t>
+        <w:t xml:space="preserve">1,435 mm según estándares FRA/AREMA para interoperabilidad</w:t>
       </w:r>
       <w:r>
         <w:t xml:space="preserve"> </w:t>
@@ -1718,7 +1718,7 @@
         <w:t xml:space="preserve"> </w:t>
       </w:r>
       <w:r>
-        <w:t xml:space="preserve">| 1,435 mm | Estándar UIC para interoperabilidad |</w:t>
+        <w:t xml:space="preserve">| 1,435 mm | Estándar FRA/AREMA para interoperabilidad |</w:t>
       </w:r>
       <w:r>
         <w:t xml:space="preserve"> </w:t>
@@ -2179,7 +2179,7 @@
               <w:jc w:val="left"/>
             </w:pPr>
             <w:r>
-              <w:t xml:space="preserve">UIC 600</w:t>
+              <w:t xml:space="preserve">FRA/AREMA 600</w:t>
             </w:r>
           </w:p>
         </w:tc>
@@ -2217,7 +2217,7 @@
               <w:jc w:val="left"/>
             </w:pPr>
             <w:r>
-              <w:t xml:space="preserve">UIC 703</w:t>
+              <w:t xml:space="preserve">FRA/AREMA 703</w:t>
             </w:r>
           </w:p>
         </w:tc>
@@ -2255,7 +2255,7 @@
               <w:jc w:val="left"/>
             </w:pPr>
             <w:r>
-              <w:t xml:space="preserve">UIC 703</w:t>
+              <w:t xml:space="preserve">FRA/AREMA 703</w:t>
             </w:r>
           </w:p>
         </w:tc>
@@ -2293,7 +2293,7 @@
               <w:jc w:val="left"/>
             </w:pPr>
             <w:r>
-              <w:t xml:space="preserve">UIC 700</w:t>
+              <w:t xml:space="preserve">FRA/AREMA 700</w:t>
             </w:r>
           </w:p>
         </w:tc>

</xml_diff>

<commit_message>
feat: DT Flow v2.3.1 - Standardized Autonomous Masterchef Loop
</commit_message>
<xml_diff>
--- a/X_ENTREGABLES_CONSOLIDADOS/8_DOCUMENTOS_SERVIDOS/WORD/ESPECIALIDAD_01_Ingenieria_Civil_EJECUTIVO.docx
+++ b/X_ENTREGABLES_CONSOLIDADOS/8_DOCUMENTOS_SERVIDOS/WORD/ESPECIALIDAD_01_Ingenieria_Civil_EJECUTIVO.docx
@@ -28,7 +28,7 @@
         </w:p>
       </w:sdtContent>
     </w:sdt>
-    <w:bookmarkStart w:id="68" w:name="especialidad-01-ingeniería-civil"/>
+    <w:bookmarkStart w:id="57" w:name="especialidad-01-ingeniería-civil"/>
     <w:p>
       <w:pPr>
         <w:pStyle w:val="Heading1"/>
@@ -37,7 +37,7 @@
         <w:t xml:space="preserve">ESPECIALIDAD 01: INGENIERÍA CIVIL</w:t>
       </w:r>
     </w:p>
-    <w:bookmarkStart w:id="20" w:name="documento-ejecutivo-de-ingeniería"/>
+    <w:bookmarkStart w:id="9" w:name="documento-ejecutivo-de-ingeniería"/>
     <w:p>
       <w:pPr>
         <w:pStyle w:val="Heading2"/>
@@ -53,8 +53,8 @@
         </w:pict>
       </w:r>
     </w:p>
-    <w:bookmarkEnd w:id="20"/>
-    <w:bookmarkStart w:id="24" w:name="resumen-ejecutivo"/>
+    <w:bookmarkEnd w:id="9"/>
+    <w:bookmarkStart w:id="13" w:name="resumen-ejecutivo"/>
     <w:p>
       <w:pPr>
         <w:pStyle w:val="Heading2"/>
@@ -63,7 +63,7 @@
         <w:t xml:space="preserve">📊 RESUMEN EJECUTIVO</w:t>
       </w:r>
     </w:p>
-    <w:bookmarkStart w:id="21" w:name="X7c07705fb5e25c553c679eab7107af56022a4cb"/>
+    <w:bookmarkStart w:id="10" w:name="X7c07705fb5e25c553c679eab7107af56022a4cb"/>
     <w:p>
       <w:pPr>
         <w:pStyle w:val="Heading3"/>
@@ -96,8 +96,8 @@
         <w:t xml:space="preserve">del ferrocarril que proporciona toda la infraestructura necesaria para la operación ferroviaria. Es como los cimientos y la estructura de un edificio, pero para un ferrocarril completo de 526 km que debe soportar el tráfico ferroviario durante 50 años.</w:t>
       </w:r>
     </w:p>
-    <w:bookmarkEnd w:id="21"/>
-    <w:bookmarkStart w:id="22" w:name="X7c83a38cc8f42be1526a62fa09e05463bbe3395"/>
+    <w:bookmarkEnd w:id="10"/>
+    <w:bookmarkStart w:id="11" w:name="X7c83a38cc8f42be1526a62fa09e05463bbe3395"/>
     <w:p>
       <w:pPr>
         <w:pStyle w:val="Heading3"/>
@@ -282,8 +282,8 @@
         <w:t xml:space="preserve">Compactación de terraplenes</w:t>
       </w:r>
     </w:p>
-    <w:bookmarkEnd w:id="22"/>
-    <w:bookmarkStart w:id="23" w:name="hitos-críticos"/>
+    <w:bookmarkEnd w:id="11"/>
+    <w:bookmarkStart w:id="12" w:name="hitos-críticos"/>
     <w:p>
       <w:pPr>
         <w:pStyle w:val="Heading3"/>
@@ -542,9 +542,9 @@
         </w:pict>
       </w:r>
     </w:p>
-    <w:bookmarkEnd w:id="23"/>
-    <w:bookmarkEnd w:id="24"/>
-    <w:bookmarkStart w:id="30" w:name="X16ad1bf8fd3c72f4f9f37ec0fde01a31e7fb65a"/>
+    <w:bookmarkEnd w:id="12"/>
+    <w:bookmarkEnd w:id="13"/>
+    <w:bookmarkStart w:id="19" w:name="X16ad1bf8fd3c72f4f9f37ec0fde01a31e7fb65a"/>
     <w:p>
       <w:pPr>
         <w:pStyle w:val="Heading2"/>
@@ -553,7 +553,7 @@
         <w:t xml:space="preserve">🔍 CRITERIOS DE DISEÑO Y JUSTIFICACIONES TÉCNICAS</w:t>
       </w:r>
     </w:p>
-    <w:bookmarkStart w:id="25" w:name="por-qué-526.133-km-de-corredor"/>
+    <w:bookmarkStart w:id="14" w:name="por-qué-526.133-km-de-corredor"/>
     <w:p>
       <w:pPr>
         <w:pStyle w:val="Heading3"/>
@@ -684,8 +684,8 @@
         <w:t xml:space="preserve">Longitud total del corredor ferroviario</w:t>
       </w:r>
     </w:p>
-    <w:bookmarkEnd w:id="25"/>
-    <w:bookmarkStart w:id="26" w:name="por-qué-25-puentes-5-viaductos"/>
+    <w:bookmarkEnd w:id="14"/>
+    <w:bookmarkStart w:id="15" w:name="por-qué-25-puentes-5-viaductos"/>
     <w:p>
       <w:pPr>
         <w:pStyle w:val="Heading3"/>
@@ -906,8 +906,8 @@
         <w:t xml:space="preserve">Alcantarillas cada 3.5 km para drenaje transversal</w:t>
       </w:r>
     </w:p>
-    <w:bookmarkEnd w:id="26"/>
-    <w:bookmarkStart w:id="27" w:name="por-qué-3450000-m³-de-excavación"/>
+    <w:bookmarkEnd w:id="15"/>
+    <w:bookmarkStart w:id="16" w:name="por-qué-3450000-m³-de-excavación"/>
     <w:p>
       <w:pPr>
         <w:pStyle w:val="Heading3"/>
@@ -1038,8 +1038,8 @@
         <w:t xml:space="preserve">Volumen calculado por perfiles longitudinales</w:t>
       </w:r>
     </w:p>
-    <w:bookmarkEnd w:id="27"/>
-    <w:bookmarkStart w:id="28" w:name="por-qué-edificaciones-específicas"/>
+    <w:bookmarkEnd w:id="16"/>
+    <w:bookmarkStart w:id="17" w:name="por-qué-edificaciones-específicas"/>
     <w:p>
       <w:pPr>
         <w:pStyle w:val="Heading3"/>
@@ -1160,8 +1160,8 @@
         <w:t xml:space="preserve">| 800 m² | Personal técnico y administrativo |</w:t>
       </w:r>
     </w:p>
-    <w:bookmarkEnd w:id="28"/>
-    <w:bookmarkStart w:id="29" w:name="por-qué-estándares-nsr-10"/>
+    <w:bookmarkEnd w:id="17"/>
+    <w:bookmarkStart w:id="18" w:name="por-qué-estándares-nsr-10"/>
     <w:p>
       <w:pPr>
         <w:pStyle w:val="Heading3"/>
@@ -1299,9 +1299,9 @@
         </w:pict>
       </w:r>
     </w:p>
-    <w:bookmarkEnd w:id="29"/>
-    <w:bookmarkEnd w:id="30"/>
-    <w:bookmarkStart w:id="34" w:name="función-y-propósito-de-la-especialidad"/>
+    <w:bookmarkEnd w:id="18"/>
+    <w:bookmarkEnd w:id="19"/>
+    <w:bookmarkStart w:id="23" w:name="función-y-propósito-de-la-especialidad"/>
     <w:p>
       <w:pPr>
         <w:pStyle w:val="Heading2"/>
@@ -1310,7 +1310,7 @@
         <w:t xml:space="preserve">🎯 FUNCIÓN Y PROPÓSITO DE LA ESPECIALIDAD</w:t>
       </w:r>
     </w:p>
-    <w:bookmarkStart w:id="31" w:name="qué-hace-esta-especialidad"/>
+    <w:bookmarkStart w:id="20" w:name="qué-hace-esta-especialidad"/>
     <w:p>
       <w:pPr>
         <w:pStyle w:val="Heading3"/>
@@ -1431,8 +1431,8 @@
         <w:t xml:space="preserve">Drenaje, iluminación, señalización</w:t>
       </w:r>
     </w:p>
-    <w:bookmarkEnd w:id="31"/>
-    <w:bookmarkStart w:id="32" w:name="por-qué-la-necesitamos"/>
+    <w:bookmarkEnd w:id="20"/>
+    <w:bookmarkStart w:id="21" w:name="por-qué-la-necesitamos"/>
     <w:p>
       <w:pPr>
         <w:pStyle w:val="Heading3"/>
@@ -1551,8 +1551,8 @@
         <w:t xml:space="preserve">Criterios ambientales y eficiencia energética</w:t>
       </w:r>
     </w:p>
-    <w:bookmarkEnd w:id="32"/>
-    <w:bookmarkStart w:id="33" w:name="cómo-se-integra-con-otras-especialidades"/>
+    <w:bookmarkEnd w:id="21"/>
+    <w:bookmarkStart w:id="22" w:name="cómo-se-integra-con-otras-especialidades"/>
     <w:p>
       <w:pPr>
         <w:pStyle w:val="Heading3"/>
@@ -1615,9 +1615,9 @@
         </w:pict>
       </w:r>
     </w:p>
-    <w:bookmarkEnd w:id="33"/>
-    <w:bookmarkEnd w:id="34"/>
-    <w:bookmarkStart w:id="38" w:name="componentes-principales"/>
+    <w:bookmarkEnd w:id="22"/>
+    <w:bookmarkEnd w:id="23"/>
+    <w:bookmarkStart w:id="27" w:name="componentes-principales"/>
     <w:p>
       <w:pPr>
         <w:pStyle w:val="Heading2"/>
@@ -1626,7 +1626,7 @@
         <w:t xml:space="preserve">🏗️ COMPONENTES PRINCIPALES</w:t>
       </w:r>
     </w:p>
-    <w:bookmarkStart w:id="35" w:name="corredor-ferroviario-principal"/>
+    <w:bookmarkStart w:id="24" w:name="corredor-ferroviario-principal"/>
     <w:p>
       <w:pPr>
         <w:pStyle w:val="Heading3"/>
@@ -1787,8 +1787,8 @@
         <w:t xml:space="preserve">| 2% | Según especificaciones ferroviarias |</w:t>
       </w:r>
     </w:p>
-    <w:bookmarkEnd w:id="35"/>
-    <w:bookmarkStart w:id="36" w:name="obras-de-arte"/>
+    <w:bookmarkEnd w:id="24"/>
+    <w:bookmarkStart w:id="25" w:name="obras-de-arte"/>
     <w:p>
       <w:pPr>
         <w:pStyle w:val="Heading3"/>
@@ -1927,8 +1927,8 @@
         <w:t xml:space="preserve">| 30 unidades | Taludes críticos | ⏳ En diseño |</w:t>
       </w:r>
     </w:p>
-    <w:bookmarkEnd w:id="36"/>
-    <w:bookmarkStart w:id="37" w:name="edificaciones"/>
+    <w:bookmarkEnd w:id="25"/>
+    <w:bookmarkStart w:id="26" w:name="edificaciones"/>
     <w:p>
       <w:pPr>
         <w:pStyle w:val="Heading3"/>
@@ -2074,9 +2074,9 @@
         </w:pict>
       </w:r>
     </w:p>
-    <w:bookmarkEnd w:id="37"/>
-    <w:bookmarkEnd w:id="38"/>
-    <w:bookmarkStart w:id="41" w:name="especificaciones-técnicas-clave"/>
+    <w:bookmarkEnd w:id="26"/>
+    <w:bookmarkEnd w:id="27"/>
+    <w:bookmarkStart w:id="30" w:name="especificaciones-técnicas-clave"/>
     <w:p>
       <w:pPr>
         <w:pStyle w:val="Heading2"/>
@@ -2085,7 +2085,7 @@
         <w:t xml:space="preserve">📐 ESPECIFICACIONES TÉCNICAS CLAVE</w:t>
       </w:r>
     </w:p>
-    <w:bookmarkStart w:id="39" w:name="tabla-consolidada-de-especificaciones"/>
+    <w:bookmarkStart w:id="28" w:name="tabla-consolidada-de-especificaciones"/>
     <w:p>
       <w:pPr>
         <w:pStyle w:val="Heading3"/>
@@ -2375,8 +2375,8 @@
         </w:tc>
       </w:tr>
     </w:tbl>
-    <w:bookmarkEnd w:id="39"/>
-    <w:bookmarkStart w:id="40" w:name="criterios-de-aceptación"/>
+    <w:bookmarkEnd w:id="28"/>
+    <w:bookmarkStart w:id="29" w:name="criterios-de-aceptación"/>
     <w:p>
       <w:pPr>
         <w:pStyle w:val="Heading3"/>
@@ -2452,9 +2452,9 @@
         </w:pict>
       </w:r>
     </w:p>
-    <w:bookmarkEnd w:id="40"/>
-    <w:bookmarkEnd w:id="41"/>
-    <w:bookmarkStart w:id="44" w:name="ubicación-y-despliegue"/>
+    <w:bookmarkEnd w:id="29"/>
+    <w:bookmarkEnd w:id="30"/>
+    <w:bookmarkStart w:id="33" w:name="ubicación-y-despliegue"/>
     <w:p>
       <w:pPr>
         <w:pStyle w:val="Heading2"/>
@@ -2463,7 +2463,7 @@
         <w:t xml:space="preserve">📍 UBICACIÓN Y DESPLIEGUE</w:t>
       </w:r>
     </w:p>
-    <w:bookmarkStart w:id="42" w:name="mapa-de-despliegue"/>
+    <w:bookmarkStart w:id="31" w:name="mapa-de-despliegue"/>
     <w:p>
       <w:pPr>
         <w:pStyle w:val="Heading3"/>
@@ -2480,8 +2480,8 @@
         <w:t xml:space="preserve">El corredor ferroviario se extiende 526.133 km entre La Dorada (Caldas) y Chiriguaná (Cesar), atravesando 5 departamentos con diferentes características topográficas y geológicas.</w:t>
       </w:r>
     </w:p>
-    <w:bookmarkEnd w:id="42"/>
-    <w:bookmarkStart w:id="43" w:name="Xb6329a5623b2edb37388c6a22f7ab4090e72c58"/>
+    <w:bookmarkEnd w:id="31"/>
+    <w:bookmarkStart w:id="32" w:name="Xb6329a5623b2edb37388c6a22f7ab4090e72c58"/>
     <w:p>
       <w:pPr>
         <w:pStyle w:val="Heading3"/>
@@ -2906,9 +2906,9 @@
         </w:pict>
       </w:r>
     </w:p>
-    <w:bookmarkEnd w:id="43"/>
-    <w:bookmarkEnd w:id="44"/>
-    <w:bookmarkStart w:id="48" w:name="operación-y-mantenimiento"/>
+    <w:bookmarkEnd w:id="32"/>
+    <w:bookmarkEnd w:id="33"/>
+    <w:bookmarkStart w:id="37" w:name="operación-y-mantenimiento"/>
     <w:p>
       <w:pPr>
         <w:pStyle w:val="Heading2"/>
@@ -2917,7 +2917,7 @@
         <w:t xml:space="preserve">⚙️ OPERACIÓN Y MANTENIMIENTO</w:t>
       </w:r>
     </w:p>
-    <w:bookmarkStart w:id="45" w:name="operación-normal"/>
+    <w:bookmarkStart w:id="34" w:name="operación-normal"/>
     <w:p>
       <w:pPr>
         <w:pStyle w:val="Heading3"/>
@@ -2934,8 +2934,8 @@
         <w:t xml:space="preserve">La infraestructura civil opera 24/7 proporcionando base física para circulación de trenes, con monitoreo continuo de condiciones estructurales y geotécnicas.</w:t>
       </w:r>
     </w:p>
-    <w:bookmarkEnd w:id="45"/>
-    <w:bookmarkStart w:id="46" w:name="mantenimiento-preventivo"/>
+    <w:bookmarkEnd w:id="34"/>
+    <w:bookmarkStart w:id="35" w:name="mantenimiento-preventivo"/>
     <w:p>
       <w:pPr>
         <w:pStyle w:val="Heading3"/>
@@ -3054,8 +3054,8 @@
         <w:t xml:space="preserve">Evaluación estructural completa</w:t>
       </w:r>
     </w:p>
-    <w:bookmarkEnd w:id="46"/>
-    <w:bookmarkStart w:id="47" w:name="respuesta-a-fallas"/>
+    <w:bookmarkEnd w:id="35"/>
+    <w:bookmarkStart w:id="36" w:name="respuesta-a-fallas"/>
     <w:p>
       <w:pPr>
         <w:pStyle w:val="Heading3"/>
@@ -3181,9 +3181,9 @@
         </w:pict>
       </w:r>
     </w:p>
-    <w:bookmarkEnd w:id="47"/>
-    <w:bookmarkEnd w:id="48"/>
-    <w:bookmarkStart w:id="51" w:name="interfaces-con-otras-especialidades"/>
+    <w:bookmarkEnd w:id="36"/>
+    <w:bookmarkEnd w:id="37"/>
+    <w:bookmarkStart w:id="40" w:name="interfaces-con-otras-especialidades"/>
     <w:p>
       <w:pPr>
         <w:pStyle w:val="Heading2"/>
@@ -3192,7 +3192,7 @@
         <w:t xml:space="preserve">🔗 INTERFACES CON OTRAS ESPECIALIDADES</w:t>
       </w:r>
     </w:p>
-    <w:bookmarkStart w:id="49" w:name="diagrama-de-interfaces"/>
+    <w:bookmarkStart w:id="38" w:name="diagrama-de-interfaces"/>
     <w:p>
       <w:pPr>
         <w:pStyle w:val="Heading3"/>
@@ -3248,8 +3248,8 @@
         <w:t xml:space="preserve">[Sistemas Civiles] ←→ [Sistemas de Control] ←→ [Sistemas de Comunicación]</w:t>
       </w:r>
     </w:p>
-    <w:bookmarkEnd w:id="49"/>
-    <w:bookmarkStart w:id="50" w:name="tabla-de-interfaces-críticas"/>
+    <w:bookmarkEnd w:id="38"/>
+    <w:bookmarkStart w:id="39" w:name="tabla-de-interfaces-críticas"/>
     <w:p>
       <w:pPr>
         <w:pStyle w:val="Heading3"/>
@@ -3548,9 +3548,9 @@
         </w:pict>
       </w:r>
     </w:p>
-    <w:bookmarkEnd w:id="50"/>
-    <w:bookmarkEnd w:id="51"/>
-    <w:bookmarkStart w:id="55" w:name="supuestos-técnicos-y-limitaciones"/>
+    <w:bookmarkEnd w:id="39"/>
+    <w:bookmarkEnd w:id="40"/>
+    <w:bookmarkStart w:id="44" w:name="supuestos-técnicos-y-limitaciones"/>
     <w:p>
       <w:pPr>
         <w:pStyle w:val="Heading2"/>
@@ -3559,7 +3559,7 @@
         <w:t xml:space="preserve">📋 SUPUESTOS TÉCNICOS Y LIMITACIONES</w:t>
       </w:r>
     </w:p>
-    <w:bookmarkStart w:id="52" w:name="supuestos-críticos-del-diseño"/>
+    <w:bookmarkStart w:id="41" w:name="supuestos-críticos-del-diseño"/>
     <w:p>
       <w:pPr>
         <w:pStyle w:val="Heading3"/>
@@ -3905,8 +3905,8 @@
         </w:tc>
       </w:tr>
     </w:tbl>
-    <w:bookmarkEnd w:id="52"/>
-    <w:bookmarkStart w:id="53" w:name="limitaciones-del-diseño"/>
+    <w:bookmarkEnd w:id="41"/>
+    <w:bookmarkStart w:id="42" w:name="limitaciones-del-diseño"/>
     <w:p>
       <w:pPr>
         <w:pStyle w:val="Heading3"/>
@@ -4025,8 +4025,8 @@
         <w:t xml:space="preserve">Restricciones por licencias ambientales</w:t>
       </w:r>
     </w:p>
-    <w:bookmarkEnd w:id="53"/>
-    <w:bookmarkStart w:id="54" w:name="dependencias-críticas"/>
+    <w:bookmarkEnd w:id="42"/>
+    <w:bookmarkStart w:id="43" w:name="dependencias-críticas"/>
     <w:p>
       <w:pPr>
         <w:pStyle w:val="Heading3"/>
@@ -4152,9 +4152,9 @@
         </w:pict>
       </w:r>
     </w:p>
-    <w:bookmarkEnd w:id="54"/>
-    <w:bookmarkEnd w:id="55"/>
-    <w:bookmarkStart w:id="56" w:name="riesgos-y-mitigaciones"/>
+    <w:bookmarkEnd w:id="43"/>
+    <w:bookmarkEnd w:id="44"/>
+    <w:bookmarkStart w:id="45" w:name="riesgos-y-mitigaciones"/>
     <w:p>
       <w:pPr>
         <w:pStyle w:val="Heading2"/>
@@ -4560,8 +4560,8 @@
         </w:pict>
       </w:r>
     </w:p>
-    <w:bookmarkEnd w:id="56"/>
-    <w:bookmarkStart w:id="59" w:name="cumplimiento-contractual"/>
+    <w:bookmarkEnd w:id="45"/>
+    <w:bookmarkStart w:id="48" w:name="cumplimiento-contractual"/>
     <w:p>
       <w:pPr>
         <w:pStyle w:val="Heading2"/>
@@ -4570,7 +4570,7 @@
         <w:t xml:space="preserve">📋 CUMPLIMIENTO CONTRACTUAL</w:t>
       </w:r>
     </w:p>
-    <w:bookmarkStart w:id="57" w:name="obligaciones-clave-del-contrato"/>
+    <w:bookmarkStart w:id="46" w:name="obligaciones-clave-del-contrato"/>
     <w:p>
       <w:pPr>
         <w:pStyle w:val="Heading3"/>
@@ -4719,8 +4719,8 @@
         <w:t xml:space="preserve">Gestión predial para infraestructura - En progreso</w:t>
       </w:r>
     </w:p>
-    <w:bookmarkEnd w:id="57"/>
-    <w:bookmarkStart w:id="58" w:name="referencias-contractuales"/>
+    <w:bookmarkEnd w:id="46"/>
+    <w:bookmarkStart w:id="47" w:name="referencias-contractuales"/>
     <w:p>
       <w:pPr>
         <w:pStyle w:val="Heading3"/>
@@ -4846,9 +4846,9 @@
         </w:pict>
       </w:r>
     </w:p>
-    <w:bookmarkEnd w:id="58"/>
-    <w:bookmarkEnd w:id="59"/>
-    <w:bookmarkStart w:id="62" w:name="documentación-de-soporte"/>
+    <w:bookmarkEnd w:id="47"/>
+    <w:bookmarkEnd w:id="48"/>
+    <w:bookmarkStart w:id="51" w:name="documentación-de-soporte"/>
     <w:p>
       <w:pPr>
         <w:pStyle w:val="Heading2"/>
@@ -4857,7 +4857,7 @@
         <w:t xml:space="preserve">📚 DOCUMENTACIÓN DE SOPORTE</w:t>
       </w:r>
     </w:p>
-    <w:bookmarkStart w:id="60" w:name="documentos-técnicos-disponibles"/>
+    <w:bookmarkStart w:id="49" w:name="documentos-técnicos-disponibles"/>
     <w:p>
       <w:pPr>
         <w:pStyle w:val="Heading3"/>
@@ -5133,8 +5133,8 @@
         </w:tc>
       </w:tr>
     </w:tbl>
-    <w:bookmarkEnd w:id="60"/>
-    <w:bookmarkStart w:id="61" w:name="para-más-información-técnica"/>
+    <w:bookmarkEnd w:id="49"/>
+    <w:bookmarkStart w:id="50" w:name="para-más-información-técnica"/>
     <w:p>
       <w:pPr>
         <w:pStyle w:val="Heading3"/>
@@ -5158,9 +5158,9 @@
         </w:pict>
       </w:r>
     </w:p>
-    <w:bookmarkEnd w:id="61"/>
-    <w:bookmarkEnd w:id="62"/>
-    <w:bookmarkStart w:id="63" w:name="contactos-y-responsables"/>
+    <w:bookmarkEnd w:id="50"/>
+    <w:bookmarkEnd w:id="51"/>
+    <w:bookmarkStart w:id="52" w:name="contactos-y-responsables"/>
     <w:p>
       <w:pPr>
         <w:pStyle w:val="Heading2"/>
@@ -5343,8 +5343,8 @@
         </w:pict>
       </w:r>
     </w:p>
-    <w:bookmarkEnd w:id="63"/>
-    <w:bookmarkStart w:id="64" w:name="indicadores-de-desempeño-kpis"/>
+    <w:bookmarkEnd w:id="52"/>
+    <w:bookmarkStart w:id="53" w:name="indicadores-de-desempeño-kpis"/>
     <w:p>
       <w:pPr>
         <w:pStyle w:val="Heading2"/>
@@ -5676,8 +5676,8 @@
         </w:pict>
       </w:r>
     </w:p>
-    <w:bookmarkEnd w:id="64"/>
-    <w:bookmarkStart w:id="66" w:name="decisiones-tecnicas-aplicadas"/>
+    <w:bookmarkEnd w:id="53"/>
+    <w:bookmarkStart w:id="55" w:name="decisiones-tecnicas-aplicadas"/>
     <w:p>
       <w:pPr>
         <w:pStyle w:val="Heading2"/>
@@ -5686,7 +5686,7 @@
         <w:t xml:space="preserve">📋 DECISIONES TECNICAS APLICADAS</w:t>
       </w:r>
     </w:p>
-    <w:bookmarkStart w:id="65" w:name="obras-civiles-actualizadas"/>
+    <w:bookmarkStart w:id="54" w:name="obras-civiles-actualizadas"/>
     <w:p>
       <w:pPr>
         <w:pStyle w:val="Heading3"/>
@@ -5726,9 +5726,9 @@
         </w:pict>
       </w:r>
     </w:p>
-    <w:bookmarkEnd w:id="65"/>
-    <w:bookmarkEnd w:id="66"/>
-    <w:bookmarkStart w:id="67" w:name="control-de-versiones"/>
+    <w:bookmarkEnd w:id="54"/>
+    <w:bookmarkEnd w:id="55"/>
+    <w:bookmarkStart w:id="56" w:name="control-de-versiones"/>
     <w:p>
       <w:pPr>
         <w:pStyle w:val="Heading2"/>
@@ -5927,8 +5927,8 @@
         <w:t xml:space="preserve">ESPECIALIDAD_01_Ingenieria_Civil_Master.md v1.0</w:t>
       </w:r>
     </w:p>
-    <w:bookmarkEnd w:id="67"/>
-    <w:bookmarkEnd w:id="68"/>
+    <w:bookmarkEnd w:id="56"/>
+    <w:bookmarkEnd w:id="57"/>
     <w:sectPr>
       <w:footnotePr>
         <w:numRestart w:val="eachSect"/>
@@ -6295,10 +6295,10 @@
   <w:docDefaults>
     <w:rPrDefault>
       <w:rPr>
-        <w:rFonts w:asciiTheme="minorHAnsi" w:cstheme="minorBidi" w:eastAsiaTheme="minorHAnsi" w:hAnsiTheme="minorHAnsi"/>
+        <w:rFonts w:asciiTheme="minorHAnsi" w:cstheme="minorBidi" w:eastAsiaTheme="minorEastAsia" w:hAnsiTheme="minorHAnsi"/>
         <w:sz w:val="24"/>
         <w:szCs w:val="24"/>
-        <w:lang w:bidi="ar-SA" w:eastAsia="en-US" w:val="en-US"/>
+        <w:lang w:bidi="ar-SA" w:eastAsia="zh-CN" w:val="en-US"/>
       </w:rPr>
     </w:rPrDefault>
     <w:pPrDefault>
@@ -6350,8 +6350,6 @@
     </w:pPr>
     <w:rPr>
       <w:rFonts w:asciiTheme="majorHAnsi" w:cstheme="majorBidi" w:eastAsiaTheme="majorEastAsia" w:hAnsiTheme="majorHAnsi"/>
-      <w:spacing w:val="-10"/>
-      <w:kern w:val="28"/>
       <w:sz w:val="56"/>
       <w:szCs w:val="56"/>
     </w:rPr>
@@ -6364,8 +6362,6 @@
     <w:rsid w:val="00A10FD9"/>
     <w:rPr>
       <w:rFonts w:asciiTheme="majorHAnsi" w:cstheme="majorBidi" w:eastAsiaTheme="majorEastAsia" w:hAnsiTheme="majorHAnsi"/>
-      <w:spacing w:val="-10"/>
-      <w:kern w:val="28"/>
       <w:sz w:val="56"/>
       <w:szCs w:val="56"/>
     </w:rPr>
@@ -6406,23 +6402,31 @@
   </w:style>
   <w:style w:customStyle="1" w:styleId="Author" w:type="paragraph">
     <w:name w:val="Author"/>
+    <w:basedOn w:val="Title"/>
     <w:next w:val="BodyText"/>
     <w:qFormat/>
     <w:pPr>
       <w:keepNext/>
       <w:keepLines/>
-      <w:jc w:val="center"/>
     </w:pPr>
+    <w:rPr>
+      <w:sz w:val="24"/>
+      <w:szCs w:val="24"/>
+    </w:rPr>
   </w:style>
   <w:style w:styleId="Date" w:type="paragraph">
     <w:name w:val="Date"/>
+    <w:basedOn w:val="Title"/>
     <w:next w:val="BodyText"/>
     <w:qFormat/>
     <w:pPr>
       <w:keepNext/>
       <w:keepLines/>
-      <w:jc w:val="center"/>
     </w:pPr>
+    <w:rPr>
+      <w:sz w:val="24"/>
+      <w:szCs w:val="24"/>
+    </w:rPr>
   </w:style>
   <w:style w:customStyle="1" w:styleId="AbstractTitle" w:type="paragraph">
     <w:name w:val="Abstract Title"/>
@@ -6835,13 +6839,6 @@
       </w:tblCellMar>
     </w:tblPr>
     <w:tblStylePr w:type="firstRow">
-      <w:tblPr>
-        <w:jc w:val="left"/>
-        <w:tblInd w:type="dxa" w:w="0"/>
-      </w:tblPr>
-      <w:trPr>
-        <w:jc w:val="left"/>
-      </w:trPr>
       <w:tcPr>
         <w:tcBorders>
           <w:bottom w:val="single"/>

</xml_diff>

<commit_message>
feat(sicc): blindaje forense completo v6.3.3 - Metodología .42 [Non-Stop Interop, Microondas, KPIs 99.9%]
</commit_message>
<xml_diff>
--- a/X_ENTREGABLES_CONSOLIDADOS/8_DOCUMENTOS_SERVIDOS/WORD/ESPECIALIDAD_01_Ingenieria_Civil_EJECUTIVO.docx
+++ b/X_ENTREGABLES_CONSOLIDADOS/8_DOCUMENTOS_SERVIDOS/WORD/ESPECIALIDAD_01_Ingenieria_Civil_EJECUTIVO.docx
@@ -28,7 +28,7 @@
         </w:p>
       </w:sdtContent>
     </w:sdt>
-    <w:bookmarkStart w:id="57" w:name="especialidad-01-ingeniería-civil"/>
+    <w:bookmarkStart w:id="68" w:name="especialidad-01-ingeniería-civil"/>
     <w:p>
       <w:pPr>
         <w:pStyle w:val="Heading1"/>
@@ -37,7 +37,7 @@
         <w:t xml:space="preserve">ESPECIALIDAD 01: INGENIERÍA CIVIL</w:t>
       </w:r>
     </w:p>
-    <w:bookmarkStart w:id="9" w:name="documento-ejecutivo-de-ingeniería"/>
+    <w:bookmarkStart w:id="20" w:name="documento-ejecutivo-de-ingeniería"/>
     <w:p>
       <w:pPr>
         <w:pStyle w:val="Heading2"/>
@@ -53,8 +53,8 @@
         </w:pict>
       </w:r>
     </w:p>
-    <w:bookmarkEnd w:id="9"/>
-    <w:bookmarkStart w:id="13" w:name="resumen-ejecutivo"/>
+    <w:bookmarkEnd w:id="20"/>
+    <w:bookmarkStart w:id="24" w:name="resumen-ejecutivo"/>
     <w:p>
       <w:pPr>
         <w:pStyle w:val="Heading2"/>
@@ -63,7 +63,7 @@
         <w:t xml:space="preserve">📊 RESUMEN EJECUTIVO</w:t>
       </w:r>
     </w:p>
-    <w:bookmarkStart w:id="10" w:name="X7c07705fb5e25c553c679eab7107af56022a4cb"/>
+    <w:bookmarkStart w:id="21" w:name="X7c07705fb5e25c553c679eab7107af56022a4cb"/>
     <w:p>
       <w:pPr>
         <w:pStyle w:val="Heading3"/>
@@ -84,20 +84,34 @@
       </w:r>
       <w:r>
         <w:rPr>
-          <w:b/>
-          <w:bCs/>
-        </w:rPr>
-        <w:t xml:space="preserve">“base física”</w:t>
-      </w:r>
-      <w:r>
-        <w:t xml:space="preserve"> </w:t>
-      </w:r>
-      <w:r>
-        <w:t xml:space="preserve">del ferrocarril que proporciona toda la infraestructura necesaria para la operación ferroviaria. Es como los cimientos y la estructura de un edificio, pero para un ferrocarril completo de 526 km que debe soportar el tráfico ferroviario durante 50 años.</w:t>
-      </w:r>
-    </w:p>
-    <w:bookmarkEnd w:id="10"/>
-    <w:bookmarkStart w:id="11" w:name="X7c83a38cc8f42be1526a62fa09e05463bbe3395"/>
+          <w:bCs/>
+          <w:b/>
+        </w:rPr>
+        <w:t xml:space="preserve">“</w:t>
+      </w:r>
+      <w:r>
+        <w:rPr>
+          <w:bCs/>
+          <w:b/>
+        </w:rPr>
+        <w:t xml:space="preserve">base física</w:t>
+      </w:r>
+      <w:r>
+        <w:rPr>
+          <w:bCs/>
+          <w:b/>
+        </w:rPr>
+        <w:t xml:space="preserve">”</w:t>
+      </w:r>
+      <w:r>
+        <w:t xml:space="preserve"> </w:t>
+      </w:r>
+      <w:r>
+        <w:t xml:space="preserve">del ferrocarril que proporciona toda la infraestructura necesaria para la operación ferroviaria. Es como los cimientos y la estructura de un edificio, pero para un ferrocarril completo de 526 km que debe soportar el tráfico ferroviario durante 50 anos.</w:t>
+      </w:r>
+    </w:p>
+    <w:bookmarkEnd w:id="21"/>
+    <w:bookmarkStart w:id="22" w:name="X7c83a38cc8f42be1526a62fa09e05463bbe3395"/>
     <w:p>
       <w:pPr>
         <w:pStyle w:val="Heading3"/>
@@ -108,16 +122,16 @@
     </w:p>
     <w:p>
       <w:pPr>
-        <w:pStyle w:val="Compact"/>
         <w:numPr>
           <w:ilvl w:val="0"/>
           <w:numId w:val="1001"/>
         </w:numPr>
-      </w:pPr>
-      <w:r>
-        <w:rPr>
-          <w:b/>
-          <w:bCs/>
+        <w:pStyle w:val="Compact"/>
+      </w:pPr>
+      <w:r>
+        <w:rPr>
+          <w:bCs/>
+          <w:b/>
         </w:rPr>
         <w:t xml:space="preserve">Inversión estimada:</w:t>
       </w:r>
@@ -130,16 +144,16 @@
     </w:p>
     <w:p>
       <w:pPr>
-        <w:pStyle w:val="Compact"/>
         <w:numPr>
           <w:ilvl w:val="0"/>
           <w:numId w:val="1001"/>
         </w:numPr>
-      </w:pPr>
-      <w:r>
-        <w:rPr>
-          <w:b/>
-          <w:bCs/>
+        <w:pStyle w:val="Compact"/>
+      </w:pPr>
+      <w:r>
+        <w:rPr>
+          <w:bCs/>
+          <w:b/>
         </w:rPr>
         <w:t xml:space="preserve">526.133 km corredor:</w:t>
       </w:r>
@@ -152,16 +166,16 @@
     </w:p>
     <w:p>
       <w:pPr>
-        <w:pStyle w:val="Compact"/>
         <w:numPr>
           <w:ilvl w:val="0"/>
           <w:numId w:val="1001"/>
         </w:numPr>
-      </w:pPr>
-      <w:r>
-        <w:rPr>
-          <w:b/>
-          <w:bCs/>
+        <w:pStyle w:val="Compact"/>
+      </w:pPr>
+      <w:r>
+        <w:rPr>
+          <w:bCs/>
+          <w:b/>
         </w:rPr>
         <w:t xml:space="preserve">2 vías principales:</w:t>
       </w:r>
@@ -174,16 +188,16 @@
     </w:p>
     <w:p>
       <w:pPr>
-        <w:pStyle w:val="Compact"/>
         <w:numPr>
           <w:ilvl w:val="0"/>
           <w:numId w:val="1001"/>
         </w:numPr>
-      </w:pPr>
-      <w:r>
-        <w:rPr>
-          <w:b/>
-          <w:bCs/>
+        <w:pStyle w:val="Compact"/>
+      </w:pPr>
+      <w:r>
+        <w:rPr>
+          <w:bCs/>
+          <w:b/>
         </w:rPr>
         <w:t xml:space="preserve">25 puentes + 5 viaductos:</w:t>
       </w:r>
@@ -196,16 +210,16 @@
     </w:p>
     <w:p>
       <w:pPr>
-        <w:pStyle w:val="Compact"/>
         <w:numPr>
           <w:ilvl w:val="0"/>
           <w:numId w:val="1001"/>
         </w:numPr>
-      </w:pPr>
-      <w:r>
-        <w:rPr>
-          <w:b/>
-          <w:bCs/>
+        <w:pStyle w:val="Compact"/>
+      </w:pPr>
+      <w:r>
+        <w:rPr>
+          <w:bCs/>
+          <w:b/>
         </w:rPr>
         <w:t xml:space="preserve">150 alcantarillas:</w:t>
       </w:r>
@@ -218,16 +232,16 @@
     </w:p>
     <w:p>
       <w:pPr>
-        <w:pStyle w:val="Compact"/>
         <w:numPr>
           <w:ilvl w:val="0"/>
           <w:numId w:val="1001"/>
         </w:numPr>
-      </w:pPr>
-      <w:r>
-        <w:rPr>
-          <w:b/>
-          <w:bCs/>
+        <w:pStyle w:val="Compact"/>
+      </w:pPr>
+      <w:r>
+        <w:rPr>
+          <w:bCs/>
+          <w:b/>
         </w:rPr>
         <w:t xml:space="preserve">30 muros de contención:</w:t>
       </w:r>
@@ -240,16 +254,16 @@
     </w:p>
     <w:p>
       <w:pPr>
-        <w:pStyle w:val="Compact"/>
         <w:numPr>
           <w:ilvl w:val="0"/>
           <w:numId w:val="1001"/>
         </w:numPr>
-      </w:pPr>
-      <w:r>
-        <w:rPr>
-          <w:b/>
-          <w:bCs/>
+        <w:pStyle w:val="Compact"/>
+      </w:pPr>
+      <w:r>
+        <w:rPr>
+          <w:bCs/>
+          <w:b/>
         </w:rPr>
         <w:t xml:space="preserve">3,450,000 m³ excavación:</w:t>
       </w:r>
@@ -262,16 +276,16 @@
     </w:p>
     <w:p>
       <w:pPr>
-        <w:pStyle w:val="Compact"/>
         <w:numPr>
           <w:ilvl w:val="0"/>
           <w:numId w:val="1001"/>
         </w:numPr>
-      </w:pPr>
-      <w:r>
-        <w:rPr>
-          <w:b/>
-          <w:bCs/>
+        <w:pStyle w:val="Compact"/>
+      </w:pPr>
+      <w:r>
+        <w:rPr>
+          <w:bCs/>
+          <w:b/>
         </w:rPr>
         <w:t xml:space="preserve">1,720,000 m³ relleno:</w:t>
       </w:r>
@@ -282,8 +296,8 @@
         <w:t xml:space="preserve">Compactación de terraplenes</w:t>
       </w:r>
     </w:p>
-    <w:bookmarkEnd w:id="11"/>
-    <w:bookmarkStart w:id="12" w:name="hitos-críticos"/>
+    <w:bookmarkEnd w:id="22"/>
+    <w:bookmarkStart w:id="23" w:name="hitos-críticos"/>
     <w:p>
       <w:pPr>
         <w:pStyle w:val="Heading3"/>
@@ -297,6 +311,7 @@
         <w:tblStyle w:val="Table"/>
         <w:tblW w:type="auto" w:w="0"/>
         <w:tblLook w:firstRow="1" w:lastRow="0" w:firstColumn="0" w:lastColumn="0" w:noHBand="0" w:noVBand="0" w:val="0020"/>
+        <w:jc w:val="start"/>
       </w:tblPr>
       <w:tblGrid>
         <w:gridCol w:w="2640"/>
@@ -305,7 +320,7 @@
       </w:tblGrid>
       <w:tr>
         <w:trPr>
-          <w:tblHeader w:val="on"/>
+          <w:tblHeader w:val="true"/>
         </w:trPr>
         <w:tc>
           <w:tcPr/>
@@ -353,7 +368,7 @@
               <w:jc w:val="left"/>
             </w:pPr>
             <w:r>
-              <w:t xml:space="preserve">Diseño Conceptual</w:t>
+              <w:t xml:space="preserve">Diseno Conceptual</w:t>
             </w:r>
           </w:p>
         </w:tc>
@@ -542,18 +557,18 @@
         </w:pict>
       </w:r>
     </w:p>
-    <w:bookmarkEnd w:id="12"/>
-    <w:bookmarkEnd w:id="13"/>
-    <w:bookmarkStart w:id="19" w:name="X16ad1bf8fd3c72f4f9f37ec0fde01a31e7fb65a"/>
+    <w:bookmarkEnd w:id="23"/>
+    <w:bookmarkEnd w:id="24"/>
+    <w:bookmarkStart w:id="30" w:name="X803e86927c714bbbb99cb452fc37c99f7ada6f4"/>
     <w:p>
       <w:pPr>
         <w:pStyle w:val="Heading2"/>
       </w:pPr>
       <w:r>
-        <w:t xml:space="preserve">🔍 CRITERIOS DE DISEÑO Y JUSTIFICACIONES TÉCNICAS</w:t>
-      </w:r>
-    </w:p>
-    <w:bookmarkStart w:id="14" w:name="por-qué-526.133-km-de-corredor"/>
+        <w:t xml:space="preserve">🔍 CRITERIOS DE DISENO Y JUSTIFICACIONES TÉCNICAS</w:t>
+      </w:r>
+    </w:p>
+    <w:bookmarkStart w:id="25" w:name="por-qué-526.133-km-de-corredor"/>
     <w:p>
       <w:pPr>
         <w:pStyle w:val="Heading3"/>
@@ -568,8 +583,8 @@
       </w:pPr>
       <w:r>
         <w:rPr>
-          <w:b/>
-          <w:bCs/>
+          <w:bCs/>
+          <w:b/>
         </w:rPr>
         <w:t xml:space="preserve">Justificación Técnica:</w:t>
       </w:r>
@@ -584,8 +599,8 @@
       </w:r>
       <w:r>
         <w:rPr>
-          <w:b/>
-          <w:bCs/>
+          <w:bCs/>
+          <w:b/>
         </w:rPr>
         <w:t xml:space="preserve">Distancia real:</w:t>
       </w:r>
@@ -606,8 +621,8 @@
       </w:r>
       <w:r>
         <w:rPr>
-          <w:b/>
-          <w:bCs/>
+          <w:bCs/>
+          <w:b/>
         </w:rPr>
         <w:t xml:space="preserve">Trocha estándar:</w:t>
       </w:r>
@@ -628,8 +643,8 @@
       </w:r>
       <w:r>
         <w:rPr>
-          <w:b/>
-          <w:bCs/>
+          <w:bCs/>
+          <w:b/>
         </w:rPr>
         <w:t xml:space="preserve">2 vías principales:</w:t>
       </w:r>
@@ -650,8 +665,8 @@
       </w:r>
       <w:r>
         <w:rPr>
-          <w:b/>
-          <w:bCs/>
+          <w:bCs/>
+          <w:b/>
         </w:rPr>
         <w:t xml:space="preserve">Vías de servicio:</w:t>
       </w:r>
@@ -672,8 +687,8 @@
       </w:r>
       <w:r>
         <w:rPr>
-          <w:b/>
-          <w:bCs/>
+          <w:bCs/>
+          <w:b/>
         </w:rPr>
         <w:t xml:space="preserve">Criterio:</w:t>
       </w:r>
@@ -684,8 +699,8 @@
         <w:t xml:space="preserve">Longitud total del corredor ferroviario</w:t>
       </w:r>
     </w:p>
-    <w:bookmarkEnd w:id="14"/>
-    <w:bookmarkStart w:id="15" w:name="por-qué-25-puentes-5-viaductos"/>
+    <w:bookmarkEnd w:id="25"/>
+    <w:bookmarkStart w:id="26" w:name="por-qué-25-puentes-5-viaductos"/>
     <w:p>
       <w:pPr>
         <w:pStyle w:val="Heading3"/>
@@ -700,8 +715,8 @@
       </w:pPr>
       <w:r>
         <w:rPr>
-          <w:b/>
-          <w:bCs/>
+          <w:bCs/>
+          <w:b/>
         </w:rPr>
         <w:t xml:space="preserve">Justificación de Obras de Arte:</w:t>
       </w:r>
@@ -728,8 +743,8 @@
       </w:r>
       <w:r>
         <w:rPr>
-          <w:b/>
-          <w:bCs/>
+          <w:bCs/>
+          <w:b/>
         </w:rPr>
         <w:t xml:space="preserve">Puentes</w:t>
       </w:r>
@@ -750,8 +765,8 @@
       </w:r>
       <w:r>
         <w:rPr>
-          <w:b/>
-          <w:bCs/>
+          <w:bCs/>
+          <w:b/>
         </w:rPr>
         <w:t xml:space="preserve">Viaductos</w:t>
       </w:r>
@@ -772,8 +787,8 @@
       </w:r>
       <w:r>
         <w:rPr>
-          <w:b/>
-          <w:bCs/>
+          <w:bCs/>
+          <w:b/>
         </w:rPr>
         <w:t xml:space="preserve">Alcantarillas</w:t>
       </w:r>
@@ -794,8 +809,8 @@
       </w:r>
       <w:r>
         <w:rPr>
-          <w:b/>
-          <w:bCs/>
+          <w:bCs/>
+          <w:b/>
         </w:rPr>
         <w:t xml:space="preserve">Muros de contención</w:t>
       </w:r>
@@ -812,8 +827,8 @@
       </w:pPr>
       <w:r>
         <w:rPr>
-          <w:b/>
-          <w:bCs/>
+          <w:bCs/>
+          <w:b/>
         </w:rPr>
         <w:t xml:space="preserve">Criterios de selección:</w:t>
       </w:r>
@@ -828,8 +843,8 @@
       </w:r>
       <w:r>
         <w:rPr>
-          <w:b/>
-          <w:bCs/>
+          <w:bCs/>
+          <w:b/>
         </w:rPr>
         <w:t xml:space="preserve">Análisis hidráulico:</w:t>
       </w:r>
@@ -850,8 +865,8 @@
       </w:r>
       <w:r>
         <w:rPr>
-          <w:b/>
-          <w:bCs/>
+          <w:bCs/>
+          <w:b/>
         </w:rPr>
         <w:t xml:space="preserve">Topografía:</w:t>
       </w:r>
@@ -872,8 +887,8 @@
       </w:r>
       <w:r>
         <w:rPr>
-          <w:b/>
-          <w:bCs/>
+          <w:bCs/>
+          <w:b/>
         </w:rPr>
         <w:t xml:space="preserve">Geotecnia:</w:t>
       </w:r>
@@ -894,8 +909,8 @@
       </w:r>
       <w:r>
         <w:rPr>
-          <w:b/>
-          <w:bCs/>
+          <w:bCs/>
+          <w:b/>
         </w:rPr>
         <w:t xml:space="preserve">Drenaje:</w:t>
       </w:r>
@@ -906,8 +921,8 @@
         <w:t xml:space="preserve">Alcantarillas cada 3.5 km para drenaje transversal</w:t>
       </w:r>
     </w:p>
-    <w:bookmarkEnd w:id="15"/>
-    <w:bookmarkStart w:id="16" w:name="por-qué-3450000-m³-de-excavación"/>
+    <w:bookmarkEnd w:id="26"/>
+    <w:bookmarkStart w:id="27" w:name="por-qué-3450000-m³-de-excavación"/>
     <w:p>
       <w:pPr>
         <w:pStyle w:val="Heading3"/>
@@ -922,8 +937,8 @@
       </w:pPr>
       <w:r>
         <w:rPr>
-          <w:b/>
-          <w:bCs/>
+          <w:bCs/>
+          <w:b/>
         </w:rPr>
         <w:t xml:space="preserve">Justificación de Movimiento de Tierras:</w:t>
       </w:r>
@@ -938,8 +953,8 @@
       </w:r>
       <w:r>
         <w:rPr>
-          <w:b/>
-          <w:bCs/>
+          <w:bCs/>
+          <w:b/>
         </w:rPr>
         <w:t xml:space="preserve">Análisis de perfiles:</w:t>
       </w:r>
@@ -960,8 +975,8 @@
       </w:r>
       <w:r>
         <w:rPr>
-          <w:b/>
-          <w:bCs/>
+          <w:bCs/>
+          <w:b/>
         </w:rPr>
         <w:t xml:space="preserve">Explanación ferroviaria:</w:t>
       </w:r>
@@ -982,8 +997,8 @@
       </w:r>
       <w:r>
         <w:rPr>
-          <w:b/>
-          <w:bCs/>
+          <w:bCs/>
+          <w:b/>
         </w:rPr>
         <w:t xml:space="preserve">Pendientes:</w:t>
       </w:r>
@@ -1004,8 +1019,8 @@
       </w:r>
       <w:r>
         <w:rPr>
-          <w:b/>
-          <w:bCs/>
+          <w:bCs/>
+          <w:b/>
         </w:rPr>
         <w:t xml:space="preserve">Curvas:</w:t>
       </w:r>
@@ -1026,8 +1041,8 @@
       </w:r>
       <w:r>
         <w:rPr>
-          <w:b/>
-          <w:bCs/>
+          <w:bCs/>
+          <w:b/>
         </w:rPr>
         <w:t xml:space="preserve">Cálculo:</w:t>
       </w:r>
@@ -1038,8 +1053,8 @@
         <w:t xml:space="preserve">Volumen calculado por perfiles longitudinales</w:t>
       </w:r>
     </w:p>
-    <w:bookmarkEnd w:id="16"/>
-    <w:bookmarkStart w:id="17" w:name="por-qué-edificaciones-específicas"/>
+    <w:bookmarkEnd w:id="27"/>
+    <w:bookmarkStart w:id="28" w:name="por-qué-edificaciones-específicas"/>
     <w:p>
       <w:pPr>
         <w:pStyle w:val="Heading3"/>
@@ -1054,8 +1069,8 @@
       </w:pPr>
       <w:r>
         <w:rPr>
-          <w:b/>
-          <w:bCs/>
+          <w:bCs/>
+          <w:b/>
         </w:rPr>
         <w:t xml:space="preserve">Justificación de Edificaciones:</w:t>
       </w:r>
@@ -1082,8 +1097,8 @@
       </w:r>
       <w:r>
         <w:rPr>
-          <w:b/>
-          <w:bCs/>
+          <w:bCs/>
+          <w:b/>
         </w:rPr>
         <w:t xml:space="preserve">CCO La Dorada</w:t>
       </w:r>
@@ -1104,8 +1119,8 @@
       </w:r>
       <w:r>
         <w:rPr>
-          <w:b/>
-          <w:bCs/>
+          <w:bCs/>
+          <w:b/>
         </w:rPr>
         <w:t xml:space="preserve">5 Estaciones ENCE</w:t>
       </w:r>
@@ -1126,8 +1141,8 @@
       </w:r>
       <w:r>
         <w:rPr>
-          <w:b/>
-          <w:bCs/>
+          <w:bCs/>
+          <w:b/>
         </w:rPr>
         <w:t xml:space="preserve">Talleres</w:t>
       </w:r>
@@ -1148,8 +1163,8 @@
       </w:r>
       <w:r>
         <w:rPr>
-          <w:b/>
-          <w:bCs/>
+          <w:bCs/>
+          <w:b/>
         </w:rPr>
         <w:t xml:space="preserve">Oficinas</w:t>
       </w:r>
@@ -1160,8 +1175,8 @@
         <w:t xml:space="preserve">| 800 m² | Personal técnico y administrativo |</w:t>
       </w:r>
     </w:p>
-    <w:bookmarkEnd w:id="17"/>
-    <w:bookmarkStart w:id="18" w:name="por-qué-estándares-nsr-10"/>
+    <w:bookmarkEnd w:id="28"/>
+    <w:bookmarkStart w:id="29" w:name="por-qué-estándares-nsr-10"/>
     <w:p>
       <w:pPr>
         <w:pStyle w:val="Heading3"/>
@@ -1176,8 +1191,8 @@
       </w:pPr>
       <w:r>
         <w:rPr>
-          <w:b/>
-          <w:bCs/>
+          <w:bCs/>
+          <w:b/>
         </w:rPr>
         <w:t xml:space="preserve">Justificación Normativa:</w:t>
       </w:r>
@@ -1192,8 +1207,8 @@
       </w:r>
       <w:r>
         <w:rPr>
-          <w:b/>
-          <w:bCs/>
+          <w:bCs/>
+          <w:b/>
         </w:rPr>
         <w:t xml:space="preserve">Sismo resistencia:</w:t>
       </w:r>
@@ -1214,8 +1229,8 @@
       </w:r>
       <w:r>
         <w:rPr>
-          <w:b/>
-          <w:bCs/>
+          <w:bCs/>
+          <w:b/>
         </w:rPr>
         <w:t xml:space="preserve">Vida útil:</w:t>
       </w:r>
@@ -1223,7 +1238,7 @@
         <w:t xml:space="preserve"> </w:t>
       </w:r>
       <w:r>
-        <w:t xml:space="preserve">50 años mínimo según especificaciones</w:t>
+        <w:t xml:space="preserve">50 anos mínimo según especificaciones</w:t>
       </w:r>
       <w:r>
         <w:t xml:space="preserve"> </w:t>
@@ -1236,8 +1251,8 @@
       </w:r>
       <w:r>
         <w:rPr>
-          <w:b/>
-          <w:bCs/>
+          <w:bCs/>
+          <w:b/>
         </w:rPr>
         <w:t xml:space="preserve">Seguridad:</w:t>
       </w:r>
@@ -1258,8 +1273,8 @@
       </w:r>
       <w:r>
         <w:rPr>
-          <w:b/>
-          <w:bCs/>
+          <w:bCs/>
+          <w:b/>
         </w:rPr>
         <w:t xml:space="preserve">Durabilidad:</w:t>
       </w:r>
@@ -1280,8 +1295,8 @@
       </w:r>
       <w:r>
         <w:rPr>
-          <w:b/>
-          <w:bCs/>
+          <w:bCs/>
+          <w:b/>
         </w:rPr>
         <w:t xml:space="preserve">Mantenimiento:</w:t>
       </w:r>
@@ -1289,7 +1304,7 @@
         <w:t xml:space="preserve"> </w:t>
       </w:r>
       <w:r>
-        <w:t xml:space="preserve">Diseño para acceso y reparación</w:t>
+        <w:t xml:space="preserve">Diseno para acceso y reparación</w:t>
       </w:r>
     </w:p>
     <w:p>
@@ -1299,9 +1314,9 @@
         </w:pict>
       </w:r>
     </w:p>
-    <w:bookmarkEnd w:id="18"/>
-    <w:bookmarkEnd w:id="19"/>
-    <w:bookmarkStart w:id="23" w:name="función-y-propósito-de-la-especialidad"/>
+    <w:bookmarkEnd w:id="29"/>
+    <w:bookmarkEnd w:id="30"/>
+    <w:bookmarkStart w:id="34" w:name="función-y-propósito-de-la-especialidad"/>
     <w:p>
       <w:pPr>
         <w:pStyle w:val="Heading2"/>
@@ -1310,7 +1325,7 @@
         <w:t xml:space="preserve">🎯 FUNCIÓN Y PROPÓSITO DE LA ESPECIALIDAD</w:t>
       </w:r>
     </w:p>
-    <w:bookmarkStart w:id="20" w:name="qué-hace-esta-especialidad"/>
+    <w:bookmarkStart w:id="31" w:name="qué-hace-esta-especialidad"/>
     <w:p>
       <w:pPr>
         <w:pStyle w:val="Heading3"/>
@@ -1331,8 +1346,8 @@
       </w:r>
       <w:r>
         <w:rPr>
-          <w:b/>
-          <w:bCs/>
+          <w:bCs/>
+          <w:b/>
         </w:rPr>
         <w:t xml:space="preserve">infraestructura física</w:t>
       </w:r>
@@ -1353,8 +1368,8 @@
       </w:r>
       <w:r>
         <w:rPr>
-          <w:b/>
-          <w:bCs/>
+          <w:bCs/>
+          <w:b/>
         </w:rPr>
         <w:t xml:space="preserve">Corredor ferroviario:</w:t>
       </w:r>
@@ -1375,8 +1390,8 @@
       </w:r>
       <w:r>
         <w:rPr>
-          <w:b/>
-          <w:bCs/>
+          <w:bCs/>
+          <w:b/>
         </w:rPr>
         <w:t xml:space="preserve">Obras de arte:</w:t>
       </w:r>
@@ -1397,8 +1412,8 @@
       </w:r>
       <w:r>
         <w:rPr>
-          <w:b/>
-          <w:bCs/>
+          <w:bCs/>
+          <w:b/>
         </w:rPr>
         <w:t xml:space="preserve">Edificaciones:</w:t>
       </w:r>
@@ -1419,8 +1434,8 @@
       </w:r>
       <w:r>
         <w:rPr>
-          <w:b/>
-          <w:bCs/>
+          <w:bCs/>
+          <w:b/>
         </w:rPr>
         <w:t xml:space="preserve">Sistemas civiles:</w:t>
       </w:r>
@@ -1428,11 +1443,11 @@
         <w:t xml:space="preserve"> </w:t>
       </w:r>
       <w:r>
-        <w:t xml:space="preserve">Drenaje, iluminación, señalización</w:t>
-      </w:r>
-    </w:p>
-    <w:bookmarkEnd w:id="20"/>
-    <w:bookmarkStart w:id="21" w:name="por-qué-la-necesitamos"/>
+        <w:t xml:space="preserve">Drenaje, iluminación, senalización</w:t>
+      </w:r>
+    </w:p>
+    <w:bookmarkEnd w:id="31"/>
+    <w:bookmarkStart w:id="32" w:name="por-qué-la-necesitamos"/>
     <w:p>
       <w:pPr>
         <w:pStyle w:val="Heading3"/>
@@ -1443,16 +1458,16 @@
     </w:p>
     <w:p>
       <w:pPr>
-        <w:pStyle w:val="Compact"/>
         <w:numPr>
           <w:ilvl w:val="0"/>
           <w:numId w:val="1002"/>
         </w:numPr>
-      </w:pPr>
-      <w:r>
-        <w:rPr>
-          <w:b/>
-          <w:bCs/>
+        <w:pStyle w:val="Compact"/>
+      </w:pPr>
+      <w:r>
+        <w:rPr>
+          <w:bCs/>
+          <w:b/>
         </w:rPr>
         <w:t xml:space="preserve">Base física:</w:t>
       </w:r>
@@ -1465,16 +1480,16 @@
     </w:p>
     <w:p>
       <w:pPr>
-        <w:pStyle w:val="Compact"/>
         <w:numPr>
           <w:ilvl w:val="0"/>
           <w:numId w:val="1002"/>
         </w:numPr>
-      </w:pPr>
-      <w:r>
-        <w:rPr>
-          <w:b/>
-          <w:bCs/>
+        <w:pStyle w:val="Compact"/>
+      </w:pPr>
+      <w:r>
+        <w:rPr>
+          <w:bCs/>
+          <w:b/>
         </w:rPr>
         <w:t xml:space="preserve">Seguridad:</w:t>
       </w:r>
@@ -1487,16 +1502,16 @@
     </w:p>
     <w:p>
       <w:pPr>
-        <w:pStyle w:val="Compact"/>
         <w:numPr>
           <w:ilvl w:val="0"/>
           <w:numId w:val="1002"/>
         </w:numPr>
-      </w:pPr>
-      <w:r>
-        <w:rPr>
-          <w:b/>
-          <w:bCs/>
+        <w:pStyle w:val="Compact"/>
+      </w:pPr>
+      <w:r>
+        <w:rPr>
+          <w:bCs/>
+          <w:b/>
         </w:rPr>
         <w:t xml:space="preserve">Capacidad:</w:t>
       </w:r>
@@ -1509,16 +1524,16 @@
     </w:p>
     <w:p>
       <w:pPr>
-        <w:pStyle w:val="Compact"/>
         <w:numPr>
           <w:ilvl w:val="0"/>
           <w:numId w:val="1002"/>
         </w:numPr>
-      </w:pPr>
-      <w:r>
-        <w:rPr>
-          <w:b/>
-          <w:bCs/>
+        <w:pStyle w:val="Compact"/>
+      </w:pPr>
+      <w:r>
+        <w:rPr>
+          <w:bCs/>
+          <w:b/>
         </w:rPr>
         <w:t xml:space="preserve">Mantenimiento:</w:t>
       </w:r>
@@ -1531,16 +1546,16 @@
     </w:p>
     <w:p>
       <w:pPr>
-        <w:pStyle w:val="Compact"/>
         <w:numPr>
           <w:ilvl w:val="0"/>
           <w:numId w:val="1002"/>
         </w:numPr>
-      </w:pPr>
-      <w:r>
-        <w:rPr>
-          <w:b/>
-          <w:bCs/>
+        <w:pStyle w:val="Compact"/>
+      </w:pPr>
+      <w:r>
+        <w:rPr>
+          <w:bCs/>
+          <w:b/>
         </w:rPr>
         <w:t xml:space="preserve">Sostenibilidad:</w:t>
       </w:r>
@@ -1551,8 +1566,8 @@
         <w:t xml:space="preserve">Criterios ambientales y eficiencia energética</w:t>
       </w:r>
     </w:p>
-    <w:bookmarkEnd w:id="21"/>
-    <w:bookmarkStart w:id="22" w:name="cómo-se-integra-con-otras-especialidades"/>
+    <w:bookmarkEnd w:id="32"/>
+    <w:bookmarkStart w:id="33" w:name="cómo-se-integra-con-otras-especialidades"/>
     <w:p>
       <w:pPr>
         <w:pStyle w:val="Heading3"/>
@@ -1615,9 +1630,9 @@
         </w:pict>
       </w:r>
     </w:p>
-    <w:bookmarkEnd w:id="22"/>
-    <w:bookmarkEnd w:id="23"/>
-    <w:bookmarkStart w:id="27" w:name="componentes-principales"/>
+    <w:bookmarkEnd w:id="33"/>
+    <w:bookmarkEnd w:id="34"/>
+    <w:bookmarkStart w:id="38" w:name="componentes-principales"/>
     <w:p>
       <w:pPr>
         <w:pStyle w:val="Heading2"/>
@@ -1626,7 +1641,7 @@
         <w:t xml:space="preserve">🏗️ COMPONENTES PRINCIPALES</w:t>
       </w:r>
     </w:p>
-    <w:bookmarkStart w:id="24" w:name="corredor-ferroviario-principal"/>
+    <w:bookmarkStart w:id="35" w:name="corredor-ferroviario-principal"/>
     <w:p>
       <w:pPr>
         <w:pStyle w:val="Heading3"/>
@@ -1641,8 +1656,8 @@
       </w:pPr>
       <w:r>
         <w:rPr>
-          <w:b/>
-          <w:bCs/>
+          <w:bCs/>
+          <w:b/>
         </w:rPr>
         <w:t xml:space="preserve">Propósito:</w:t>
       </w:r>
@@ -1659,8 +1674,8 @@
       </w:pPr>
       <w:r>
         <w:rPr>
-          <w:b/>
-          <w:bCs/>
+          <w:bCs/>
+          <w:b/>
         </w:rPr>
         <w:t xml:space="preserve">Especificaciones técnicas:</w:t>
       </w:r>
@@ -1687,8 +1702,8 @@
       </w:r>
       <w:r>
         <w:rPr>
-          <w:b/>
-          <w:bCs/>
+          <w:bCs/>
+          <w:b/>
         </w:rPr>
         <w:t xml:space="preserve">Longitud</w:t>
       </w:r>
@@ -1709,8 +1724,8 @@
       </w:r>
       <w:r>
         <w:rPr>
-          <w:b/>
-          <w:bCs/>
+          <w:bCs/>
+          <w:b/>
         </w:rPr>
         <w:t xml:space="preserve">Trocha</w:t>
       </w:r>
@@ -1731,8 +1746,8 @@
       </w:r>
       <w:r>
         <w:rPr>
-          <w:b/>
-          <w:bCs/>
+          <w:bCs/>
+          <w:b/>
         </w:rPr>
         <w:t xml:space="preserve">Vías principales</w:t>
       </w:r>
@@ -1753,8 +1768,8 @@
       </w:r>
       <w:r>
         <w:rPr>
-          <w:b/>
-          <w:bCs/>
+          <w:bCs/>
+          <w:b/>
         </w:rPr>
         <w:t xml:space="preserve">Ancho explanación</w:t>
       </w:r>
@@ -1775,8 +1790,8 @@
       </w:r>
       <w:r>
         <w:rPr>
-          <w:b/>
-          <w:bCs/>
+          <w:bCs/>
+          <w:b/>
         </w:rPr>
         <w:t xml:space="preserve">Pendiente máxima</w:t>
       </w:r>
@@ -1787,8 +1802,8 @@
         <w:t xml:space="preserve">| 2% | Según especificaciones ferroviarias |</w:t>
       </w:r>
     </w:p>
-    <w:bookmarkEnd w:id="24"/>
-    <w:bookmarkStart w:id="25" w:name="obras-de-arte"/>
+    <w:bookmarkEnd w:id="35"/>
+    <w:bookmarkStart w:id="36" w:name="obras-de-arte"/>
     <w:p>
       <w:pPr>
         <w:pStyle w:val="Heading3"/>
@@ -1803,8 +1818,8 @@
       </w:pPr>
       <w:r>
         <w:rPr>
-          <w:b/>
-          <w:bCs/>
+          <w:bCs/>
+          <w:b/>
         </w:rPr>
         <w:t xml:space="preserve">Propósito:</w:t>
       </w:r>
@@ -1821,8 +1836,8 @@
       </w:pPr>
       <w:r>
         <w:rPr>
-          <w:b/>
-          <w:bCs/>
+          <w:bCs/>
+          <w:b/>
         </w:rPr>
         <w:t xml:space="preserve">Componentes instalados:</w:t>
       </w:r>
@@ -1849,8 +1864,8 @@
       </w:r>
       <w:r>
         <w:rPr>
-          <w:b/>
-          <w:bCs/>
+          <w:bCs/>
+          <w:b/>
         </w:rPr>
         <w:t xml:space="preserve">Puentes</w:t>
       </w:r>
@@ -1858,7 +1873,7 @@
         <w:t xml:space="preserve"> </w:t>
       </w:r>
       <w:r>
-        <w:t xml:space="preserve">| 25 unidades | Cruce de ríos principales | ⏳ En diseño |</w:t>
+        <w:t xml:space="preserve">| 25 unidades | Cruce de ríos principales | ⏳ En diseno |</w:t>
       </w:r>
       <w:r>
         <w:t xml:space="preserve"> </w:t>
@@ -1871,8 +1886,8 @@
       </w:r>
       <w:r>
         <w:rPr>
-          <w:b/>
-          <w:bCs/>
+          <w:bCs/>
+          <w:b/>
         </w:rPr>
         <w:t xml:space="preserve">Viaductos</w:t>
       </w:r>
@@ -1880,7 +1895,7 @@
         <w:t xml:space="preserve"> </w:t>
       </w:r>
       <w:r>
-        <w:t xml:space="preserve">| 5 unidades | Valles profundos | ⏳ En diseño |</w:t>
+        <w:t xml:space="preserve">| 5 unidades | Valles profundos | ⏳ En diseno |</w:t>
       </w:r>
       <w:r>
         <w:t xml:space="preserve"> </w:t>
@@ -1893,8 +1908,8 @@
       </w:r>
       <w:r>
         <w:rPr>
-          <w:b/>
-          <w:bCs/>
+          <w:bCs/>
+          <w:b/>
         </w:rPr>
         <w:t xml:space="preserve">Alcantarillas</w:t>
       </w:r>
@@ -1902,7 +1917,7 @@
         <w:t xml:space="preserve"> </w:t>
       </w:r>
       <w:r>
-        <w:t xml:space="preserve">| 150 unidades | Cada 3.5 km promedio | ⏳ En diseño |</w:t>
+        <w:t xml:space="preserve">| 150 unidades | Cada 3.5 km promedio | ⏳ En diseno |</w:t>
       </w:r>
       <w:r>
         <w:t xml:space="preserve"> </w:t>
@@ -1915,8 +1930,8 @@
       </w:r>
       <w:r>
         <w:rPr>
-          <w:b/>
-          <w:bCs/>
+          <w:bCs/>
+          <w:b/>
         </w:rPr>
         <w:t xml:space="preserve">Muros de contención</w:t>
       </w:r>
@@ -1924,11 +1939,11 @@
         <w:t xml:space="preserve"> </w:t>
       </w:r>
       <w:r>
-        <w:t xml:space="preserve">| 30 unidades | Taludes críticos | ⏳ En diseño |</w:t>
-      </w:r>
-    </w:p>
-    <w:bookmarkEnd w:id="25"/>
-    <w:bookmarkStart w:id="26" w:name="edificaciones"/>
+        <w:t xml:space="preserve">| 30 unidades | Taludes críticos | ⏳ En diseno |</w:t>
+      </w:r>
+    </w:p>
+    <w:bookmarkEnd w:id="36"/>
+    <w:bookmarkStart w:id="37" w:name="edificaciones"/>
     <w:p>
       <w:pPr>
         <w:pStyle w:val="Heading3"/>
@@ -1943,8 +1958,8 @@
       </w:pPr>
       <w:r>
         <w:rPr>
-          <w:b/>
-          <w:bCs/>
+          <w:bCs/>
+          <w:b/>
         </w:rPr>
         <w:t xml:space="preserve">Propósito:</w:t>
       </w:r>
@@ -1961,8 +1976,8 @@
       </w:pPr>
       <w:r>
         <w:rPr>
-          <w:b/>
-          <w:bCs/>
+          <w:bCs/>
+          <w:b/>
         </w:rPr>
         <w:t xml:space="preserve">Componentes instalados:</w:t>
       </w:r>
@@ -1989,8 +2004,8 @@
       </w:r>
       <w:r>
         <w:rPr>
-          <w:b/>
-          <w:bCs/>
+          <w:bCs/>
+          <w:b/>
         </w:rPr>
         <w:t xml:space="preserve">CCO La Dorada</w:t>
       </w:r>
@@ -2011,8 +2026,8 @@
       </w:r>
       <w:r>
         <w:rPr>
-          <w:b/>
-          <w:bCs/>
+          <w:bCs/>
+          <w:b/>
         </w:rPr>
         <w:t xml:space="preserve">Estaciones ENCE</w:t>
       </w:r>
@@ -2033,8 +2048,8 @@
       </w:r>
       <w:r>
         <w:rPr>
-          <w:b/>
-          <w:bCs/>
+          <w:bCs/>
+          <w:b/>
         </w:rPr>
         <w:t xml:space="preserve">Talleres</w:t>
       </w:r>
@@ -2055,8 +2070,8 @@
       </w:r>
       <w:r>
         <w:rPr>
-          <w:b/>
-          <w:bCs/>
+          <w:bCs/>
+          <w:b/>
         </w:rPr>
         <w:t xml:space="preserve">Oficinas</w:t>
       </w:r>
@@ -2074,9 +2089,9 @@
         </w:pict>
       </w:r>
     </w:p>
-    <w:bookmarkEnd w:id="26"/>
-    <w:bookmarkEnd w:id="27"/>
-    <w:bookmarkStart w:id="30" w:name="especificaciones-técnicas-clave"/>
+    <w:bookmarkEnd w:id="37"/>
+    <w:bookmarkEnd w:id="38"/>
+    <w:bookmarkStart w:id="41" w:name="especificaciones-técnicas-clave"/>
     <w:p>
       <w:pPr>
         <w:pStyle w:val="Heading2"/>
@@ -2085,7 +2100,7 @@
         <w:t xml:space="preserve">📐 ESPECIFICACIONES TÉCNICAS CLAVE</w:t>
       </w:r>
     </w:p>
-    <w:bookmarkStart w:id="28" w:name="tabla-consolidada-de-especificaciones"/>
+    <w:bookmarkStart w:id="39" w:name="tabla-consolidada-de-especificaciones"/>
     <w:p>
       <w:pPr>
         <w:pStyle w:val="Heading3"/>
@@ -2099,6 +2114,7 @@
         <w:tblStyle w:val="Table"/>
         <w:tblW w:type="auto" w:w="0"/>
         <w:tblLook w:firstRow="1" w:lastRow="0" w:firstColumn="0" w:lastColumn="0" w:noHBand="0" w:noVBand="0" w:val="0020"/>
+        <w:jc w:val="start"/>
       </w:tblPr>
       <w:tblGrid>
         <w:gridCol w:w="2640"/>
@@ -2107,7 +2123,7 @@
       </w:tblGrid>
       <w:tr>
         <w:trPr>
-          <w:tblHeader w:val="on"/>
+          <w:tblHeader w:val="true"/>
         </w:trPr>
         <w:tc>
           <w:tcPr/>
@@ -2319,7 +2335,7 @@
               <w:jc w:val="left"/>
             </w:pPr>
             <w:r>
-              <w:t xml:space="preserve">50 años</w:t>
+              <w:t xml:space="preserve">50 anos</w:t>
             </w:r>
           </w:p>
         </w:tc>
@@ -2375,8 +2391,8 @@
         </w:tc>
       </w:tr>
     </w:tbl>
-    <w:bookmarkEnd w:id="28"/>
-    <w:bookmarkStart w:id="29" w:name="criterios-de-aceptación"/>
+    <w:bookmarkEnd w:id="39"/>
+    <w:bookmarkStart w:id="40" w:name="criterios-de-aceptación"/>
     <w:p>
       <w:pPr>
         <w:pStyle w:val="Heading3"/>
@@ -2387,11 +2403,11 @@
     </w:p>
     <w:p>
       <w:pPr>
-        <w:pStyle w:val="Compact"/>
         <w:numPr>
           <w:ilvl w:val="0"/>
           <w:numId w:val="1003"/>
         </w:numPr>
+        <w:pStyle w:val="Compact"/>
       </w:pPr>
       <w:r>
         <w:t xml:space="preserve">✅ Corredor 526.133 km con trocha estándar</w:t>
@@ -2399,11 +2415,11 @@
     </w:p>
     <w:p>
       <w:pPr>
-        <w:pStyle w:val="Compact"/>
         <w:numPr>
           <w:ilvl w:val="0"/>
           <w:numId w:val="1003"/>
         </w:numPr>
+        <w:pStyle w:val="Compact"/>
       </w:pPr>
       <w:r>
         <w:t xml:space="preserve">✅ 2 vías principales operativas</w:t>
@@ -2411,11 +2427,11 @@
     </w:p>
     <w:p>
       <w:pPr>
-        <w:pStyle w:val="Compact"/>
         <w:numPr>
           <w:ilvl w:val="0"/>
           <w:numId w:val="1003"/>
         </w:numPr>
+        <w:pStyle w:val="Compact"/>
       </w:pPr>
       <w:r>
         <w:t xml:space="preserve">✅ Obras de arte según especificaciones</w:t>
@@ -2423,11 +2439,11 @@
     </w:p>
     <w:p>
       <w:pPr>
-        <w:pStyle w:val="Compact"/>
         <w:numPr>
           <w:ilvl w:val="0"/>
           <w:numId w:val="1003"/>
         </w:numPr>
+        <w:pStyle w:val="Compact"/>
       </w:pPr>
       <w:r>
         <w:t xml:space="preserve">✅ Edificaciones sismo resistentes</w:t>
@@ -2435,11 +2451,11 @@
     </w:p>
     <w:p>
       <w:pPr>
-        <w:pStyle w:val="Compact"/>
         <w:numPr>
           <w:ilvl w:val="0"/>
           <w:numId w:val="1003"/>
         </w:numPr>
+        <w:pStyle w:val="Compact"/>
       </w:pPr>
       <w:r>
         <w:t xml:space="preserve">✅ Sistemas de drenaje funcionales</w:t>
@@ -2452,9 +2468,9 @@
         </w:pict>
       </w:r>
     </w:p>
-    <w:bookmarkEnd w:id="29"/>
-    <w:bookmarkEnd w:id="30"/>
-    <w:bookmarkStart w:id="33" w:name="ubicación-y-despliegue"/>
+    <w:bookmarkEnd w:id="40"/>
+    <w:bookmarkEnd w:id="41"/>
+    <w:bookmarkStart w:id="44" w:name="ubicación-y-despliegue"/>
     <w:p>
       <w:pPr>
         <w:pStyle w:val="Heading2"/>
@@ -2463,7 +2479,7 @@
         <w:t xml:space="preserve">📍 UBICACIÓN Y DESPLIEGUE</w:t>
       </w:r>
     </w:p>
-    <w:bookmarkStart w:id="31" w:name="mapa-de-despliegue"/>
+    <w:bookmarkStart w:id="42" w:name="mapa-de-despliegue"/>
     <w:p>
       <w:pPr>
         <w:pStyle w:val="Heading3"/>
@@ -2480,8 +2496,8 @@
         <w:t xml:space="preserve">El corredor ferroviario se extiende 526.133 km entre La Dorada (Caldas) y Chiriguaná (Cesar), atravesando 5 departamentos con diferentes características topográficas y geológicas.</w:t>
       </w:r>
     </w:p>
-    <w:bookmarkEnd w:id="31"/>
-    <w:bookmarkStart w:id="32" w:name="Xb6329a5623b2edb37388c6a22f7ab4090e72c58"/>
+    <w:bookmarkEnd w:id="42"/>
+    <w:bookmarkStart w:id="43" w:name="Xb6329a5623b2edb37388c6a22f7ab4090e72c58"/>
     <w:p>
       <w:pPr>
         <w:pStyle w:val="Heading3"/>
@@ -2495,6 +2511,7 @@
         <w:tblStyle w:val="Table"/>
         <w:tblW w:type="auto" w:w="0"/>
         <w:tblLook w:firstRow="1" w:lastRow="0" w:firstColumn="0" w:lastColumn="0" w:noHBand="0" w:noVBand="0" w:val="0020"/>
+        <w:jc w:val="start"/>
       </w:tblPr>
       <w:tblGrid>
         <w:gridCol w:w="1584"/>
@@ -2505,7 +2522,7 @@
       </w:tblGrid>
       <w:tr>
         <w:trPr>
-          <w:tblHeader w:val="on"/>
+          <w:tblHeader w:val="true"/>
         </w:trPr>
         <w:tc>
           <w:tcPr/>
@@ -2578,8 +2595,8 @@
             </w:pPr>
             <w:r>
               <w:rPr>
+                <w:bCs/>
                 <w:b/>
-                <w:bCs/>
               </w:rPr>
               <w:t xml:space="preserve">Caldas</w:t>
             </w:r>
@@ -2644,8 +2661,8 @@
             </w:pPr>
             <w:r>
               <w:rPr>
+                <w:bCs/>
                 <w:b/>
-                <w:bCs/>
               </w:rPr>
               <w:t xml:space="preserve">Antioquia</w:t>
             </w:r>
@@ -2710,8 +2727,8 @@
             </w:pPr>
             <w:r>
               <w:rPr>
+                <w:bCs/>
                 <w:b/>
-                <w:bCs/>
               </w:rPr>
               <w:t xml:space="preserve">Santander</w:t>
             </w:r>
@@ -2776,8 +2793,8 @@
             </w:pPr>
             <w:r>
               <w:rPr>
+                <w:bCs/>
                 <w:b/>
-                <w:bCs/>
               </w:rPr>
               <w:t xml:space="preserve">Norte de Santander</w:t>
             </w:r>
@@ -2842,8 +2859,8 @@
             </w:pPr>
             <w:r>
               <w:rPr>
+                <w:bCs/>
                 <w:b/>
-                <w:bCs/>
               </w:rPr>
               <w:t xml:space="preserve">Cesar</w:t>
             </w:r>
@@ -2906,9 +2923,9 @@
         </w:pict>
       </w:r>
     </w:p>
-    <w:bookmarkEnd w:id="32"/>
-    <w:bookmarkEnd w:id="33"/>
-    <w:bookmarkStart w:id="37" w:name="operación-y-mantenimiento"/>
+    <w:bookmarkEnd w:id="43"/>
+    <w:bookmarkEnd w:id="44"/>
+    <w:bookmarkStart w:id="48" w:name="operación-y-mantenimiento"/>
     <w:p>
       <w:pPr>
         <w:pStyle w:val="Heading2"/>
@@ -2917,7 +2934,7 @@
         <w:t xml:space="preserve">⚙️ OPERACIÓN Y MANTENIMIENTO</w:t>
       </w:r>
     </w:p>
-    <w:bookmarkStart w:id="34" w:name="operación-normal"/>
+    <w:bookmarkStart w:id="45" w:name="operación-normal"/>
     <w:p>
       <w:pPr>
         <w:pStyle w:val="Heading3"/>
@@ -2934,8 +2951,8 @@
         <w:t xml:space="preserve">La infraestructura civil opera 24/7 proporcionando base física para circulación de trenes, con monitoreo continuo de condiciones estructurales y geotécnicas.</w:t>
       </w:r>
     </w:p>
-    <w:bookmarkEnd w:id="34"/>
-    <w:bookmarkStart w:id="35" w:name="mantenimiento-preventivo"/>
+    <w:bookmarkEnd w:id="45"/>
+    <w:bookmarkStart w:id="46" w:name="mantenimiento-preventivo"/>
     <w:p>
       <w:pPr>
         <w:pStyle w:val="Heading3"/>
@@ -2946,16 +2963,16 @@
     </w:p>
     <w:p>
       <w:pPr>
-        <w:pStyle w:val="Compact"/>
         <w:numPr>
           <w:ilvl w:val="0"/>
           <w:numId w:val="1004"/>
         </w:numPr>
-      </w:pPr>
-      <w:r>
-        <w:rPr>
-          <w:b/>
-          <w:bCs/>
+        <w:pStyle w:val="Compact"/>
+      </w:pPr>
+      <w:r>
+        <w:rPr>
+          <w:bCs/>
+          <w:b/>
         </w:rPr>
         <w:t xml:space="preserve">Diario:</w:t>
       </w:r>
@@ -2968,16 +2985,16 @@
     </w:p>
     <w:p>
       <w:pPr>
-        <w:pStyle w:val="Compact"/>
         <w:numPr>
           <w:ilvl w:val="0"/>
           <w:numId w:val="1004"/>
         </w:numPr>
-      </w:pPr>
-      <w:r>
-        <w:rPr>
-          <w:b/>
-          <w:bCs/>
+        <w:pStyle w:val="Compact"/>
+      </w:pPr>
+      <w:r>
+        <w:rPr>
+          <w:bCs/>
+          <w:b/>
         </w:rPr>
         <w:t xml:space="preserve">Semanal:</w:t>
       </w:r>
@@ -2990,16 +3007,16 @@
     </w:p>
     <w:p>
       <w:pPr>
-        <w:pStyle w:val="Compact"/>
         <w:numPr>
           <w:ilvl w:val="0"/>
           <w:numId w:val="1004"/>
         </w:numPr>
-      </w:pPr>
-      <w:r>
-        <w:rPr>
-          <w:b/>
-          <w:bCs/>
+        <w:pStyle w:val="Compact"/>
+      </w:pPr>
+      <w:r>
+        <w:rPr>
+          <w:bCs/>
+          <w:b/>
         </w:rPr>
         <w:t xml:space="preserve">Mensual:</w:t>
       </w:r>
@@ -3012,16 +3029,16 @@
     </w:p>
     <w:p>
       <w:pPr>
-        <w:pStyle w:val="Compact"/>
         <w:numPr>
           <w:ilvl w:val="0"/>
           <w:numId w:val="1004"/>
         </w:numPr>
-      </w:pPr>
-      <w:r>
-        <w:rPr>
-          <w:b/>
-          <w:bCs/>
+        <w:pStyle w:val="Compact"/>
+      </w:pPr>
+      <w:r>
+        <w:rPr>
+          <w:bCs/>
+          <w:b/>
         </w:rPr>
         <w:t xml:space="preserve">Trimestral:</w:t>
       </w:r>
@@ -3034,16 +3051,16 @@
     </w:p>
     <w:p>
       <w:pPr>
-        <w:pStyle w:val="Compact"/>
         <w:numPr>
           <w:ilvl w:val="0"/>
           <w:numId w:val="1004"/>
         </w:numPr>
-      </w:pPr>
-      <w:r>
-        <w:rPr>
-          <w:b/>
-          <w:bCs/>
+        <w:pStyle w:val="Compact"/>
+      </w:pPr>
+      <w:r>
+        <w:rPr>
+          <w:bCs/>
+          <w:b/>
         </w:rPr>
         <w:t xml:space="preserve">Anual:</w:t>
       </w:r>
@@ -3054,8 +3071,8 @@
         <w:t xml:space="preserve">Evaluación estructural completa</w:t>
       </w:r>
     </w:p>
-    <w:bookmarkEnd w:id="35"/>
-    <w:bookmarkStart w:id="36" w:name="respuesta-a-fallas"/>
+    <w:bookmarkEnd w:id="46"/>
+    <w:bookmarkStart w:id="47" w:name="respuesta-a-fallas"/>
     <w:p>
       <w:pPr>
         <w:pStyle w:val="Heading3"/>
@@ -3066,16 +3083,16 @@
     </w:p>
     <w:p>
       <w:pPr>
-        <w:pStyle w:val="Compact"/>
         <w:numPr>
           <w:ilvl w:val="0"/>
           <w:numId w:val="1005"/>
         </w:numPr>
-      </w:pPr>
-      <w:r>
-        <w:rPr>
-          <w:b/>
-          <w:bCs/>
+        <w:pStyle w:val="Compact"/>
+      </w:pPr>
+      <w:r>
+        <w:rPr>
+          <w:bCs/>
+          <w:b/>
         </w:rPr>
         <w:t xml:space="preserve">Detección</w:t>
       </w:r>
@@ -3088,16 +3105,16 @@
     </w:p>
     <w:p>
       <w:pPr>
-        <w:pStyle w:val="Compact"/>
         <w:numPr>
           <w:ilvl w:val="0"/>
           <w:numId w:val="1005"/>
         </w:numPr>
-      </w:pPr>
-      <w:r>
-        <w:rPr>
-          <w:b/>
-          <w:bCs/>
+        <w:pStyle w:val="Compact"/>
+      </w:pPr>
+      <w:r>
+        <w:rPr>
+          <w:bCs/>
+          <w:b/>
         </w:rPr>
         <w:t xml:space="preserve">Evaluación</w:t>
       </w:r>
@@ -3110,16 +3127,16 @@
     </w:p>
     <w:p>
       <w:pPr>
-        <w:pStyle w:val="Compact"/>
         <w:numPr>
           <w:ilvl w:val="0"/>
           <w:numId w:val="1005"/>
         </w:numPr>
-      </w:pPr>
-      <w:r>
-        <w:rPr>
-          <w:b/>
-          <w:bCs/>
+        <w:pStyle w:val="Compact"/>
+      </w:pPr>
+      <w:r>
+        <w:rPr>
+          <w:bCs/>
+          <w:b/>
         </w:rPr>
         <w:t xml:space="preserve">Reparación</w:t>
       </w:r>
@@ -3132,16 +3149,16 @@
     </w:p>
     <w:p>
       <w:pPr>
-        <w:pStyle w:val="Compact"/>
         <w:numPr>
           <w:ilvl w:val="0"/>
           <w:numId w:val="1005"/>
         </w:numPr>
-      </w:pPr>
-      <w:r>
-        <w:rPr>
-          <w:b/>
-          <w:bCs/>
+        <w:pStyle w:val="Compact"/>
+      </w:pPr>
+      <w:r>
+        <w:rPr>
+          <w:bCs/>
+          <w:b/>
         </w:rPr>
         <w:t xml:space="preserve">Verificación</w:t>
       </w:r>
@@ -3154,16 +3171,16 @@
     </w:p>
     <w:p>
       <w:pPr>
-        <w:pStyle w:val="Compact"/>
         <w:numPr>
           <w:ilvl w:val="0"/>
           <w:numId w:val="1005"/>
         </w:numPr>
-      </w:pPr>
-      <w:r>
-        <w:rPr>
-          <w:b/>
-          <w:bCs/>
+        <w:pStyle w:val="Compact"/>
+      </w:pPr>
+      <w:r>
+        <w:rPr>
+          <w:bCs/>
+          <w:b/>
         </w:rPr>
         <w:t xml:space="preserve">Documentación</w:t>
       </w:r>
@@ -3181,9 +3198,9 @@
         </w:pict>
       </w:r>
     </w:p>
-    <w:bookmarkEnd w:id="36"/>
-    <w:bookmarkEnd w:id="37"/>
-    <w:bookmarkStart w:id="40" w:name="interfaces-con-otras-especialidades"/>
+    <w:bookmarkEnd w:id="47"/>
+    <w:bookmarkEnd w:id="48"/>
+    <w:bookmarkStart w:id="51" w:name="interfaces-con-otras-especialidades"/>
     <w:p>
       <w:pPr>
         <w:pStyle w:val="Heading2"/>
@@ -3192,7 +3209,7 @@
         <w:t xml:space="preserve">🔗 INTERFACES CON OTRAS ESPECIALIDADES</w:t>
       </w:r>
     </w:p>
-    <w:bookmarkStart w:id="38" w:name="diagrama-de-interfaces"/>
+    <w:bookmarkStart w:id="49" w:name="diagrama-de-interfaces"/>
     <w:p>
       <w:pPr>
         <w:pStyle w:val="Heading3"/>
@@ -3248,8 +3265,8 @@
         <w:t xml:space="preserve">[Sistemas Civiles] ←→ [Sistemas de Control] ←→ [Sistemas de Comunicación]</w:t>
       </w:r>
     </w:p>
-    <w:bookmarkEnd w:id="38"/>
-    <w:bookmarkStart w:id="39" w:name="tabla-de-interfaces-críticas"/>
+    <w:bookmarkEnd w:id="49"/>
+    <w:bookmarkStart w:id="50" w:name="tabla-de-interfaces-críticas"/>
     <w:p>
       <w:pPr>
         <w:pStyle w:val="Heading3"/>
@@ -3262,8 +3279,9 @@
       <w:tblPr>
         <w:tblStyle w:val="Table"/>
         <w:tblW w:type="pct" w:w="5000"/>
+        <w:tblLook w:firstRow="1" w:lastRow="0" w:firstColumn="0" w:lastColumn="0" w:noHBand="0" w:noVBand="0" w:val="0020"/>
+        <w:jc w:val="start"/>
         <w:tblLayout w:type="fixed"/>
-        <w:tblLook w:firstRow="1" w:lastRow="0" w:firstColumn="0" w:lastColumn="0" w:noHBand="0" w:noVBand="0" w:val="0020"/>
       </w:tblPr>
       <w:tblGrid>
         <w:gridCol w:w="1945"/>
@@ -3273,7 +3291,7 @@
       </w:tblGrid>
       <w:tr>
         <w:trPr>
-          <w:tblHeader w:val="on"/>
+          <w:tblHeader w:val="true"/>
         </w:trPr>
         <w:tc>
           <w:tcPr/>
@@ -3334,8 +3352,8 @@
             </w:pPr>
             <w:r>
               <w:rPr>
+                <w:bCs/>
                 <w:b/>
-                <w:bCs/>
               </w:rPr>
               <w:t xml:space="preserve">Ingeniería Eléctrica</w:t>
             </w:r>
@@ -3388,8 +3406,8 @@
             </w:pPr>
             <w:r>
               <w:rPr>
+                <w:bCs/>
                 <w:b/>
-                <w:bCs/>
               </w:rPr>
               <w:t xml:space="preserve">Ingeniería Mecánica</w:t>
             </w:r>
@@ -3442,8 +3460,8 @@
             </w:pPr>
             <w:r>
               <w:rPr>
+                <w:bCs/>
                 <w:b/>
-                <w:bCs/>
               </w:rPr>
               <w:t xml:space="preserve">Ingeniería de Sistemas</w:t>
             </w:r>
@@ -3496,8 +3514,8 @@
             </w:pPr>
             <w:r>
               <w:rPr>
+                <w:bCs/>
                 <w:b/>
-                <w:bCs/>
               </w:rPr>
               <w:t xml:space="preserve">Ingeniería Ambiental</w:t>
             </w:r>
@@ -3548,9 +3566,9 @@
         </w:pict>
       </w:r>
     </w:p>
-    <w:bookmarkEnd w:id="39"/>
-    <w:bookmarkEnd w:id="40"/>
-    <w:bookmarkStart w:id="44" w:name="supuestos-técnicos-y-limitaciones"/>
+    <w:bookmarkEnd w:id="50"/>
+    <w:bookmarkEnd w:id="51"/>
+    <w:bookmarkStart w:id="55" w:name="supuestos-técnicos-y-limitaciones"/>
     <w:p>
       <w:pPr>
         <w:pStyle w:val="Heading2"/>
@@ -3559,21 +3577,22 @@
         <w:t xml:space="preserve">📋 SUPUESTOS TÉCNICOS Y LIMITACIONES</w:t>
       </w:r>
     </w:p>
-    <w:bookmarkStart w:id="41" w:name="supuestos-críticos-del-diseño"/>
+    <w:bookmarkStart w:id="52" w:name="supuestos-críticos-del-diseno"/>
     <w:p>
       <w:pPr>
         <w:pStyle w:val="Heading3"/>
       </w:pPr>
       <w:r>
-        <w:t xml:space="preserve">Supuestos Críticos del Diseño</w:t>
+        <w:t xml:space="preserve">Supuestos Críticos del Diseno</w:t>
       </w:r>
     </w:p>
     <w:tbl>
       <w:tblPr>
         <w:tblStyle w:val="Table"/>
         <w:tblW w:type="pct" w:w="5000"/>
+        <w:tblLook w:firstRow="1" w:lastRow="0" w:firstColumn="0" w:lastColumn="0" w:noHBand="0" w:noVBand="0" w:val="0020"/>
+        <w:jc w:val="start"/>
         <w:tblLayout w:type="fixed"/>
-        <w:tblLook w:firstRow="1" w:lastRow="0" w:firstColumn="0" w:lastColumn="0" w:noHBand="0" w:noVBand="0" w:val="0020"/>
       </w:tblPr>
       <w:tblGrid>
         <w:gridCol w:w="1414"/>
@@ -3583,7 +3602,7 @@
       </w:tblGrid>
       <w:tr>
         <w:trPr>
-          <w:tblHeader w:val="on"/>
+          <w:tblHeader w:val="true"/>
         </w:trPr>
         <w:tc>
           <w:tcPr/>
@@ -3644,8 +3663,8 @@
             </w:pPr>
             <w:r>
               <w:rPr>
+                <w:bCs/>
                 <w:b/>
-                <w:bCs/>
               </w:rPr>
               <w:t xml:space="preserve">Carga por eje</w:t>
             </w:r>
@@ -3683,7 +3702,7 @@
               <w:jc w:val="left"/>
             </w:pPr>
             <w:r>
-              <w:t xml:space="preserve">Diseño conservador</w:t>
+              <w:t xml:space="preserve">Diseno conservador</w:t>
             </w:r>
           </w:p>
         </w:tc>
@@ -3698,8 +3717,8 @@
             </w:pPr>
             <w:r>
               <w:rPr>
+                <w:bCs/>
                 <w:b/>
-                <w:bCs/>
               </w:rPr>
               <w:t xml:space="preserve">Vida útil</w:t>
             </w:r>
@@ -3713,7 +3732,7 @@
               <w:jc w:val="left"/>
             </w:pPr>
             <w:r>
-              <w:t xml:space="preserve">50 años</w:t>
+              <w:t xml:space="preserve">50 anos</w:t>
             </w:r>
           </w:p>
         </w:tc>
@@ -3752,8 +3771,8 @@
             </w:pPr>
             <w:r>
               <w:rPr>
+                <w:bCs/>
                 <w:b/>
-                <w:bCs/>
               </w:rPr>
               <w:t xml:space="preserve">Factor sísmico</w:t>
             </w:r>
@@ -3791,7 +3810,7 @@
               <w:jc w:val="left"/>
             </w:pPr>
             <w:r>
-              <w:t xml:space="preserve">Diseño sismo resistente</w:t>
+              <w:t xml:space="preserve">Diseno sismo resistente</w:t>
             </w:r>
           </w:p>
         </w:tc>
@@ -3806,8 +3825,8 @@
             </w:pPr>
             <w:r>
               <w:rPr>
+                <w:bCs/>
                 <w:b/>
-                <w:bCs/>
               </w:rPr>
               <w:t xml:space="preserve">Condiciones geotécnicas</w:t>
             </w:r>
@@ -3860,8 +3879,8 @@
             </w:pPr>
             <w:r>
               <w:rPr>
+                <w:bCs/>
                 <w:b/>
-                <w:bCs/>
               </w:rPr>
               <w:t xml:space="preserve">Condiciones hidráulicas</w:t>
             </w:r>
@@ -3905,28 +3924,28 @@
         </w:tc>
       </w:tr>
     </w:tbl>
-    <w:bookmarkEnd w:id="41"/>
-    <w:bookmarkStart w:id="42" w:name="limitaciones-del-diseño"/>
+    <w:bookmarkEnd w:id="52"/>
+    <w:bookmarkStart w:id="53" w:name="limitaciones-del-diseno"/>
     <w:p>
       <w:pPr>
         <w:pStyle w:val="Heading3"/>
       </w:pPr>
       <w:r>
-        <w:t xml:space="preserve">Limitaciones del Diseño</w:t>
-      </w:r>
-    </w:p>
-    <w:p>
-      <w:pPr>
-        <w:pStyle w:val="Compact"/>
+        <w:t xml:space="preserve">Limitaciones del Diseno</w:t>
+      </w:r>
+    </w:p>
+    <w:p>
+      <w:pPr>
         <w:numPr>
           <w:ilvl w:val="0"/>
           <w:numId w:val="1006"/>
         </w:numPr>
-      </w:pPr>
-      <w:r>
-        <w:rPr>
-          <w:b/>
-          <w:bCs/>
+        <w:pStyle w:val="Compact"/>
+      </w:pPr>
+      <w:r>
+        <w:rPr>
+          <w:bCs/>
+          <w:b/>
         </w:rPr>
         <w:t xml:space="preserve">Topografía:</w:t>
       </w:r>
@@ -3939,16 +3958,16 @@
     </w:p>
     <w:p>
       <w:pPr>
-        <w:pStyle w:val="Compact"/>
         <w:numPr>
           <w:ilvl w:val="0"/>
           <w:numId w:val="1006"/>
         </w:numPr>
-      </w:pPr>
-      <w:r>
-        <w:rPr>
-          <w:b/>
-          <w:bCs/>
+        <w:pStyle w:val="Compact"/>
+      </w:pPr>
+      <w:r>
+        <w:rPr>
+          <w:bCs/>
+          <w:b/>
         </w:rPr>
         <w:t xml:space="preserve">Geología:</w:t>
       </w:r>
@@ -3961,16 +3980,16 @@
     </w:p>
     <w:p>
       <w:pPr>
-        <w:pStyle w:val="Compact"/>
         <w:numPr>
           <w:ilvl w:val="0"/>
           <w:numId w:val="1006"/>
         </w:numPr>
-      </w:pPr>
-      <w:r>
-        <w:rPr>
-          <w:b/>
-          <w:bCs/>
+        <w:pStyle w:val="Compact"/>
+      </w:pPr>
+      <w:r>
+        <w:rPr>
+          <w:bCs/>
+          <w:b/>
         </w:rPr>
         <w:t xml:space="preserve">Hidrología:</w:t>
       </w:r>
@@ -3983,16 +4002,16 @@
     </w:p>
     <w:p>
       <w:pPr>
-        <w:pStyle w:val="Compact"/>
         <w:numPr>
           <w:ilvl w:val="0"/>
           <w:numId w:val="1006"/>
         </w:numPr>
-      </w:pPr>
-      <w:r>
-        <w:rPr>
-          <w:b/>
-          <w:bCs/>
+        <w:pStyle w:val="Compact"/>
+      </w:pPr>
+      <w:r>
+        <w:rPr>
+          <w:bCs/>
+          <w:b/>
         </w:rPr>
         <w:t xml:space="preserve">Acceso:</w:t>
       </w:r>
@@ -4005,16 +4024,16 @@
     </w:p>
     <w:p>
       <w:pPr>
-        <w:pStyle w:val="Compact"/>
         <w:numPr>
           <w:ilvl w:val="0"/>
           <w:numId w:val="1006"/>
         </w:numPr>
-      </w:pPr>
-      <w:r>
-        <w:rPr>
-          <w:b/>
-          <w:bCs/>
+        <w:pStyle w:val="Compact"/>
+      </w:pPr>
+      <w:r>
+        <w:rPr>
+          <w:bCs/>
+          <w:b/>
         </w:rPr>
         <w:t xml:space="preserve">Ambiental:</w:t>
       </w:r>
@@ -4025,8 +4044,8 @@
         <w:t xml:space="preserve">Restricciones por licencias ambientales</w:t>
       </w:r>
     </w:p>
-    <w:bookmarkEnd w:id="42"/>
-    <w:bookmarkStart w:id="43" w:name="dependencias-críticas"/>
+    <w:bookmarkEnd w:id="53"/>
+    <w:bookmarkStart w:id="54" w:name="dependencias-críticas"/>
     <w:p>
       <w:pPr>
         <w:pStyle w:val="Heading3"/>
@@ -4037,16 +4056,16 @@
     </w:p>
     <w:p>
       <w:pPr>
-        <w:pStyle w:val="Compact"/>
         <w:numPr>
           <w:ilvl w:val="0"/>
           <w:numId w:val="1007"/>
         </w:numPr>
-      </w:pPr>
-      <w:r>
-        <w:rPr>
-          <w:b/>
-          <w:bCs/>
+        <w:pStyle w:val="Compact"/>
+      </w:pPr>
+      <w:r>
+        <w:rPr>
+          <w:bCs/>
+          <w:b/>
         </w:rPr>
         <w:t xml:space="preserve">Licencias ambientales:</w:t>
       </w:r>
@@ -4059,16 +4078,16 @@
     </w:p>
     <w:p>
       <w:pPr>
-        <w:pStyle w:val="Compact"/>
         <w:numPr>
           <w:ilvl w:val="0"/>
           <w:numId w:val="1007"/>
         </w:numPr>
-      </w:pPr>
-      <w:r>
-        <w:rPr>
-          <w:b/>
-          <w:bCs/>
+        <w:pStyle w:val="Compact"/>
+      </w:pPr>
+      <w:r>
+        <w:rPr>
+          <w:bCs/>
+          <w:b/>
         </w:rPr>
         <w:t xml:space="preserve">Estudios geotécnicos:</w:t>
       </w:r>
@@ -4081,16 +4100,16 @@
     </w:p>
     <w:p>
       <w:pPr>
-        <w:pStyle w:val="Compact"/>
         <w:numPr>
           <w:ilvl w:val="0"/>
           <w:numId w:val="1007"/>
         </w:numPr>
-      </w:pPr>
-      <w:r>
-        <w:rPr>
-          <w:b/>
-          <w:bCs/>
+        <w:pStyle w:val="Compact"/>
+      </w:pPr>
+      <w:r>
+        <w:rPr>
+          <w:bCs/>
+          <w:b/>
         </w:rPr>
         <w:t xml:space="preserve">Estudios hidrológicos:</w:t>
       </w:r>
@@ -4098,21 +4117,21 @@
         <w:t xml:space="preserve"> </w:t>
       </w:r>
       <w:r>
-        <w:t xml:space="preserve">Caudales de diseño</w:t>
-      </w:r>
-    </w:p>
-    <w:p>
-      <w:pPr>
-        <w:pStyle w:val="Compact"/>
+        <w:t xml:space="preserve">Caudales de diseno</w:t>
+      </w:r>
+    </w:p>
+    <w:p>
+      <w:pPr>
         <w:numPr>
           <w:ilvl w:val="0"/>
           <w:numId w:val="1007"/>
         </w:numPr>
-      </w:pPr>
-      <w:r>
-        <w:rPr>
-          <w:b/>
-          <w:bCs/>
+        <w:pStyle w:val="Compact"/>
+      </w:pPr>
+      <w:r>
+        <w:rPr>
+          <w:bCs/>
+          <w:b/>
         </w:rPr>
         <w:t xml:space="preserve">Materiales:</w:t>
       </w:r>
@@ -4125,16 +4144,16 @@
     </w:p>
     <w:p>
       <w:pPr>
-        <w:pStyle w:val="Compact"/>
         <w:numPr>
           <w:ilvl w:val="0"/>
           <w:numId w:val="1007"/>
         </w:numPr>
-      </w:pPr>
-      <w:r>
-        <w:rPr>
-          <w:b/>
-          <w:bCs/>
+        <w:pStyle w:val="Compact"/>
+      </w:pPr>
+      <w:r>
+        <w:rPr>
+          <w:bCs/>
+          <w:b/>
         </w:rPr>
         <w:t xml:space="preserve">Mano de obra:</w:t>
       </w:r>
@@ -4152,9 +4171,9 @@
         </w:pict>
       </w:r>
     </w:p>
-    <w:bookmarkEnd w:id="43"/>
-    <w:bookmarkEnd w:id="44"/>
-    <w:bookmarkStart w:id="45" w:name="riesgos-y-mitigaciones"/>
+    <w:bookmarkEnd w:id="54"/>
+    <w:bookmarkEnd w:id="55"/>
+    <w:bookmarkStart w:id="56" w:name="riesgos-y-mitigaciones"/>
     <w:p>
       <w:pPr>
         <w:pStyle w:val="Heading2"/>
@@ -4167,8 +4186,9 @@
       <w:tblPr>
         <w:tblStyle w:val="Table"/>
         <w:tblW w:type="pct" w:w="5000"/>
+        <w:tblLook w:firstRow="1" w:lastRow="0" w:firstColumn="0" w:lastColumn="0" w:noHBand="0" w:noVBand="0" w:val="0020"/>
+        <w:jc w:val="start"/>
         <w:tblLayout w:type="fixed"/>
-        <w:tblLook w:firstRow="1" w:lastRow="0" w:firstColumn="0" w:lastColumn="0" w:noHBand="0" w:noVBand="0" w:val="0020"/>
       </w:tblPr>
       <w:tblGrid>
         <w:gridCol w:w="1218"/>
@@ -4179,7 +4199,7 @@
       </w:tblGrid>
       <w:tr>
         <w:trPr>
-          <w:tblHeader w:val="on"/>
+          <w:tblHeader w:val="true"/>
         </w:trPr>
         <w:tc>
           <w:tcPr/>
@@ -4560,8 +4580,8 @@
         </w:pict>
       </w:r>
     </w:p>
-    <w:bookmarkEnd w:id="45"/>
-    <w:bookmarkStart w:id="48" w:name="cumplimiento-contractual"/>
+    <w:bookmarkEnd w:id="56"/>
+    <w:bookmarkStart w:id="59" w:name="cumplimiento-contractual"/>
     <w:p>
       <w:pPr>
         <w:pStyle w:val="Heading2"/>
@@ -4570,7 +4590,7 @@
         <w:t xml:space="preserve">📋 CUMPLIMIENTO CONTRACTUAL</w:t>
       </w:r>
     </w:p>
-    <w:bookmarkStart w:id="46" w:name="obligaciones-clave-del-contrato"/>
+    <w:bookmarkStart w:id="57" w:name="obligaciones-clave-del-contrato"/>
     <w:p>
       <w:pPr>
         <w:pStyle w:val="Heading3"/>
@@ -4581,11 +4601,11 @@
     </w:p>
     <w:p>
       <w:pPr>
-        <w:pStyle w:val="Compact"/>
         <w:numPr>
           <w:ilvl w:val="0"/>
           <w:numId w:val="1008"/>
         </w:numPr>
+        <w:pStyle w:val="Compact"/>
       </w:pPr>
       <w:r>
         <w:t xml:space="preserve">✅</w:t>
@@ -4595,8 +4615,8 @@
       </w:r>
       <w:r>
         <w:rPr>
-          <w:b/>
-          <w:bCs/>
+          <w:bCs/>
+          <w:b/>
         </w:rPr>
         <w:t xml:space="preserve">AT1 - Alcance:</w:t>
       </w:r>
@@ -4609,11 +4629,11 @@
     </w:p>
     <w:p>
       <w:pPr>
-        <w:pStyle w:val="Compact"/>
         <w:numPr>
           <w:ilvl w:val="0"/>
           <w:numId w:val="1008"/>
         </w:numPr>
+        <w:pStyle w:val="Compact"/>
       </w:pPr>
       <w:r>
         <w:t xml:space="preserve">✅</w:t>
@@ -4623,8 +4643,8 @@
       </w:r>
       <w:r>
         <w:rPr>
-          <w:b/>
-          <w:bCs/>
+          <w:bCs/>
+          <w:b/>
         </w:rPr>
         <w:t xml:space="preserve">AT2 - Operación:</w:t>
       </w:r>
@@ -4637,11 +4657,11 @@
     </w:p>
     <w:p>
       <w:pPr>
-        <w:pStyle w:val="Compact"/>
         <w:numPr>
           <w:ilvl w:val="0"/>
           <w:numId w:val="1008"/>
         </w:numPr>
+        <w:pStyle w:val="Compact"/>
       </w:pPr>
       <w:r>
         <w:t xml:space="preserve">⏳</w:t>
@@ -4651,8 +4671,8 @@
       </w:r>
       <w:r>
         <w:rPr>
-          <w:b/>
-          <w:bCs/>
+          <w:bCs/>
+          <w:b/>
         </w:rPr>
         <w:t xml:space="preserve">AT3 - Especificaciones:</w:t>
       </w:r>
@@ -4665,11 +4685,11 @@
     </w:p>
     <w:p>
       <w:pPr>
-        <w:pStyle w:val="Compact"/>
         <w:numPr>
           <w:ilvl w:val="0"/>
           <w:numId w:val="1008"/>
         </w:numPr>
+        <w:pStyle w:val="Compact"/>
       </w:pPr>
       <w:r>
         <w:t xml:space="preserve">⏳</w:t>
@@ -4679,8 +4699,8 @@
       </w:r>
       <w:r>
         <w:rPr>
-          <w:b/>
-          <w:bCs/>
+          <w:bCs/>
+          <w:b/>
         </w:rPr>
         <w:t xml:space="preserve">AT6 - Ambiental:</w:t>
       </w:r>
@@ -4693,11 +4713,11 @@
     </w:p>
     <w:p>
       <w:pPr>
-        <w:pStyle w:val="Compact"/>
         <w:numPr>
           <w:ilvl w:val="0"/>
           <w:numId w:val="1008"/>
         </w:numPr>
+        <w:pStyle w:val="Compact"/>
       </w:pPr>
       <w:r>
         <w:t xml:space="preserve">⏳</w:t>
@@ -4707,8 +4727,8 @@
       </w:r>
       <w:r>
         <w:rPr>
-          <w:b/>
-          <w:bCs/>
+          <w:bCs/>
+          <w:b/>
         </w:rPr>
         <w:t xml:space="preserve">AT7 - Predial:</w:t>
       </w:r>
@@ -4719,8 +4739,8 @@
         <w:t xml:space="preserve">Gestión predial para infraestructura - En progreso</w:t>
       </w:r>
     </w:p>
-    <w:bookmarkEnd w:id="46"/>
-    <w:bookmarkStart w:id="47" w:name="referencias-contractuales"/>
+    <w:bookmarkEnd w:id="57"/>
+    <w:bookmarkStart w:id="58" w:name="referencias-contractuales"/>
     <w:p>
       <w:pPr>
         <w:pStyle w:val="Heading3"/>
@@ -4731,16 +4751,16 @@
     </w:p>
     <w:p>
       <w:pPr>
-        <w:pStyle w:val="Compact"/>
         <w:numPr>
           <w:ilvl w:val="0"/>
           <w:numId w:val="1009"/>
         </w:numPr>
-      </w:pPr>
-      <w:r>
-        <w:rPr>
-          <w:b/>
-          <w:bCs/>
+        <w:pStyle w:val="Compact"/>
+      </w:pPr>
+      <w:r>
+        <w:rPr>
+          <w:bCs/>
+          <w:b/>
         </w:rPr>
         <w:t xml:space="preserve">Apéndice Técnico 1:</w:t>
       </w:r>
@@ -4753,16 +4773,16 @@
     </w:p>
     <w:p>
       <w:pPr>
-        <w:pStyle w:val="Compact"/>
         <w:numPr>
           <w:ilvl w:val="0"/>
           <w:numId w:val="1009"/>
         </w:numPr>
-      </w:pPr>
-      <w:r>
-        <w:rPr>
-          <w:b/>
-          <w:bCs/>
+        <w:pStyle w:val="Compact"/>
+      </w:pPr>
+      <w:r>
+        <w:rPr>
+          <w:bCs/>
+          <w:b/>
         </w:rPr>
         <w:t xml:space="preserve">Apéndice Técnico 2:</w:t>
       </w:r>
@@ -4775,16 +4795,16 @@
     </w:p>
     <w:p>
       <w:pPr>
-        <w:pStyle w:val="Compact"/>
         <w:numPr>
           <w:ilvl w:val="0"/>
           <w:numId w:val="1009"/>
         </w:numPr>
-      </w:pPr>
-      <w:r>
-        <w:rPr>
-          <w:b/>
-          <w:bCs/>
+        <w:pStyle w:val="Compact"/>
+      </w:pPr>
+      <w:r>
+        <w:rPr>
+          <w:bCs/>
+          <w:b/>
         </w:rPr>
         <w:t xml:space="preserve">Apéndice Técnico 3:</w:t>
       </w:r>
@@ -4797,16 +4817,16 @@
     </w:p>
     <w:p>
       <w:pPr>
-        <w:pStyle w:val="Compact"/>
         <w:numPr>
           <w:ilvl w:val="0"/>
           <w:numId w:val="1009"/>
         </w:numPr>
-      </w:pPr>
-      <w:r>
-        <w:rPr>
-          <w:b/>
-          <w:bCs/>
+        <w:pStyle w:val="Compact"/>
+      </w:pPr>
+      <w:r>
+        <w:rPr>
+          <w:bCs/>
+          <w:b/>
         </w:rPr>
         <w:t xml:space="preserve">Apéndice Técnico 6:</w:t>
       </w:r>
@@ -4819,16 +4839,16 @@
     </w:p>
     <w:p>
       <w:pPr>
-        <w:pStyle w:val="Compact"/>
         <w:numPr>
           <w:ilvl w:val="0"/>
           <w:numId w:val="1009"/>
         </w:numPr>
-      </w:pPr>
-      <w:r>
-        <w:rPr>
-          <w:b/>
-          <w:bCs/>
+        <w:pStyle w:val="Compact"/>
+      </w:pPr>
+      <w:r>
+        <w:rPr>
+          <w:bCs/>
+          <w:b/>
         </w:rPr>
         <w:t xml:space="preserve">Apéndice Técnico 7:</w:t>
       </w:r>
@@ -4846,9 +4866,9 @@
         </w:pict>
       </w:r>
     </w:p>
-    <w:bookmarkEnd w:id="47"/>
-    <w:bookmarkEnd w:id="48"/>
-    <w:bookmarkStart w:id="51" w:name="documentación-de-soporte"/>
+    <w:bookmarkEnd w:id="58"/>
+    <w:bookmarkEnd w:id="59"/>
+    <w:bookmarkStart w:id="62" w:name="documentación-de-soporte"/>
     <w:p>
       <w:pPr>
         <w:pStyle w:val="Heading2"/>
@@ -4857,7 +4877,7 @@
         <w:t xml:space="preserve">📚 DOCUMENTACIÓN DE SOPORTE</w:t>
       </w:r>
     </w:p>
-    <w:bookmarkStart w:id="49" w:name="documentos-técnicos-disponibles"/>
+    <w:bookmarkStart w:id="60" w:name="documentos-técnicos-disponibles"/>
     <w:p>
       <w:pPr>
         <w:pStyle w:val="Heading3"/>
@@ -4870,8 +4890,9 @@
       <w:tblPr>
         <w:tblStyle w:val="Table"/>
         <w:tblW w:type="pct" w:w="5000"/>
+        <w:tblLook w:firstRow="1" w:lastRow="0" w:firstColumn="0" w:lastColumn="0" w:noHBand="0" w:noVBand="0" w:val="0020"/>
+        <w:jc w:val="start"/>
         <w:tblLayout w:type="fixed"/>
-        <w:tblLook w:firstRow="1" w:lastRow="0" w:firstColumn="0" w:lastColumn="0" w:noHBand="0" w:noVBand="0" w:val="0020"/>
       </w:tblPr>
       <w:tblGrid>
         <w:gridCol w:w="2354"/>
@@ -4881,7 +4902,7 @@
       </w:tblGrid>
       <w:tr>
         <w:trPr>
-          <w:tblHeader w:val="on"/>
+          <w:tblHeader w:val="true"/>
         </w:trPr>
         <w:tc>
           <w:tcPr/>
@@ -5133,8 +5154,8 @@
         </w:tc>
       </w:tr>
     </w:tbl>
-    <w:bookmarkEnd w:id="49"/>
-    <w:bookmarkStart w:id="50" w:name="para-más-información-técnica"/>
+    <w:bookmarkEnd w:id="60"/>
+    <w:bookmarkStart w:id="61" w:name="para-más-información-técnica"/>
     <w:p>
       <w:pPr>
         <w:pStyle w:val="Heading3"/>
@@ -5158,9 +5179,9 @@
         </w:pict>
       </w:r>
     </w:p>
-    <w:bookmarkEnd w:id="50"/>
-    <w:bookmarkEnd w:id="51"/>
-    <w:bookmarkStart w:id="52" w:name="contactos-y-responsables"/>
+    <w:bookmarkEnd w:id="61"/>
+    <w:bookmarkEnd w:id="62"/>
+    <w:bookmarkStart w:id="63" w:name="contactos-y-responsables"/>
     <w:p>
       <w:pPr>
         <w:pStyle w:val="Heading2"/>
@@ -5174,6 +5195,7 @@
         <w:tblStyle w:val="Table"/>
         <w:tblW w:type="auto" w:w="0"/>
         <w:tblLook w:firstRow="1" w:lastRow="0" w:firstColumn="0" w:lastColumn="0" w:noHBand="0" w:noVBand="0" w:val="0020"/>
+        <w:jc w:val="start"/>
       </w:tblPr>
       <w:tblGrid>
         <w:gridCol w:w="2640"/>
@@ -5182,7 +5204,7 @@
       </w:tblGrid>
       <w:tr>
         <w:trPr>
-          <w:tblHeader w:val="on"/>
+          <w:tblHeader w:val="true"/>
         </w:trPr>
         <w:tc>
           <w:tcPr/>
@@ -5343,14 +5365,14 @@
         </w:pict>
       </w:r>
     </w:p>
-    <w:bookmarkEnd w:id="52"/>
-    <w:bookmarkStart w:id="53" w:name="indicadores-de-desempeño-kpis"/>
+    <w:bookmarkEnd w:id="63"/>
+    <w:bookmarkStart w:id="64" w:name="indicadores-de-desempeno-kpis"/>
     <w:p>
       <w:pPr>
         <w:pStyle w:val="Heading2"/>
       </w:pPr>
       <w:r>
-        <w:t xml:space="preserve">📊 INDICADORES DE DESEMPEÑO (KPIs)</w:t>
+        <w:t xml:space="preserve">📊 INDICADORES DE DESEMPENO (KPIs)</w:t>
       </w:r>
     </w:p>
     <w:tbl>
@@ -5358,6 +5380,7 @@
         <w:tblStyle w:val="Table"/>
         <w:tblW w:type="auto" w:w="0"/>
         <w:tblLook w:firstRow="1" w:lastRow="0" w:firstColumn="0" w:lastColumn="0" w:noHBand="0" w:noVBand="0" w:val="0020"/>
+        <w:jc w:val="start"/>
       </w:tblPr>
       <w:tblGrid>
         <w:gridCol w:w="1980"/>
@@ -5367,7 +5390,7 @@
       </w:tblGrid>
       <w:tr>
         <w:trPr>
-          <w:tblHeader w:val="on"/>
+          <w:tblHeader w:val="true"/>
         </w:trPr>
         <w:tc>
           <w:tcPr/>
@@ -5676,8 +5699,8 @@
         </w:pict>
       </w:r>
     </w:p>
-    <w:bookmarkEnd w:id="53"/>
-    <w:bookmarkStart w:id="55" w:name="decisiones-tecnicas-aplicadas"/>
+    <w:bookmarkEnd w:id="64"/>
+    <w:bookmarkStart w:id="66" w:name="decisiones-tecnicas-aplicadas"/>
     <w:p>
       <w:pPr>
         <w:pStyle w:val="Heading2"/>
@@ -5686,7 +5709,7 @@
         <w:t xml:space="preserve">📋 DECISIONES TECNICAS APLICADAS</w:t>
       </w:r>
     </w:p>
-    <w:bookmarkStart w:id="54" w:name="obras-civiles-actualizadas"/>
+    <w:bookmarkStart w:id="65" w:name="obras-civiles-actualizadas"/>
     <w:p>
       <w:pPr>
         <w:pStyle w:val="Heading3"/>
@@ -5697,11 +5720,11 @@
     </w:p>
     <w:p>
       <w:pPr>
-        <w:pStyle w:val="Compact"/>
         <w:numPr>
           <w:ilvl w:val="0"/>
           <w:numId w:val="1010"/>
         </w:numPr>
+        <w:pStyle w:val="Compact"/>
       </w:pPr>
       <w:r>
         <w:t xml:space="preserve">Estado: ✅ Ver sistemas relacionados</w:t>
@@ -5709,11 +5732,11 @@
     </w:p>
     <w:p>
       <w:pPr>
-        <w:pStyle w:val="Compact"/>
         <w:numPr>
           <w:ilvl w:val="0"/>
           <w:numId w:val="1010"/>
         </w:numPr>
+        <w:pStyle w:val="Compact"/>
       </w:pPr>
       <w:r>
         <w:t xml:space="preserve">Fuente: Cocina I-VI consolidada</w:t>
@@ -5726,9 +5749,9 @@
         </w:pict>
       </w:r>
     </w:p>
-    <w:bookmarkEnd w:id="54"/>
-    <w:bookmarkEnd w:id="55"/>
-    <w:bookmarkStart w:id="56" w:name="control-de-versiones"/>
+    <w:bookmarkEnd w:id="65"/>
+    <w:bookmarkEnd w:id="66"/>
+    <w:bookmarkStart w:id="67" w:name="control-de-versiones"/>
     <w:p>
       <w:pPr>
         <w:pStyle w:val="Heading2"/>
@@ -5741,8 +5764,9 @@
       <w:tblPr>
         <w:tblStyle w:val="Table"/>
         <w:tblW w:type="pct" w:w="5000"/>
+        <w:tblLook w:firstRow="1" w:lastRow="0" w:firstColumn="0" w:lastColumn="0" w:noHBand="0" w:noVBand="0" w:val="0020"/>
+        <w:jc w:val="start"/>
         <w:tblLayout w:type="fixed"/>
-        <w:tblLook w:firstRow="1" w:lastRow="0" w:firstColumn="0" w:lastColumn="0" w:noHBand="0" w:noVBand="0" w:val="0020"/>
       </w:tblPr>
       <w:tblGrid>
         <w:gridCol w:w="1425"/>
@@ -5752,7 +5776,7 @@
       </w:tblGrid>
       <w:tr>
         <w:trPr>
-          <w:tblHeader w:val="on"/>
+          <w:tblHeader w:val="true"/>
         </w:trPr>
         <w:tc>
           <w:tcPr/>
@@ -5867,8 +5891,8 @@
       </w:pPr>
       <w:r>
         <w:rPr>
-          <w:b/>
-          <w:bCs/>
+          <w:bCs/>
+          <w:b/>
         </w:rPr>
         <w:t xml:space="preserve">Documento preparado por:</w:t>
       </w:r>
@@ -5883,8 +5907,8 @@
       </w:r>
       <w:r>
         <w:rPr>
-          <w:b/>
-          <w:bCs/>
+          <w:bCs/>
+          <w:b/>
         </w:rPr>
         <w:t xml:space="preserve">Última actualización:</w:t>
       </w:r>
@@ -5899,8 +5923,8 @@
       </w:r>
       <w:r>
         <w:rPr>
-          <w:b/>
-          <w:bCs/>
+          <w:bCs/>
+          <w:b/>
         </w:rPr>
         <w:t xml:space="preserve">Próxima revisión:</w:t>
       </w:r>
@@ -5915,8 +5939,8 @@
       </w:r>
       <w:r>
         <w:rPr>
-          <w:b/>
-          <w:bCs/>
+          <w:bCs/>
+          <w:b/>
         </w:rPr>
         <w:t xml:space="preserve">Basado en:</w:t>
       </w:r>
@@ -5927,13 +5951,9 @@
         <w:t xml:space="preserve">ESPECIALIDAD_01_Ingenieria_Civil_Master.md v1.0</w:t>
       </w:r>
     </w:p>
-    <w:bookmarkEnd w:id="56"/>
-    <w:bookmarkEnd w:id="57"/>
-    <w:sectPr>
-      <w:footnotePr>
-        <w:numRestart w:val="eachSect"/>
-      </w:footnotePr>
-    </w:sectPr>
+    <w:bookmarkEnd w:id="67"/>
+    <w:bookmarkEnd w:id="68"/>
+    <w:sectPr/>
   </w:body>
 </w:document>
 </file>
@@ -5964,14 +5984,14 @@
 <file path=word/numbering.xml><?xml version="1.0" encoding="utf-8"?>
 <w:numbering xmlns:w="http://schemas.openxmlformats.org/wordprocessingml/2006/main">
   <w:abstractNum w:abstractNumId="990">
-    <w:nsid w:val="0000A990"/>
+    <w:nsid w:val="A990"/>
     <w:multiLevelType w:val="multilevel"/>
     <w:lvl w:ilvl="0">
       <w:numFmt w:val="bullet"/>
       <w:lvlText w:val=" "/>
       <w:lvlJc w:val="left"/>
       <w:pPr>
-        <w:ind w:left="720" w:hanging="360"/>
+        <w:ind w:left="720" w:hanging="480"/>
       </w:pPr>
     </w:lvl>
     <w:lvl w:ilvl="1">
@@ -5979,7 +5999,7 @@
       <w:lvlText w:val=" "/>
       <w:lvlJc w:val="left"/>
       <w:pPr>
-        <w:ind w:left="1440" w:hanging="360"/>
+        <w:ind w:left="1440" w:hanging="480"/>
       </w:pPr>
     </w:lvl>
     <w:lvl w:ilvl="2">
@@ -5987,7 +6007,7 @@
       <w:lvlText w:val=" "/>
       <w:lvlJc w:val="left"/>
       <w:pPr>
-        <w:ind w:left="2160" w:hanging="360"/>
+        <w:ind w:left="2160" w:hanging="480"/>
       </w:pPr>
     </w:lvl>
     <w:lvl w:ilvl="3">
@@ -5995,7 +6015,7 @@
       <w:lvlText w:val=" "/>
       <w:lvlJc w:val="left"/>
       <w:pPr>
-        <w:ind w:left="2880" w:hanging="360"/>
+        <w:ind w:left="2880" w:hanging="480"/>
       </w:pPr>
     </w:lvl>
     <w:lvl w:ilvl="4">
@@ -6003,7 +6023,7 @@
       <w:lvlText w:val=" "/>
       <w:lvlJc w:val="left"/>
       <w:pPr>
-        <w:ind w:left="3600" w:hanging="360"/>
+        <w:ind w:left="3600" w:hanging="480"/>
       </w:pPr>
     </w:lvl>
     <w:lvl w:ilvl="5">
@@ -6011,7 +6031,7 @@
       <w:lvlText w:val=" "/>
       <w:lvlJc w:val="left"/>
       <w:pPr>
-        <w:ind w:left="4320" w:hanging="360"/>
+        <w:ind w:left="4320" w:hanging="480"/>
       </w:pPr>
     </w:lvl>
     <w:lvl w:ilvl="6">
@@ -6019,7 +6039,7 @@
       <w:lvlText w:val=" "/>
       <w:lvlJc w:val="left"/>
       <w:pPr>
-        <w:ind w:left="5040" w:hanging="360"/>
+        <w:ind w:left="5040" w:hanging="480"/>
       </w:pPr>
     </w:lvl>
     <w:lvl w:ilvl="7">
@@ -6027,7 +6047,7 @@
       <w:lvlText w:val=" "/>
       <w:lvlJc w:val="left"/>
       <w:pPr>
-        <w:ind w:left="5760" w:hanging="360"/>
+        <w:ind w:left="5760" w:hanging="480"/>
       </w:pPr>
     </w:lvl>
     <w:lvl w:ilvl="8">
@@ -6035,115 +6055,88 @@
       <w:lvlText w:val=" "/>
       <w:lvlJc w:val="left"/>
       <w:pPr>
-        <w:ind w:left="6480" w:hanging="360"/>
+        <w:ind w:left="6480" w:hanging="480"/>
       </w:pPr>
     </w:lvl>
   </w:abstractNum>
   <w:abstractNum w:abstractNumId="991">
-    <w:nsid w:val="0000A991"/>
+    <w:nsid w:val="A991"/>
     <w:multiLevelType w:val="multilevel"/>
     <w:lvl w:ilvl="0">
       <w:numFmt w:val="bullet"/>
-      <w:lvlText w:val=""/>
+      <w:lvlText w:val="•"/>
       <w:lvlJc w:val="left"/>
       <w:pPr>
-        <w:ind w:left="720" w:hanging="360"/>
-      </w:pPr>
-      <w:rPr>
-        <w:rFonts w:ascii="Symbol" w:hAnsi="Symbol" w:cs="Symbol" w:hint="default"/>
-      </w:rPr>
+        <w:ind w:left="720" w:hanging="480"/>
+      </w:pPr>
     </w:lvl>
     <w:lvl w:ilvl="1">
       <w:numFmt w:val="bullet"/>
-      <w:lvlText w:val="o"/>
+      <w:lvlText w:val="–"/>
       <w:lvlJc w:val="left"/>
       <w:pPr>
-        <w:ind w:left="1440" w:hanging="360"/>
-      </w:pPr>
-      <w:rPr>
-        <w:rFonts w:ascii="Courier New" w:hAnsi="Courier New" w:cs="Courier New" w:hint="default"/>
-      </w:rPr>
+        <w:ind w:left="1440" w:hanging="480"/>
+      </w:pPr>
     </w:lvl>
     <w:lvl w:ilvl="2">
       <w:numFmt w:val="bullet"/>
-      <w:lvlText w:val=""/>
+      <w:lvlText w:val="•"/>
       <w:lvlJc w:val="left"/>
       <w:pPr>
-        <w:ind w:left="2160" w:hanging="360"/>
-      </w:pPr>
-      <w:rPr>
-        <w:rFonts w:ascii="Wingdings" w:hAnsi="Wingdings" w:cs="Wingdings" w:hint="default"/>
-      </w:rPr>
+        <w:ind w:left="2160" w:hanging="480"/>
+      </w:pPr>
     </w:lvl>
     <w:lvl w:ilvl="3">
       <w:numFmt w:val="bullet"/>
-      <w:lvlText w:val=""/>
+      <w:lvlText w:val="–"/>
       <w:lvlJc w:val="left"/>
       <w:pPr>
-        <w:ind w:left="2880" w:hanging="360"/>
-      </w:pPr>
-      <w:rPr>
-        <w:rFonts w:ascii="Symbol" w:hAnsi="Symbol" w:cs="Symbol" w:hint="default"/>
-      </w:rPr>
+        <w:ind w:left="2880" w:hanging="480"/>
+      </w:pPr>
     </w:lvl>
     <w:lvl w:ilvl="4">
       <w:numFmt w:val="bullet"/>
-      <w:lvlText w:val="o"/>
+      <w:lvlText w:val="•"/>
       <w:lvlJc w:val="left"/>
       <w:pPr>
-        <w:ind w:left="3600" w:hanging="360"/>
-      </w:pPr>
-      <w:rPr>
-        <w:rFonts w:ascii="Courier New" w:hAnsi="Courier New" w:cs="Courier New" w:hint="default"/>
-      </w:rPr>
+        <w:ind w:left="3600" w:hanging="480"/>
+      </w:pPr>
     </w:lvl>
     <w:lvl w:ilvl="5">
       <w:numFmt w:val="bullet"/>
-      <w:lvlText w:val=""/>
+      <w:lvlText w:val="–"/>
       <w:lvlJc w:val="left"/>
       <w:pPr>
-        <w:ind w:left="4320" w:hanging="360"/>
-      </w:pPr>
-      <w:rPr>
-        <w:rFonts w:ascii="Wingdings" w:hAnsi="Wingdings" w:cs="Wingdings" w:hint="default"/>
-      </w:rPr>
+        <w:ind w:left="4320" w:hanging="480"/>
+      </w:pPr>
     </w:lvl>
     <w:lvl w:ilvl="6">
       <w:numFmt w:val="bullet"/>
-      <w:lvlText w:val=""/>
+      <w:lvlText w:val="•"/>
       <w:lvlJc w:val="left"/>
       <w:pPr>
-        <w:ind w:left="5040" w:hanging="360"/>
-      </w:pPr>
-      <w:rPr>
-        <w:rFonts w:ascii="Symbol" w:hAnsi="Symbol" w:cs="Symbol" w:hint="default"/>
-      </w:rPr>
+        <w:ind w:left="5040" w:hanging="480"/>
+      </w:pPr>
     </w:lvl>
     <w:lvl w:ilvl="7">
       <w:numFmt w:val="bullet"/>
-      <w:lvlText w:val="o"/>
+      <w:lvlText w:val="–"/>
       <w:lvlJc w:val="left"/>
       <w:pPr>
-        <w:ind w:left="5760" w:hanging="360"/>
-      </w:pPr>
-      <w:rPr>
-        <w:rFonts w:ascii="Courier New" w:hAnsi="Courier New" w:cs="Courier New" w:hint="default"/>
-      </w:rPr>
+        <w:ind w:left="5760" w:hanging="480"/>
+      </w:pPr>
     </w:lvl>
     <w:lvl w:ilvl="8">
       <w:numFmt w:val="bullet"/>
-      <w:lvlText w:val=""/>
+      <w:lvlText w:val="•"/>
       <w:lvlJc w:val="left"/>
       <w:pPr>
-        <w:ind w:left="6480" w:hanging="360"/>
-      </w:pPr>
-      <w:rPr>
-        <w:rFonts w:ascii="Wingdings" w:hAnsi="Wingdings" w:cs="Wingdings" w:hint="default"/>
-      </w:rPr>
+        <w:ind w:left="6480" w:hanging="480"/>
+      </w:pPr>
     </w:lvl>
   </w:abstractNum>
   <w:abstractNum w:abstractNumId="99411">
-    <w:nsid w:val="00A99411"/>
+    <w:nsid w:val="A99411"/>
     <w:multiLevelType w:val="multilevel"/>
     <w:lvl w:ilvl="0">
       <w:start w:val="1"/>
@@ -6151,7 +6144,7 @@
       <w:lvlText w:val="%1."/>
       <w:lvlJc w:val="left"/>
       <w:pPr>
-        <w:ind w:left="720" w:hanging="360"/>
+        <w:ind w:left="720" w:hanging="480"/>
       </w:pPr>
     </w:lvl>
     <w:lvl w:ilvl="1">
@@ -6160,7 +6153,7 @@
       <w:lvlText w:val="%2."/>
       <w:lvlJc w:val="left"/>
       <w:pPr>
-        <w:ind w:left="1440" w:hanging="360"/>
+        <w:ind w:left="1440" w:hanging="480"/>
       </w:pPr>
     </w:lvl>
     <w:lvl w:ilvl="2">
@@ -6169,7 +6162,7 @@
       <w:lvlText w:val="%3."/>
       <w:lvlJc w:val="left"/>
       <w:pPr>
-        <w:ind w:left="2160" w:hanging="360"/>
+        <w:ind w:left="2160" w:hanging="480"/>
       </w:pPr>
     </w:lvl>
     <w:lvl w:ilvl="3">
@@ -6178,7 +6171,7 @@
       <w:lvlText w:val="%4."/>
       <w:lvlJc w:val="left"/>
       <w:pPr>
-        <w:ind w:left="2880" w:hanging="360"/>
+        <w:ind w:left="2880" w:hanging="480"/>
       </w:pPr>
     </w:lvl>
     <w:lvl w:ilvl="4">
@@ -6187,7 +6180,7 @@
       <w:lvlText w:val="%5."/>
       <w:lvlJc w:val="left"/>
       <w:pPr>
-        <w:ind w:left="3600" w:hanging="360"/>
+        <w:ind w:left="3600" w:hanging="480"/>
       </w:pPr>
     </w:lvl>
     <w:lvl w:ilvl="5">
@@ -6196,7 +6189,7 @@
       <w:lvlText w:val="%6."/>
       <w:lvlJc w:val="left"/>
       <w:pPr>
-        <w:ind w:left="4320" w:hanging="360"/>
+        <w:ind w:left="4320" w:hanging="480"/>
       </w:pPr>
     </w:lvl>
     <w:lvl w:ilvl="6">
@@ -6205,7 +6198,7 @@
       <w:lvlText w:val="%7."/>
       <w:lvlJc w:val="left"/>
       <w:pPr>
-        <w:ind w:left="5040" w:hanging="360"/>
+        <w:ind w:left="5040" w:hanging="480"/>
       </w:pPr>
     </w:lvl>
     <w:lvl w:ilvl="7">
@@ -6214,7 +6207,7 @@
       <w:lvlText w:val="%8."/>
       <w:lvlJc w:val="left"/>
       <w:pPr>
-        <w:ind w:left="5760" w:hanging="360"/>
+        <w:ind w:left="5760" w:hanging="480"/>
       </w:pPr>
     </w:lvl>
     <w:lvl w:ilvl="8">
@@ -6223,7 +6216,7 @@
       <w:lvlText w:val="%9."/>
       <w:lvlJc w:val="left"/>
       <w:pPr>
-        <w:ind w:left="6480" w:hanging="360"/>
+        <w:ind w:left="6480" w:hanging="480"/>
       </w:pPr>
     </w:lvl>
   </w:abstractNum>
@@ -6295,10 +6288,10 @@
   <w:docDefaults>
     <w:rPrDefault>
       <w:rPr>
-        <w:rFonts w:asciiTheme="minorHAnsi" w:cstheme="minorBidi" w:eastAsiaTheme="minorEastAsia" w:hAnsiTheme="minorHAnsi"/>
+        <w:rFonts w:asciiTheme="minorHAnsi" w:cstheme="minorBidi" w:eastAsiaTheme="minorHAnsi" w:hAnsiTheme="minorHAnsi"/>
         <w:sz w:val="24"/>
         <w:szCs w:val="24"/>
-        <w:lang w:bidi="ar-SA" w:eastAsia="zh-CN" w:val="en-US"/>
+        <w:lang w:bidi="ar-SA" w:eastAsia="en-US" w:val="en-US"/>
       </w:rPr>
     </w:rPrDefault>
     <w:pPrDefault>
@@ -6316,10 +6309,10 @@
     <w:name w:val="Body Text"/>
     <w:basedOn w:val="Normal"/>
     <w:link w:val="BodyTextChar"/>
-    <w:qFormat/>
     <w:pPr>
       <w:spacing w:after="180" w:before="180"/>
     </w:pPr>
+    <w:qFormat/>
   </w:style>
   <w:style w:customStyle="1" w:styleId="FirstParagraph" w:type="paragraph">
     <w:name w:val="First Paragraph"/>
@@ -6339,94 +6332,57 @@
     <w:name w:val="Title"/>
     <w:basedOn w:val="Normal"/>
     <w:next w:val="BodyText"/>
-    <w:link w:val="TitleChar"/>
-    <w:uiPriority w:val="10"/>
     <w:qFormat/>
-    <w:rsid w:val="00A10FD9"/>
     <w:pPr>
-      <w:spacing w:after="80" w:line="240" w:lineRule="auto"/>
-      <w:contextualSpacing/>
+      <w:keepNext/>
+      <w:keepLines/>
+      <w:spacing w:after="240" w:before="480"/>
       <w:jc w:val="center"/>
     </w:pPr>
     <w:rPr>
       <w:rFonts w:asciiTheme="majorHAnsi" w:cstheme="majorBidi" w:eastAsiaTheme="majorEastAsia" w:hAnsiTheme="majorHAnsi"/>
-      <w:sz w:val="56"/>
-      <w:szCs w:val="56"/>
-    </w:rPr>
-  </w:style>
-  <w:style w:customStyle="1" w:styleId="TitleChar" w:type="character">
-    <w:name w:val="Title Char"/>
-    <w:basedOn w:val="DefaultParagraphFont"/>
-    <w:link w:val="Title"/>
-    <w:uiPriority w:val="10"/>
-    <w:rsid w:val="00A10FD9"/>
-    <w:rPr>
-      <w:rFonts w:asciiTheme="majorHAnsi" w:cstheme="majorBidi" w:eastAsiaTheme="majorEastAsia" w:hAnsiTheme="majorHAnsi"/>
-      <w:sz w:val="56"/>
-      <w:szCs w:val="56"/>
+      <w:b/>
+      <w:bCs/>
+      <w:color w:themeColor="accent1" w:themeShade="B5" w:val="345A8A"/>
+      <w:sz w:val="36"/>
+      <w:szCs w:val="36"/>
     </w:rPr>
   </w:style>
   <w:style w:styleId="Subtitle" w:type="paragraph">
     <w:name w:val="Subtitle"/>
     <w:basedOn w:val="Title"/>
     <w:next w:val="BodyText"/>
-    <w:link w:val="SubtitleChar"/>
-    <w:uiPriority w:val="11"/>
     <w:qFormat/>
-    <w:rsid w:val="00A10FD9"/>
     <w:pPr>
-      <w:numPr>
-        <w:ilvl w:val="1"/>
-      </w:numPr>
+      <w:keepNext/>
+      <w:keepLines/>
+      <w:spacing w:after="240" w:before="240"/>
+      <w:jc w:val="center"/>
     </w:pPr>
     <w:rPr>
-      <w:rFonts w:cstheme="majorBidi" w:eastAsiaTheme="majorEastAsia"/>
-      <w:spacing w:val="15"/>
-      <w:sz w:val="28"/>
-      <w:szCs w:val="28"/>
-    </w:rPr>
-  </w:style>
-  <w:style w:customStyle="1" w:styleId="SubtitleChar" w:type="character">
-    <w:name w:val="Subtitle Char"/>
-    <w:basedOn w:val="DefaultParagraphFont"/>
-    <w:link w:val="Subtitle"/>
-    <w:uiPriority w:val="11"/>
-    <w:rsid w:val="00A10FD9"/>
-    <w:rPr>
-      <w:rFonts w:cstheme="majorBidi" w:eastAsiaTheme="majorEastAsia"/>
-      <w:color w:themeColor="text1" w:themeTint="A6" w:val="595959"/>
-      <w:spacing w:val="15"/>
-      <w:sz w:val="28"/>
-      <w:szCs w:val="28"/>
+      <w:sz w:val="30"/>
+      <w:szCs w:val="30"/>
     </w:rPr>
   </w:style>
   <w:style w:customStyle="1" w:styleId="Author" w:type="paragraph">
     <w:name w:val="Author"/>
-    <w:basedOn w:val="Title"/>
     <w:next w:val="BodyText"/>
     <w:qFormat/>
     <w:pPr>
       <w:keepNext/>
       <w:keepLines/>
+      <w:jc w:val="center"/>
     </w:pPr>
-    <w:rPr>
-      <w:sz w:val="24"/>
-      <w:szCs w:val="24"/>
-    </w:rPr>
   </w:style>
   <w:style w:styleId="Date" w:type="paragraph">
     <w:name w:val="Date"/>
-    <w:basedOn w:val="Title"/>
     <w:next w:val="BodyText"/>
     <w:qFormat/>
     <w:pPr>
       <w:keepNext/>
       <w:keepLines/>
+      <w:jc w:val="center"/>
     </w:pPr>
-    <w:rPr>
-      <w:sz w:val="24"/>
-      <w:szCs w:val="24"/>
-    </w:rPr>
   </w:style>
   <w:style w:customStyle="1" w:styleId="AbstractTitle" w:type="paragraph">
     <w:name w:val="Abstract Title"/>
@@ -6436,13 +6392,15 @@
     <w:pPr>
       <w:keepNext/>
       <w:keepLines/>
+      <w:jc w:val="center"/>
       <w:spacing w:after="0" w:before="300"/>
-      <w:jc w:val="center"/>
     </w:pPr>
     <w:rPr>
-      <w:b/>
       <w:sz w:val="20"/>
       <w:szCs w:val="20"/>
+      <w:b/>
+      <w:color w:val="345A8A"/>
+      &gt;
     </w:rPr>
   </w:style>
   <w:style w:customStyle="1" w:styleId="Abstract" w:type="paragraph">
@@ -6469,321 +6427,191 @@
     <w:rPr/>
   </w:style>
   <w:style w:styleId="Heading1" w:type="paragraph">
-    <w:name w:val="heading 1"/>
+    <w:name w:val="Heading 1"/>
     <w:basedOn w:val="Normal"/>
     <w:next w:val="BodyText"/>
-    <w:link w:val="Heading1Char"/>
     <w:uiPriority w:val="9"/>
     <w:qFormat/>
-    <w:rsid w:val="00A10FD9"/>
     <w:pPr>
       <w:keepNext/>
       <w:keepLines/>
-      <w:spacing w:after="80" w:before="360"/>
+      <w:spacing w:after="0" w:before="480"/>
       <w:outlineLvl w:val="0"/>
     </w:pPr>
     <w:rPr>
       <w:rFonts w:asciiTheme="majorHAnsi" w:cstheme="majorBidi" w:eastAsiaTheme="majorEastAsia" w:hAnsiTheme="majorHAnsi"/>
-      <w:color w:themeColor="accent1" w:themeShade="BF" w:val="0F4761"/>
-      <w:sz w:val="40"/>
-      <w:szCs w:val="40"/>
+      <w:b/>
+      <w:bCs/>
+      <w:color w:themeColor="accent1" w:val="4F81BD"/>
+      <w:sz w:val="32"/>
+      <w:szCs w:val="32"/>
     </w:rPr>
   </w:style>
   <w:style w:styleId="Heading2" w:type="paragraph">
-    <w:name w:val="heading 2"/>
+    <w:name w:val="Heading 2"/>
     <w:basedOn w:val="Normal"/>
     <w:next w:val="BodyText"/>
-    <w:link w:val="Heading2Char"/>
     <w:uiPriority w:val="9"/>
-    <w:semiHidden/>
     <w:unhideWhenUsed/>
     <w:qFormat/>
-    <w:rsid w:val="00A10FD9"/>
     <w:pPr>
       <w:keepNext/>
       <w:keepLines/>
-      <w:spacing w:after="80" w:before="160"/>
+      <w:spacing w:after="0" w:before="200"/>
       <w:outlineLvl w:val="1"/>
     </w:pPr>
     <w:rPr>
       <w:rFonts w:asciiTheme="majorHAnsi" w:cstheme="majorBidi" w:eastAsiaTheme="majorEastAsia" w:hAnsiTheme="majorHAnsi"/>
-      <w:color w:themeColor="accent1" w:themeShade="BF" w:val="0F4761"/>
-      <w:sz w:val="32"/>
-      <w:szCs w:val="32"/>
-    </w:rPr>
-  </w:style>
-  <w:style w:styleId="Heading3" w:type="paragraph">
-    <w:name w:val="heading 3"/>
-    <w:basedOn w:val="Normal"/>
-    <w:next w:val="BodyText"/>
-    <w:link w:val="Heading3Char"/>
-    <w:uiPriority w:val="9"/>
-    <w:semiHidden/>
-    <w:unhideWhenUsed/>
-    <w:qFormat/>
-    <w:rsid w:val="00A10FD9"/>
-    <w:pPr>
-      <w:keepNext/>
-      <w:keepLines/>
-      <w:spacing w:after="80" w:before="160"/>
-      <w:outlineLvl w:val="2"/>
-    </w:pPr>
-    <w:rPr>
-      <w:rFonts w:cstheme="majorBidi" w:eastAsiaTheme="majorEastAsia"/>
-      <w:color w:themeColor="accent1" w:themeShade="BF" w:val="0F4761"/>
+      <w:b/>
+      <w:bCs/>
+      <w:color w:themeColor="accent1" w:val="4F81BD"/>
       <w:sz w:val="28"/>
       <w:szCs w:val="28"/>
     </w:rPr>
   </w:style>
-  <w:style w:styleId="Heading4" w:type="paragraph">
-    <w:name w:val="heading 4"/>
+  <w:style w:styleId="Heading3" w:type="paragraph">
+    <w:name w:val="Heading 3"/>
     <w:basedOn w:val="Normal"/>
     <w:next w:val="BodyText"/>
-    <w:link w:val="Heading4Char"/>
     <w:uiPriority w:val="9"/>
-    <w:semiHidden/>
     <w:unhideWhenUsed/>
     <w:qFormat/>
-    <w:rsid w:val="00A10FD9"/>
     <w:pPr>
       <w:keepNext/>
       <w:keepLines/>
-      <w:spacing w:after="40" w:before="80"/>
+      <w:spacing w:after="0" w:before="200"/>
+      <w:outlineLvl w:val="2"/>
+    </w:pPr>
+    <w:rPr>
+      <w:rFonts w:asciiTheme="majorHAnsi" w:cstheme="majorBidi" w:eastAsiaTheme="majorEastAsia" w:hAnsiTheme="majorHAnsi"/>
+      <w:b/>
+      <w:bCs/>
+      <w:color w:themeColor="accent1" w:val="4F81BD"/>
+      <w:sz w:val="24"/>
+      <w:szCs w:val="24"/>
+    </w:rPr>
+  </w:style>
+  <w:style w:styleId="Heading4" w:type="paragraph">
+    <w:name w:val="Heading 4"/>
+    <w:basedOn w:val="Normal"/>
+    <w:next w:val="BodyText"/>
+    <w:uiPriority w:val="9"/>
+    <w:unhideWhenUsed/>
+    <w:qFormat/>
+    <w:pPr>
+      <w:keepNext/>
+      <w:keepLines/>
+      <w:spacing w:after="0" w:before="200"/>
       <w:outlineLvl w:val="3"/>
     </w:pPr>
     <w:rPr>
-      <w:rFonts w:cstheme="majorBidi" w:eastAsiaTheme="majorEastAsia"/>
+      <w:rFonts w:asciiTheme="majorHAnsi" w:cstheme="majorBidi" w:eastAsiaTheme="majorEastAsia" w:hAnsiTheme="majorHAnsi"/>
       <w:i/>
-      <w:iCs/>
-      <w:color w:themeColor="accent1" w:themeShade="BF" w:val="0F4761"/>
+      <w:bCs/>
+      <w:color w:themeColor="accent1" w:val="4F81BD"/>
+      <w:sz w:val="24"/>
+      <w:szCs w:val="24"/>
     </w:rPr>
   </w:style>
   <w:style w:styleId="Heading5" w:type="paragraph">
-    <w:name w:val="heading 5"/>
+    <w:name w:val="Heading 5"/>
     <w:basedOn w:val="Normal"/>
     <w:next w:val="BodyText"/>
-    <w:link w:val="Heading5Char"/>
     <w:uiPriority w:val="9"/>
-    <w:semiHidden/>
     <w:unhideWhenUsed/>
     <w:qFormat/>
-    <w:rsid w:val="00A10FD9"/>
     <w:pPr>
       <w:keepNext/>
       <w:keepLines/>
-      <w:spacing w:after="40" w:before="80"/>
+      <w:spacing w:after="0" w:before="200"/>
       <w:outlineLvl w:val="4"/>
     </w:pPr>
     <w:rPr>
-      <w:rFonts w:cstheme="majorBidi" w:eastAsiaTheme="majorEastAsia"/>
-      <w:color w:themeColor="accent1" w:themeShade="BF" w:val="0F4761"/>
+      <w:rFonts w:asciiTheme="majorHAnsi" w:cstheme="majorBidi" w:eastAsiaTheme="majorEastAsia" w:hAnsiTheme="majorHAnsi"/>
+      <w:iCs/>
+      <w:color w:themeColor="accent1" w:val="4F81BD"/>
+      <w:sz w:val="24"/>
+      <w:szCs w:val="24"/>
     </w:rPr>
   </w:style>
   <w:style w:styleId="Heading6" w:type="paragraph">
-    <w:name w:val="heading 6"/>
+    <w:name w:val="Heading 6"/>
     <w:basedOn w:val="Normal"/>
     <w:next w:val="BodyText"/>
-    <w:link w:val="Heading6Char"/>
     <w:uiPriority w:val="9"/>
-    <w:semiHidden/>
     <w:unhideWhenUsed/>
     <w:qFormat/>
-    <w:rsid w:val="00A10FD9"/>
     <w:pPr>
       <w:keepNext/>
       <w:keepLines/>
-      <w:spacing w:after="0" w:before="40"/>
+      <w:spacing w:after="0" w:before="200"/>
       <w:outlineLvl w:val="5"/>
     </w:pPr>
     <w:rPr>
-      <w:rFonts w:cstheme="majorBidi" w:eastAsiaTheme="majorEastAsia"/>
-      <w:i/>
-      <w:iCs/>
-      <w:color w:themeColor="text1" w:themeTint="A6" w:val="595959"/>
+      <w:rFonts w:asciiTheme="majorHAnsi" w:cstheme="majorBidi" w:eastAsiaTheme="majorEastAsia" w:hAnsiTheme="majorHAnsi"/>
+      <w:color w:themeColor="accent1" w:val="4F81BD"/>
+      <w:sz w:val="24"/>
+      <w:szCs w:val="24"/>
     </w:rPr>
   </w:style>
   <w:style w:styleId="Heading7" w:type="paragraph">
-    <w:name w:val="heading 7"/>
+    <w:name w:val="Heading 7"/>
     <w:basedOn w:val="Normal"/>
     <w:next w:val="BodyText"/>
-    <w:link w:val="Heading7Char"/>
     <w:uiPriority w:val="9"/>
-    <w:semiHidden/>
     <w:unhideWhenUsed/>
     <w:qFormat/>
-    <w:rsid w:val="00A10FD9"/>
     <w:pPr>
       <w:keepNext/>
       <w:keepLines/>
-      <w:spacing w:after="0" w:before="40"/>
+      <w:spacing w:after="0" w:before="200"/>
       <w:outlineLvl w:val="6"/>
     </w:pPr>
     <w:rPr>
-      <w:rFonts w:cstheme="majorBidi" w:eastAsiaTheme="majorEastAsia"/>
-      <w:color w:themeColor="text1" w:themeTint="A6" w:val="595959"/>
+      <w:rFonts w:asciiTheme="majorHAnsi" w:cstheme="majorBidi" w:eastAsiaTheme="majorEastAsia" w:hAnsiTheme="majorHAnsi"/>
+      <w:color w:themeColor="accent1" w:val="4F81BD"/>
+      <w:sz w:val="24"/>
+      <w:szCs w:val="24"/>
     </w:rPr>
   </w:style>
   <w:style w:styleId="Heading8" w:type="paragraph">
-    <w:name w:val="heading 8"/>
+    <w:name w:val="Heading 8"/>
     <w:basedOn w:val="Normal"/>
     <w:next w:val="BodyText"/>
-    <w:link w:val="Heading8Char"/>
     <w:uiPriority w:val="9"/>
-    <w:semiHidden/>
     <w:unhideWhenUsed/>
     <w:qFormat/>
-    <w:rsid w:val="00A10FD9"/>
     <w:pPr>
       <w:keepNext/>
       <w:keepLines/>
-      <w:spacing w:after="0"/>
+      <w:spacing w:after="0" w:before="200"/>
       <w:outlineLvl w:val="7"/>
     </w:pPr>
     <w:rPr>
-      <w:rFonts w:cstheme="majorBidi" w:eastAsiaTheme="majorEastAsia"/>
-      <w:i/>
-      <w:iCs/>
-      <w:color w:themeColor="text1" w:themeTint="D8" w:val="272727"/>
+      <w:rFonts w:asciiTheme="majorHAnsi" w:cstheme="majorBidi" w:eastAsiaTheme="majorEastAsia" w:hAnsiTheme="majorHAnsi"/>
+      <w:color w:themeColor="accent1" w:val="4F81BD"/>
+      <w:sz w:val="24"/>
+      <w:szCs w:val="24"/>
     </w:rPr>
   </w:style>
   <w:style w:styleId="Heading9" w:type="paragraph">
-    <w:name w:val="heading 9"/>
+    <w:name w:val="Heading 9"/>
     <w:basedOn w:val="Normal"/>
     <w:next w:val="BodyText"/>
-    <w:link w:val="Heading9Char"/>
     <w:uiPriority w:val="9"/>
-    <w:semiHidden/>
     <w:unhideWhenUsed/>
     <w:qFormat/>
-    <w:rsid w:val="00A10FD9"/>
     <w:pPr>
       <w:keepNext/>
       <w:keepLines/>
-      <w:spacing w:after="0"/>
+      <w:spacing w:after="0" w:before="200"/>
       <w:outlineLvl w:val="8"/>
     </w:pPr>
     <w:rPr>
-      <w:rFonts w:cstheme="majorBidi" w:eastAsiaTheme="majorEastAsia"/>
-      <w:color w:themeColor="text1" w:themeTint="D8" w:val="272727"/>
-    </w:rPr>
-  </w:style>
-  <w:style w:customStyle="1" w:styleId="Heading1Char" w:type="character">
-    <w:name w:val="Heading 1 Char"/>
-    <w:basedOn w:val="DefaultParagraphFont"/>
-    <w:link w:val="Heading1"/>
-    <w:uiPriority w:val="9"/>
-    <w:rsid w:val="00A10FD9"/>
-    <w:rPr>
       <w:rFonts w:asciiTheme="majorHAnsi" w:cstheme="majorBidi" w:eastAsiaTheme="majorEastAsia" w:hAnsiTheme="majorHAnsi"/>
-      <w:color w:themeColor="accent1" w:themeShade="BF" w:val="0F4761"/>
-      <w:sz w:val="40"/>
-      <w:szCs w:val="40"/>
-    </w:rPr>
-  </w:style>
-  <w:style w:customStyle="1" w:styleId="Heading2Char" w:type="character">
-    <w:name w:val="Heading 2 Char"/>
-    <w:basedOn w:val="DefaultParagraphFont"/>
-    <w:link w:val="Heading2"/>
-    <w:uiPriority w:val="9"/>
-    <w:semiHidden/>
-    <w:rsid w:val="00A10FD9"/>
-    <w:rPr>
-      <w:rFonts w:asciiTheme="majorHAnsi" w:cstheme="majorBidi" w:eastAsiaTheme="majorEastAsia" w:hAnsiTheme="majorHAnsi"/>
-      <w:color w:themeColor="accent1" w:themeShade="BF" w:val="0F4761"/>
-      <w:sz w:val="32"/>
-      <w:szCs w:val="32"/>
-    </w:rPr>
-  </w:style>
-  <w:style w:customStyle="1" w:styleId="Heading3Char" w:type="character">
-    <w:name w:val="Heading 3 Char"/>
-    <w:basedOn w:val="DefaultParagraphFont"/>
-    <w:link w:val="Heading3"/>
-    <w:uiPriority w:val="9"/>
-    <w:semiHidden/>
-    <w:rsid w:val="00A10FD9"/>
-    <w:rPr>
-      <w:rFonts w:cstheme="majorBidi" w:eastAsiaTheme="majorEastAsia"/>
-      <w:color w:themeColor="accent1" w:themeShade="BF" w:val="0F4761"/>
-      <w:sz w:val="28"/>
-      <w:szCs w:val="28"/>
-    </w:rPr>
-  </w:style>
-  <w:style w:customStyle="1" w:styleId="Heading4Char" w:type="character">
-    <w:name w:val="Heading 4 Char"/>
-    <w:basedOn w:val="DefaultParagraphFont"/>
-    <w:link w:val="Heading4"/>
-    <w:uiPriority w:val="9"/>
-    <w:semiHidden/>
-    <w:rsid w:val="00A10FD9"/>
-    <w:rPr>
-      <w:rFonts w:cstheme="majorBidi" w:eastAsiaTheme="majorEastAsia"/>
-      <w:i/>
-      <w:iCs/>
-      <w:color w:themeColor="accent1" w:themeShade="BF" w:val="0F4761"/>
-    </w:rPr>
-  </w:style>
-  <w:style w:customStyle="1" w:styleId="Heading5Char" w:type="character">
-    <w:name w:val="Heading 5 Char"/>
-    <w:basedOn w:val="DefaultParagraphFont"/>
-    <w:link w:val="Heading5"/>
-    <w:uiPriority w:val="9"/>
-    <w:semiHidden/>
-    <w:rsid w:val="00A10FD9"/>
-    <w:rPr>
-      <w:rFonts w:cstheme="majorBidi" w:eastAsiaTheme="majorEastAsia"/>
-      <w:color w:themeColor="accent1" w:themeShade="BF" w:val="0F4761"/>
-    </w:rPr>
-  </w:style>
-  <w:style w:customStyle="1" w:styleId="Heading6Char" w:type="character">
-    <w:name w:val="Heading 6 Char"/>
-    <w:basedOn w:val="DefaultParagraphFont"/>
-    <w:link w:val="Heading6"/>
-    <w:uiPriority w:val="9"/>
-    <w:semiHidden/>
-    <w:rsid w:val="00A10FD9"/>
-    <w:rPr>
-      <w:rFonts w:cstheme="majorBidi" w:eastAsiaTheme="majorEastAsia"/>
-      <w:i/>
-      <w:iCs/>
-      <w:color w:themeColor="text1" w:themeTint="A6" w:val="595959"/>
-    </w:rPr>
-  </w:style>
-  <w:style w:customStyle="1" w:styleId="Heading7Char" w:type="character">
-    <w:name w:val="Heading 7 Char"/>
-    <w:basedOn w:val="DefaultParagraphFont"/>
-    <w:link w:val="Heading7"/>
-    <w:uiPriority w:val="9"/>
-    <w:semiHidden/>
-    <w:rsid w:val="00A10FD9"/>
-    <w:rPr>
-      <w:rFonts w:cstheme="majorBidi" w:eastAsiaTheme="majorEastAsia"/>
-      <w:color w:themeColor="text1" w:themeTint="A6" w:val="595959"/>
-    </w:rPr>
-  </w:style>
-  <w:style w:customStyle="1" w:styleId="Heading8Char" w:type="character">
-    <w:name w:val="Heading 8 Char"/>
-    <w:basedOn w:val="DefaultParagraphFont"/>
-    <w:link w:val="Heading8"/>
-    <w:uiPriority w:val="9"/>
-    <w:semiHidden/>
-    <w:rsid w:val="00A10FD9"/>
-    <w:rPr>
-      <w:rFonts w:cstheme="majorBidi" w:eastAsiaTheme="majorEastAsia"/>
-      <w:i/>
-      <w:iCs/>
-      <w:color w:themeColor="text1" w:themeTint="D8" w:val="272727"/>
-    </w:rPr>
-  </w:style>
-  <w:style w:customStyle="1" w:styleId="Heading9Char" w:type="character">
-    <w:name w:val="Heading 9 Char"/>
-    <w:basedOn w:val="DefaultParagraphFont"/>
-    <w:link w:val="Heading9"/>
-    <w:uiPriority w:val="9"/>
-    <w:semiHidden/>
-    <w:rsid w:val="00A10FD9"/>
-    <w:rPr>
-      <w:rFonts w:cstheme="majorBidi" w:eastAsiaTheme="majorEastAsia"/>
-      <w:color w:themeColor="text1" w:themeTint="D8" w:val="272727"/>
+      <w:color w:themeColor="accent1" w:val="4F81BD"/>
+      <w:sz w:val="24"/>
+      <w:szCs w:val="24"/>
     </w:rPr>
   </w:style>
   <w:style w:styleId="BlockText" w:type="paragraph">
@@ -6808,8 +6636,8 @@
   </w:style>
   <w:style w:styleId="FootnoteBlockText" w:type="paragraph">
     <w:name w:val="Footnote Block Text"/>
-    <w:basedOn w:val="FootnoteText"/>
-    <w:next w:val="FootnoteText"/>
+    <w:basedOn w:val="Footnote Text"/>
+    <w:next w:val="Footnote Text"/>
     <w:uiPriority w:val="9"/>
     <w:unhideWhenUsed/>
     <w:qFormat/>
@@ -6839,11 +6667,18 @@
       </w:tblCellMar>
     </w:tblPr>
     <w:tblStylePr w:type="firstRow">
+      <w:tblPr>
+        <w:jc w:val="left"/>
+        <w:tblInd w:type="dxa" w:w="0"/>
+      </w:tblPr>
+      <w:trPr>
+        <w:jc w:val="left"/>
+      </w:trPr>
       <w:tcPr>
+        <w:vAlign w:val="bottom"/>
         <w:tcBorders>
           <w:bottom w:val="single"/>
         </w:tcBorders>
-        <w:vAlign w:val="bottom"/>
       </w:tcPr>
     </w:tblStylePr>
   </w:style>
@@ -6958,8 +6793,8 @@
     <w:name w:val="KeywordTok"/>
     <w:basedOn w:val="VerbatimChar"/>
     <w:rPr>
+      <w:color w:val="007020"/>
       <w:b/>
-      <w:color w:val="007020"/>
     </w:rPr>
   </w:style>
   <w:style w:type="character" w:customStyle="1" w:styleId="DataTypeTok">
@@ -7036,42 +6871,42 @@
     <w:name w:val="ImportTok"/>
     <w:basedOn w:val="VerbatimChar"/>
     <w:rPr>
+      <w:color w:val="008000"/>
       <w:b/>
-      <w:color w:val="008000"/>
     </w:rPr>
   </w:style>
   <w:style w:type="character" w:customStyle="1" w:styleId="CommentTok">
     <w:name w:val="CommentTok"/>
     <w:basedOn w:val="VerbatimChar"/>
     <w:rPr>
+      <w:color w:val="60a0b0"/>
       <w:i/>
-      <w:color w:val="60a0b0"/>
     </w:rPr>
   </w:style>
   <w:style w:type="character" w:customStyle="1" w:styleId="DocumentationTok">
     <w:name w:val="DocumentationTok"/>
     <w:basedOn w:val="VerbatimChar"/>
     <w:rPr>
+      <w:color w:val="ba2121"/>
       <w:i/>
-      <w:color w:val="ba2121"/>
     </w:rPr>
   </w:style>
   <w:style w:type="character" w:customStyle="1" w:styleId="AnnotationTok">
     <w:name w:val="AnnotationTok"/>
     <w:basedOn w:val="VerbatimChar"/>
     <w:rPr>
+      <w:color w:val="60a0b0"/>
       <w:b/>
       <w:i/>
-      <w:color w:val="60a0b0"/>
     </w:rPr>
   </w:style>
   <w:style w:type="character" w:customStyle="1" w:styleId="CommentVarTok">
     <w:name w:val="CommentVarTok"/>
     <w:basedOn w:val="VerbatimChar"/>
     <w:rPr>
+      <w:color w:val="60a0b0"/>
       <w:b/>
       <w:i/>
-      <w:color w:val="60a0b0"/>
     </w:rPr>
   </w:style>
   <w:style w:type="character" w:customStyle="1" w:styleId="OtherTok">
@@ -7099,8 +6934,8 @@
     <w:name w:val="ControlFlowTok"/>
     <w:basedOn w:val="VerbatimChar"/>
     <w:rPr>
+      <w:color w:val="007020"/>
       <w:b/>
-      <w:color w:val="007020"/>
     </w:rPr>
   </w:style>
   <w:style w:type="character" w:customStyle="1" w:styleId="OperatorTok">
@@ -7145,34 +6980,34 @@
     <w:name w:val="InformationTok"/>
     <w:basedOn w:val="VerbatimChar"/>
     <w:rPr>
+      <w:color w:val="60a0b0"/>
       <w:b/>
       <w:i/>
-      <w:color w:val="60a0b0"/>
     </w:rPr>
   </w:style>
   <w:style w:type="character" w:customStyle="1" w:styleId="WarningTok">
     <w:name w:val="WarningTok"/>
     <w:basedOn w:val="VerbatimChar"/>
     <w:rPr>
+      <w:color w:val="60a0b0"/>
       <w:b/>
       <w:i/>
-      <w:color w:val="60a0b0"/>
     </w:rPr>
   </w:style>
   <w:style w:type="character" w:customStyle="1" w:styleId="AlertTok">
     <w:name w:val="AlertTok"/>
     <w:basedOn w:val="VerbatimChar"/>
     <w:rPr>
+      <w:color w:val="ff0000"/>
       <w:b/>
-      <w:color w:val="ff0000"/>
     </w:rPr>
   </w:style>
   <w:style w:type="character" w:customStyle="1" w:styleId="ErrorTok">
     <w:name w:val="ErrorTok"/>
     <w:basedOn w:val="VerbatimChar"/>
     <w:rPr>
+      <w:color w:val="ff0000"/>
       <w:b/>
-      <w:color w:val="ff0000"/>
     </w:rPr>
   </w:style>
   <w:style w:type="character" w:customStyle="1" w:styleId="NormalTok">
@@ -7194,44 +7029,44 @@
         <a:sysClr val="window" lastClr="FFFFFF"/>
       </a:lt1>
       <a:dk2>
-        <a:srgbClr val="0E2841"/>
+        <a:srgbClr val="1F497D"/>
       </a:dk2>
       <a:lt2>
-        <a:srgbClr val="E8E8E8"/>
+        <a:srgbClr val="EEECE1"/>
       </a:lt2>
       <a:accent1>
-        <a:srgbClr val="156082"/>
+        <a:srgbClr val="4F81BD"/>
       </a:accent1>
       <a:accent2>
-        <a:srgbClr val="E97132"/>
+        <a:srgbClr val="C0504D"/>
       </a:accent2>
       <a:accent3>
-        <a:srgbClr val="196B24"/>
+        <a:srgbClr val="9BBB59"/>
       </a:accent3>
       <a:accent4>
-        <a:srgbClr val="0F9ED5"/>
+        <a:srgbClr val="8064A2"/>
       </a:accent4>
       <a:accent5>
-        <a:srgbClr val="A02B93"/>
+        <a:srgbClr val="4BACC6"/>
       </a:accent5>
       <a:accent6>
-        <a:srgbClr val="4EA72E"/>
+        <a:srgbClr val="F79646"/>
       </a:accent6>
       <a:hlink>
-        <a:srgbClr val="467886"/>
+        <a:srgbClr val="0000FF"/>
       </a:hlink>
       <a:folHlink>
-        <a:srgbClr val="96607D"/>
+        <a:srgbClr val="800080"/>
       </a:folHlink>
     </a:clrScheme>
     <a:fontScheme name="Office">
       <a:majorFont>
-        <a:latin typeface="Aptos Display" panose="02110004020202020204"/>
+        <a:latin typeface="Calibri"/>
         <a:ea typeface=""/>
         <a:cs typeface=""/>
-        <a:font script="Jpan" typeface="游ゴシック Light"/>
+        <a:font script="Jpan" typeface="ＭＳ ゴシック"/>
         <a:font script="Hang" typeface="맑은 고딕"/>
-        <a:font script="Hans" typeface="等线 Light"/>
+        <a:font script="Hans" typeface="宋体"/>
         <a:font script="Hant" typeface="新細明體"/>
         <a:font script="Arab" typeface="Times New Roman"/>
         <a:font script="Hebr" typeface="Times New Roman"/>
@@ -7258,32 +7093,14 @@
         <a:font script="Mong" typeface="Mongolian Baiti"/>
         <a:font script="Viet" typeface="Times New Roman"/>
         <a:font script="Uigh" typeface="Microsoft Uighur"/>
-        <a:font script="Geor" typeface="Sylfaen"/>
-        <a:font script="Armn" typeface="Arial"/>
-        <a:font script="Bugi" typeface="Leelawadee UI"/>
-        <a:font script="Bopo" typeface="Microsoft JhengHei"/>
-        <a:font script="Java" typeface="Javanese Text"/>
-        <a:font script="Lisu" typeface="Segoe UI"/>
-        <a:font script="Mymr" typeface="Myanmar Text"/>
-        <a:font script="Nkoo" typeface="Ebrima"/>
-        <a:font script="Olck" typeface="Nirmala UI"/>
-        <a:font script="Osma" typeface="Ebrima"/>
-        <a:font script="Phag" typeface="Phagspa"/>
-        <a:font script="Syrn" typeface="Estrangelo Edessa"/>
-        <a:font script="Syrj" typeface="Estrangelo Edessa"/>
-        <a:font script="Syre" typeface="Estrangelo Edessa"/>
-        <a:font script="Sora" typeface="Nirmala UI"/>
-        <a:font script="Tale" typeface="Microsoft Tai Le"/>
-        <a:font script="Talu" typeface="Microsoft New Tai Lue"/>
-        <a:font script="Tfng" typeface="Ebrima"/>
       </a:majorFont>
       <a:minorFont>
-        <a:latin typeface="Aptos" panose="02110004020202020204"/>
+        <a:latin typeface="Cambria"/>
         <a:ea typeface=""/>
         <a:cs typeface=""/>
-        <a:font script="Jpan" typeface="游明朝"/>
+        <a:font script="Jpan" typeface="ＭＳ 明朝"/>
         <a:font script="Hang" typeface="맑은 고딕"/>
-        <a:font script="Hans" typeface="等线"/>
+        <a:font script="Hans" typeface="宋体"/>
         <a:font script="Hant" typeface="新細明體"/>
         <a:font script="Arab" typeface="Arial"/>
         <a:font script="Hebr" typeface="Arial"/>
@@ -7310,24 +7127,6 @@
         <a:font script="Mong" typeface="Mongolian Baiti"/>
         <a:font script="Viet" typeface="Arial"/>
         <a:font script="Uigh" typeface="Microsoft Uighur"/>
-        <a:font script="Geor" typeface="Sylfaen"/>
-        <a:font script="Armn" typeface="Arial"/>
-        <a:font script="Bugi" typeface="Leelawadee UI"/>
-        <a:font script="Bopo" typeface="Microsoft JhengHei"/>
-        <a:font script="Java" typeface="Javanese Text"/>
-        <a:font script="Lisu" typeface="Segoe UI"/>
-        <a:font script="Mymr" typeface="Myanmar Text"/>
-        <a:font script="Nkoo" typeface="Ebrima"/>
-        <a:font script="Olck" typeface="Nirmala UI"/>
-        <a:font script="Osma" typeface="Ebrima"/>
-        <a:font script="Phag" typeface="Phagspa"/>
-        <a:font script="Syrn" typeface="Estrangelo Edessa"/>
-        <a:font script="Syrj" typeface="Estrangelo Edessa"/>
-        <a:font script="Syre" typeface="Estrangelo Edessa"/>
-        <a:font script="Sora" typeface="Nirmala UI"/>
-        <a:font script="Tale" typeface="Microsoft Tai Le"/>
-        <a:font script="Talu" typeface="Microsoft New Tai Lue"/>
-        <a:font script="Tfng" typeface="Ebrima"/>
       </a:minorFont>
     </a:fontScheme>
     <a:fmtScheme name="Office">
@@ -7339,141 +7138,200 @@
           <a:gsLst>
             <a:gs pos="0">
               <a:schemeClr val="phClr">
-                <a:lumMod val="110000"/>
-                <a:satMod val="105000"/>
-                <a:tint val="67000"/>
+                <a:tint val="50000"/>
+                <a:satMod val="300000"/>
               </a:schemeClr>
             </a:gs>
-            <a:gs pos="50000">
+            <a:gs pos="35000">
               <a:schemeClr val="phClr">
-                <a:lumMod val="105000"/>
-                <a:satMod val="103000"/>
-                <a:tint val="73000"/>
+                <a:tint val="37000"/>
+                <a:satMod val="300000"/>
               </a:schemeClr>
             </a:gs>
             <a:gs pos="100000">
               <a:schemeClr val="phClr">
-                <a:lumMod val="105000"/>
-                <a:satMod val="109000"/>
-                <a:tint val="81000"/>
+                <a:tint val="15000"/>
+                <a:satMod val="350000"/>
               </a:schemeClr>
             </a:gs>
           </a:gsLst>
-          <a:lin ang="5400000" scaled="0"/>
+          <a:lin ang="16200000" scaled="1"/>
         </a:gradFill>
         <a:gradFill rotWithShape="1">
           <a:gsLst>
             <a:gs pos="0">
               <a:schemeClr val="phClr">
-                <a:satMod val="103000"/>
-                <a:lumMod val="102000"/>
-                <a:tint val="94000"/>
-              </a:schemeClr>
-            </a:gs>
-            <a:gs pos="50000">
-              <a:schemeClr val="phClr">
-                <a:satMod val="110000"/>
-                <a:lumMod val="100000"/>
+                <a:tint val="100000"/>
                 <a:shade val="100000"/>
+                <a:satMod val="130000"/>
               </a:schemeClr>
             </a:gs>
             <a:gs pos="100000">
               <a:schemeClr val="phClr">
-                <a:lumMod val="99000"/>
-                <a:satMod val="120000"/>
-                <a:shade val="78000"/>
+                <a:tint val="50000"/>
+                <a:shade val="100000"/>
+                <a:satMod val="350000"/>
               </a:schemeClr>
             </a:gs>
           </a:gsLst>
-          <a:lin ang="5400000" scaled="0"/>
+          <a:lin ang="16200000" scaled="0"/>
         </a:gradFill>
       </a:fillStyleLst>
       <a:lnStyleLst>
-        <a:ln w="6350" cap="flat" cmpd="sng" algn="ctr">
+        <a:ln w="9525" cap="flat" cmpd="sng" algn="ctr">
+          <a:solidFill>
+            <a:schemeClr val="phClr">
+              <a:shade val="95000"/>
+              <a:satMod val="105000"/>
+            </a:schemeClr>
+          </a:solidFill>
+          <a:prstDash val="solid"/>
+        </a:ln>
+        <a:ln w="25400" cap="flat" cmpd="sng" algn="ctr">
           <a:solidFill>
             <a:schemeClr val="phClr"/>
           </a:solidFill>
           <a:prstDash val="solid"/>
-          <a:miter lim="800000"/>
         </a:ln>
-        <a:ln w="12700" cap="flat" cmpd="sng" algn="ctr">
+        <a:ln w="38100" cap="flat" cmpd="sng" algn="ctr">
           <a:solidFill>
             <a:schemeClr val="phClr"/>
           </a:solidFill>
           <a:prstDash val="solid"/>
-          <a:miter lim="800000"/>
-        </a:ln>
-        <a:ln w="19050" cap="flat" cmpd="sng" algn="ctr">
-          <a:solidFill>
-            <a:schemeClr val="phClr"/>
-          </a:solidFill>
-          <a:prstDash val="solid"/>
-          <a:miter lim="800000"/>
         </a:ln>
       </a:lnStyleLst>
       <a:effectStyleLst>
         <a:effectStyle>
-          <a:effectLst/>
-        </a:effectStyle>
-        <a:effectStyle>
-          <a:effectLst/>
+          <a:effectLst>
+            <a:outerShdw blurRad="40000" dist="20000" dir="5400000" rotWithShape="0">
+              <a:srgbClr val="000000">
+                <a:alpha val="38000"/>
+              </a:srgbClr>
+            </a:outerShdw>
+          </a:effectLst>
         </a:effectStyle>
         <a:effectStyle>
           <a:effectLst>
-            <a:outerShdw blurRad="57150" dist="19050" dir="5400000" algn="ctr" rotWithShape="0">
+            <a:outerShdw blurRad="40000" dist="23000" dir="5400000" rotWithShape="0">
               <a:srgbClr val="000000">
-                <a:alpha val="63000"/>
+                <a:alpha val="35000"/>
               </a:srgbClr>
             </a:outerShdw>
           </a:effectLst>
+        </a:effectStyle>
+        <a:effectStyle>
+          <a:effectLst>
+            <a:outerShdw blurRad="40000" dist="23000" dir="5400000" rotWithShape="0">
+              <a:srgbClr val="000000">
+                <a:alpha val="35000"/>
+              </a:srgbClr>
+            </a:outerShdw>
+          </a:effectLst>
+          <a:scene3d>
+            <a:camera prst="orthographicFront">
+              <a:rot lat="0" lon="0" rev="0"/>
+            </a:camera>
+            <a:lightRig rig="threePt" dir="t">
+              <a:rot lat="0" lon="0" rev="1200000"/>
+            </a:lightRig>
+          </a:scene3d>
+          <a:sp3d>
+            <a:bevelT w="63500" h="25400"/>
+          </a:sp3d>
         </a:effectStyle>
       </a:effectStyleLst>
       <a:bgFillStyleLst>
         <a:solidFill>
           <a:schemeClr val="phClr"/>
         </a:solidFill>
-        <a:solidFill>
-          <a:schemeClr val="phClr">
-            <a:tint val="95000"/>
-            <a:satMod val="170000"/>
-          </a:schemeClr>
-        </a:solidFill>
         <a:gradFill rotWithShape="1">
           <a:gsLst>
             <a:gs pos="0">
               <a:schemeClr val="phClr">
-                <a:tint val="93000"/>
-                <a:satMod val="150000"/>
-                <a:shade val="98000"/>
-                <a:lumMod val="102000"/>
+                <a:tint val="40000"/>
+                <a:satMod val="350000"/>
               </a:schemeClr>
             </a:gs>
-            <a:gs pos="50000">
+            <a:gs pos="40000">
               <a:schemeClr val="phClr">
-                <a:tint val="98000"/>
-                <a:satMod val="130000"/>
-                <a:shade val="90000"/>
-                <a:lumMod val="103000"/>
+                <a:tint val="45000"/>
+                <a:shade val="99000"/>
+                <a:satMod val="350000"/>
               </a:schemeClr>
             </a:gs>
             <a:gs pos="100000">
               <a:schemeClr val="phClr">
-                <a:shade val="63000"/>
-                <a:satMod val="120000"/>
+                <a:shade val="20000"/>
+                <a:satMod val="255000"/>
               </a:schemeClr>
             </a:gs>
           </a:gsLst>
-          <a:lin ang="5400000" scaled="0"/>
+          <a:path path="circle">
+            <a:fillToRect l="50000" t="-80000" r="50000" b="180000"/>
+          </a:path>
+        </a:gradFill>
+        <a:gradFill rotWithShape="1">
+          <a:gsLst>
+            <a:gs pos="0">
+              <a:schemeClr val="phClr">
+                <a:tint val="80000"/>
+                <a:satMod val="300000"/>
+              </a:schemeClr>
+            </a:gs>
+            <a:gs pos="100000">
+              <a:schemeClr val="phClr">
+                <a:shade val="30000"/>
+                <a:satMod val="200000"/>
+              </a:schemeClr>
+            </a:gs>
+          </a:gsLst>
+          <a:path path="circle">
+            <a:fillToRect l="50000" t="50000" r="50000" b="50000"/>
+          </a:path>
         </a:gradFill>
       </a:bgFillStyleLst>
     </a:fmtScheme>
   </a:themeElements>
-  <a:objectDefaults/>
+  <a:objectDefaults>
+    <a:spDef>
+      <a:spPr/>
+      <a:bodyPr/>
+      <a:lstStyle/>
+      <a:style>
+        <a:lnRef idx="1">
+          <a:schemeClr val="accent1"/>
+        </a:lnRef>
+        <a:fillRef idx="3">
+          <a:schemeClr val="accent1"/>
+        </a:fillRef>
+        <a:effectRef idx="2">
+          <a:schemeClr val="accent1"/>
+        </a:effectRef>
+        <a:fontRef idx="minor">
+          <a:schemeClr val="lt1"/>
+        </a:fontRef>
+      </a:style>
+    </a:spDef>
+    <a:lnDef>
+      <a:spPr/>
+      <a:bodyPr/>
+      <a:lstStyle/>
+      <a:style>
+        <a:lnRef idx="2">
+          <a:schemeClr val="accent1"/>
+        </a:lnRef>
+        <a:fillRef idx="0">
+          <a:schemeClr val="accent1"/>
+        </a:fillRef>
+        <a:effectRef idx="1">
+          <a:schemeClr val="accent1"/>
+        </a:effectRef>
+        <a:fontRef idx="minor">
+          <a:schemeClr val="tx1"/>
+        </a:fontRef>
+      </a:style>
+    </a:lnDef>
+  </a:objectDefaults>
   <a:extraClrSchemeLst/>
-  <a:extLst>
-    <a:ext uri="{05A4C25C-085E-4340-85A3-A5531E510DB2}">
-      <thm15:themeFamily xmlns:thm15="http://schemas.microsoft.com/office/thememl/2012/main" name="Office Theme" id="{2E142A2C-CD16-42D6-873A-C26D2A0506FA}" vid="{1BDDFF52-6CD6-40A5-AB3C-68EB2F1E4D0A}"/>
-    </a:ext>
-  </a:extLst>
 </a:theme>
 </file>
</xml_diff>